<commit_message>
Shorten HIED request forms
</commit_message>
<xml_diff>
--- a/HIED_Data_Request_Form_CN.docx
+++ b/HIED_Data_Request_Form_CN.docx
@@ -11,7 +11,7 @@
         <w:rPr>
           <w:rFonts w:ascii="Calibri" w:hAnsi="Calibri" w:eastAsia="Microsoft YaHei"/>
         </w:rPr>
-        <w:t>HIED 数据使用申请表</w:t>
+        <w:t>HIED 数据申请表</w:t>
       </w:r>
     </w:p>
     <w:p>
@@ -26,70 +26,21 @@
         <w:t>听障人群脑电情绪识别数据集</w:t>
       </w:r>
     </w:p>
-    <w:tbl>
-      <w:tblPr>
-        <w:tblW w:type="dxa" w:w="9360"/>
-        <w:jc w:val="left"/>
-        <w:tblLayout w:type="fixed"/>
-        <w:tblLook w:firstColumn="1" w:firstRow="1" w:lastColumn="0" w:lastRow="0" w:noHBand="0" w:noVBand="1" w:val="04A0"/>
-        <w:tblInd w:w="120" w:type="dxa"/>
-        <w:tblBorders>
-          <w:top w:val="single" w:sz="4" w:space="0" w:color="D8DEE4"/>
-          <w:left w:val="single" w:sz="4" w:space="0" w:color="D8DEE4"/>
-          <w:bottom w:val="single" w:sz="4" w:space="0" w:color="D8DEE4"/>
-          <w:right w:val="single" w:sz="4" w:space="0" w:color="D8DEE4"/>
-          <w:insideH w:val="single" w:sz="4" w:space="0" w:color="D8DEE4"/>
-          <w:insideV w:val="single" w:sz="4" w:space="0" w:color="D8DEE4"/>
-        </w:tblBorders>
-      </w:tblPr>
-      <w:tblGrid>
-        <w:gridCol w:w="9360"/>
-      </w:tblGrid>
-      <w:tr>
-        <w:tc>
-          <w:tcPr>
-            <w:tcW w:type="dxa" w:w="9360"/>
-            <w:shd w:fill="FBF8F6"/>
-            <w:tcMar>
-              <w:top w:w="140" w:type="dxa"/>
-              <w:start w:w="170" w:type="dxa"/>
-              <w:bottom w:w="140" w:type="dxa"/>
-              <w:end w:w="170" w:type="dxa"/>
-            </w:tcMar>
-          </w:tcPr>
-          <w:p>
-            <w:pPr>
-              <w:spacing w:before="0" w:after="0" w:line="278" w:lineRule="auto"/>
-            </w:pPr>
-            <w:r>
-              <w:rPr>
-                <w:rFonts w:ascii="Calibri" w:hAnsi="Calibri" w:eastAsia="Microsoft YaHei"/>
-                <w:b/>
-                <w:color w:val="4B1117"/>
-                <w:sz w:val="21"/>
-              </w:rPr>
-              <w:t>提交说明</w:t>
-            </w:r>
-            <w:r>
-              <w:rPr>
-                <w:rFonts w:ascii="Calibri" w:hAnsi="Calibri" w:eastAsia="Microsoft YaHei"/>
-              </w:rPr>
-              <w:br/>
-            </w:r>
-            <w:r>
-              <w:rPr>
-                <w:rFonts w:ascii="Calibri" w:hAnsi="Calibri" w:eastAsia="Microsoft YaHei"/>
-                <w:b w:val="0"/>
-                <w:color w:val="1F2933"/>
-                <w:sz w:val="20"/>
-              </w:rPr>
-              <w:t>本表用于申请使用 HIED 预处理 EEG 数据。请按实际情况填写，不留空项；无适用内容请填写“不适用”。表格由申请人和课题负责人/导师签字后，以 Word 或 PDF 格式发送至 jasonsongrain@hotmail.com。审核通过后，数据访问方式将通过邮件发送。</w:t>
-            </w:r>
-          </w:p>
-        </w:tc>
-      </w:tr>
-    </w:tbl>
-    <w:p/>
+    <w:p>
+      <w:pPr>
+        <w:spacing w:before="0" w:after="80" w:line="240" w:lineRule="auto"/>
+        <w:jc w:val="center"/>
+      </w:pPr>
+      <w:r>
+        <w:rPr>
+          <w:rFonts w:ascii="Calibri" w:hAnsi="Calibri" w:eastAsia="Microsoft YaHei"/>
+          <w:b w:val="0"/>
+          <w:color w:val="5D6970"/>
+          <w:sz w:val="18"/>
+        </w:rPr>
+        <w:t>提交邮箱：jasonsongrain@hotmail.com；HIED 预处理 EEG 数据面向学术或非商业研究申请开放。</w:t>
+      </w:r>
+    </w:p>
     <w:p>
       <w:pPr>
         <w:pStyle w:val="Heading1"/>
@@ -125,17 +76,17 @@
       </w:tblGrid>
       <w:tr>
         <w:trPr>
-          <w:trHeight w:val="518" w:hRule="atLeast"/>
+          <w:trHeight w:val="389" w:hRule="atLeast"/>
         </w:trPr>
         <w:tc>
           <w:tcPr>
             <w:tcW w:type="dxa" w:w="1944"/>
             <w:shd w:fill="F4F6F8"/>
             <w:tcMar>
-              <w:top w:w="90" w:type="dxa"/>
-              <w:start w:w="130" w:type="dxa"/>
-              <w:bottom w:w="90" w:type="dxa"/>
-              <w:end w:w="130" w:type="dxa"/>
+              <w:top w:w="60" w:type="dxa"/>
+              <w:start w:w="95" w:type="dxa"/>
+              <w:bottom w:w="60" w:type="dxa"/>
+              <w:end w:w="95" w:type="dxa"/>
             </w:tcMar>
             <w:vAlign w:val="center"/>
           </w:tcPr>
@@ -153,9 +104,9 @@
                 <w:rFonts w:ascii="Calibri" w:hAnsi="Calibri" w:eastAsia="Microsoft YaHei"/>
                 <w:b/>
                 <w:color w:val="1F2933"/>
-                <w:sz w:val="20"/>
+                <w:sz w:val="18"/>
               </w:rPr>
-              <w:t>申请人姓名</w:t>
+              <w:t>姓名</w:t>
             </w:r>
           </w:p>
         </w:tc>
@@ -163,10 +114,10 @@
           <w:tcPr>
             <w:tcW w:type="dxa" w:w="2736"/>
             <w:tcMar>
-              <w:top w:w="90" w:type="dxa"/>
-              <w:start w:w="130" w:type="dxa"/>
-              <w:bottom w:w="90" w:type="dxa"/>
-              <w:end w:w="130" w:type="dxa"/>
+              <w:top w:w="60" w:type="dxa"/>
+              <w:start w:w="95" w:type="dxa"/>
+              <w:bottom w:w="60" w:type="dxa"/>
+              <w:end w:w="95" w:type="dxa"/>
             </w:tcMar>
             <w:vAlign w:val="center"/>
           </w:tcPr>
@@ -184,7 +135,7 @@
                 <w:rFonts w:ascii="Calibri" w:hAnsi="Calibri" w:eastAsia="Microsoft YaHei"/>
                 <w:b w:val="0"/>
                 <w:color w:val="1F2933"/>
-                <w:sz w:val="20"/>
+                <w:sz w:val="18"/>
               </w:rPr>
               <w:t xml:space="preserve"> </w:t>
             </w:r>
@@ -195,10 +146,10 @@
             <w:tcW w:type="dxa" w:w="1944"/>
             <w:shd w:fill="F4F6F8"/>
             <w:tcMar>
-              <w:top w:w="90" w:type="dxa"/>
-              <w:start w:w="130" w:type="dxa"/>
-              <w:bottom w:w="90" w:type="dxa"/>
-              <w:end w:w="130" w:type="dxa"/>
+              <w:top w:w="60" w:type="dxa"/>
+              <w:start w:w="95" w:type="dxa"/>
+              <w:bottom w:w="60" w:type="dxa"/>
+              <w:end w:w="95" w:type="dxa"/>
             </w:tcMar>
             <w:vAlign w:val="center"/>
           </w:tcPr>
@@ -216,7 +167,7 @@
                 <w:rFonts w:ascii="Calibri" w:hAnsi="Calibri" w:eastAsia="Microsoft YaHei"/>
                 <w:b/>
                 <w:color w:val="1F2933"/>
-                <w:sz w:val="20"/>
+                <w:sz w:val="18"/>
               </w:rPr>
               <w:t>身份/职称</w:t>
             </w:r>
@@ -226,10 +177,10 @@
           <w:tcPr>
             <w:tcW w:type="dxa" w:w="2736"/>
             <w:tcMar>
-              <w:top w:w="90" w:type="dxa"/>
-              <w:start w:w="130" w:type="dxa"/>
-              <w:bottom w:w="90" w:type="dxa"/>
-              <w:end w:w="130" w:type="dxa"/>
+              <w:top w:w="60" w:type="dxa"/>
+              <w:start w:w="95" w:type="dxa"/>
+              <w:bottom w:w="60" w:type="dxa"/>
+              <w:end w:w="95" w:type="dxa"/>
             </w:tcMar>
             <w:vAlign w:val="center"/>
           </w:tcPr>
@@ -247,7 +198,7 @@
                 <w:rFonts w:ascii="Calibri" w:hAnsi="Calibri" w:eastAsia="Microsoft YaHei"/>
                 <w:b w:val="0"/>
                 <w:color w:val="1F2933"/>
-                <w:sz w:val="20"/>
+                <w:sz w:val="18"/>
               </w:rPr>
               <w:t xml:space="preserve"> </w:t>
             </w:r>
@@ -256,17 +207,17 @@
       </w:tr>
       <w:tr>
         <w:trPr>
-          <w:trHeight w:val="518" w:hRule="atLeast"/>
+          <w:trHeight w:val="389" w:hRule="atLeast"/>
         </w:trPr>
         <w:tc>
           <w:tcPr>
             <w:tcW w:type="dxa" w:w="1944"/>
             <w:shd w:fill="F4F6F8"/>
             <w:tcMar>
-              <w:top w:w="90" w:type="dxa"/>
-              <w:start w:w="130" w:type="dxa"/>
-              <w:bottom w:w="90" w:type="dxa"/>
-              <w:end w:w="130" w:type="dxa"/>
+              <w:top w:w="60" w:type="dxa"/>
+              <w:start w:w="95" w:type="dxa"/>
+              <w:bottom w:w="60" w:type="dxa"/>
+              <w:end w:w="95" w:type="dxa"/>
             </w:tcMar>
             <w:vAlign w:val="center"/>
           </w:tcPr>
@@ -284,9 +235,9 @@
                 <w:rFonts w:ascii="Calibri" w:hAnsi="Calibri" w:eastAsia="Microsoft YaHei"/>
                 <w:b/>
                 <w:color w:val="1F2933"/>
-                <w:sz w:val="20"/>
+                <w:sz w:val="18"/>
               </w:rPr>
-              <w:t>所在单位</w:t>
+              <w:t>单位</w:t>
             </w:r>
           </w:p>
         </w:tc>
@@ -294,10 +245,10 @@
           <w:tcPr>
             <w:tcW w:type="dxa" w:w="2736"/>
             <w:tcMar>
-              <w:top w:w="90" w:type="dxa"/>
-              <w:start w:w="130" w:type="dxa"/>
-              <w:bottom w:w="90" w:type="dxa"/>
-              <w:end w:w="130" w:type="dxa"/>
+              <w:top w:w="60" w:type="dxa"/>
+              <w:start w:w="95" w:type="dxa"/>
+              <w:bottom w:w="60" w:type="dxa"/>
+              <w:end w:w="95" w:type="dxa"/>
             </w:tcMar>
             <w:vAlign w:val="center"/>
           </w:tcPr>
@@ -315,7 +266,7 @@
                 <w:rFonts w:ascii="Calibri" w:hAnsi="Calibri" w:eastAsia="Microsoft YaHei"/>
                 <w:b w:val="0"/>
                 <w:color w:val="1F2933"/>
-                <w:sz w:val="20"/>
+                <w:sz w:val="18"/>
               </w:rPr>
               <w:t xml:space="preserve"> </w:t>
             </w:r>
@@ -326,10 +277,10 @@
             <w:tcW w:type="dxa" w:w="1944"/>
             <w:shd w:fill="F4F6F8"/>
             <w:tcMar>
-              <w:top w:w="90" w:type="dxa"/>
-              <w:start w:w="130" w:type="dxa"/>
-              <w:bottom w:w="90" w:type="dxa"/>
-              <w:end w:w="130" w:type="dxa"/>
+              <w:top w:w="60" w:type="dxa"/>
+              <w:start w:w="95" w:type="dxa"/>
+              <w:bottom w:w="60" w:type="dxa"/>
+              <w:end w:w="95" w:type="dxa"/>
             </w:tcMar>
             <w:vAlign w:val="center"/>
           </w:tcPr>
@@ -347,9 +298,9 @@
                 <w:rFonts w:ascii="Calibri" w:hAnsi="Calibri" w:eastAsia="Microsoft YaHei"/>
                 <w:b/>
                 <w:color w:val="1F2933"/>
-                <w:sz w:val="20"/>
+                <w:sz w:val="18"/>
               </w:rPr>
-              <w:t>院系/实验室</w:t>
+              <w:t>院系/团队</w:t>
             </w:r>
           </w:p>
         </w:tc>
@@ -357,10 +308,10 @@
           <w:tcPr>
             <w:tcW w:type="dxa" w:w="2736"/>
             <w:tcMar>
-              <w:top w:w="90" w:type="dxa"/>
-              <w:start w:w="130" w:type="dxa"/>
-              <w:bottom w:w="90" w:type="dxa"/>
-              <w:end w:w="130" w:type="dxa"/>
+              <w:top w:w="60" w:type="dxa"/>
+              <w:start w:w="95" w:type="dxa"/>
+              <w:bottom w:w="60" w:type="dxa"/>
+              <w:end w:w="95" w:type="dxa"/>
             </w:tcMar>
             <w:vAlign w:val="center"/>
           </w:tcPr>
@@ -378,7 +329,7 @@
                 <w:rFonts w:ascii="Calibri" w:hAnsi="Calibri" w:eastAsia="Microsoft YaHei"/>
                 <w:b w:val="0"/>
                 <w:color w:val="1F2933"/>
-                <w:sz w:val="20"/>
+                <w:sz w:val="18"/>
               </w:rPr>
               <w:t xml:space="preserve"> </w:t>
             </w:r>
@@ -387,17 +338,17 @@
       </w:tr>
       <w:tr>
         <w:trPr>
-          <w:trHeight w:val="518" w:hRule="atLeast"/>
+          <w:trHeight w:val="389" w:hRule="atLeast"/>
         </w:trPr>
         <w:tc>
           <w:tcPr>
             <w:tcW w:type="dxa" w:w="1944"/>
             <w:shd w:fill="F4F6F8"/>
             <w:tcMar>
-              <w:top w:w="90" w:type="dxa"/>
-              <w:start w:w="130" w:type="dxa"/>
-              <w:bottom w:w="90" w:type="dxa"/>
-              <w:end w:w="130" w:type="dxa"/>
+              <w:top w:w="60" w:type="dxa"/>
+              <w:start w:w="95" w:type="dxa"/>
+              <w:bottom w:w="60" w:type="dxa"/>
+              <w:end w:w="95" w:type="dxa"/>
             </w:tcMar>
             <w:vAlign w:val="center"/>
           </w:tcPr>
@@ -415,9 +366,9 @@
                 <w:rFonts w:ascii="Calibri" w:hAnsi="Calibri" w:eastAsia="Microsoft YaHei"/>
                 <w:b/>
                 <w:color w:val="1F2933"/>
-                <w:sz w:val="20"/>
+                <w:sz w:val="18"/>
               </w:rPr>
-              <w:t>通讯邮箱</w:t>
+              <w:t>邮箱</w:t>
             </w:r>
           </w:p>
         </w:tc>
@@ -425,10 +376,10 @@
           <w:tcPr>
             <w:tcW w:type="dxa" w:w="2736"/>
             <w:tcMar>
-              <w:top w:w="90" w:type="dxa"/>
-              <w:start w:w="130" w:type="dxa"/>
-              <w:bottom w:w="90" w:type="dxa"/>
-              <w:end w:w="130" w:type="dxa"/>
+              <w:top w:w="60" w:type="dxa"/>
+              <w:start w:w="95" w:type="dxa"/>
+              <w:bottom w:w="60" w:type="dxa"/>
+              <w:end w:w="95" w:type="dxa"/>
             </w:tcMar>
             <w:vAlign w:val="center"/>
           </w:tcPr>
@@ -446,7 +397,7 @@
                 <w:rFonts w:ascii="Calibri" w:hAnsi="Calibri" w:eastAsia="Microsoft YaHei"/>
                 <w:b w:val="0"/>
                 <w:color w:val="1F2933"/>
-                <w:sz w:val="20"/>
+                <w:sz w:val="18"/>
               </w:rPr>
               <w:t xml:space="preserve"> </w:t>
             </w:r>
@@ -457,10 +408,10 @@
             <w:tcW w:type="dxa" w:w="1944"/>
             <w:shd w:fill="F4F6F8"/>
             <w:tcMar>
-              <w:top w:w="90" w:type="dxa"/>
-              <w:start w:w="130" w:type="dxa"/>
-              <w:bottom w:w="90" w:type="dxa"/>
-              <w:end w:w="130" w:type="dxa"/>
+              <w:top w:w="60" w:type="dxa"/>
+              <w:start w:w="95" w:type="dxa"/>
+              <w:bottom w:w="60" w:type="dxa"/>
+              <w:end w:w="95" w:type="dxa"/>
             </w:tcMar>
             <w:vAlign w:val="center"/>
           </w:tcPr>
@@ -478,7 +429,7 @@
                 <w:rFonts w:ascii="Calibri" w:hAnsi="Calibri" w:eastAsia="Microsoft YaHei"/>
                 <w:b/>
                 <w:color w:val="1F2933"/>
-                <w:sz w:val="20"/>
+                <w:sz w:val="18"/>
               </w:rPr>
               <w:t>联系电话</w:t>
             </w:r>
@@ -488,10 +439,10 @@
           <w:tcPr>
             <w:tcW w:type="dxa" w:w="2736"/>
             <w:tcMar>
-              <w:top w:w="90" w:type="dxa"/>
-              <w:start w:w="130" w:type="dxa"/>
-              <w:bottom w:w="90" w:type="dxa"/>
-              <w:end w:w="130" w:type="dxa"/>
+              <w:top w:w="60" w:type="dxa"/>
+              <w:start w:w="95" w:type="dxa"/>
+              <w:bottom w:w="60" w:type="dxa"/>
+              <w:end w:w="95" w:type="dxa"/>
             </w:tcMar>
             <w:vAlign w:val="center"/>
           </w:tcPr>
@@ -509,7 +460,7 @@
                 <w:rFonts w:ascii="Calibri" w:hAnsi="Calibri" w:eastAsia="Microsoft YaHei"/>
                 <w:b w:val="0"/>
                 <w:color w:val="1F2933"/>
-                <w:sz w:val="20"/>
+                <w:sz w:val="18"/>
               </w:rPr>
               <w:t xml:space="preserve"> </w:t>
             </w:r>
@@ -518,17 +469,17 @@
       </w:tr>
       <w:tr>
         <w:trPr>
-          <w:trHeight w:val="518" w:hRule="atLeast"/>
+          <w:trHeight w:val="389" w:hRule="atLeast"/>
         </w:trPr>
         <w:tc>
           <w:tcPr>
             <w:tcW w:type="dxa" w:w="1944"/>
             <w:shd w:fill="F4F6F8"/>
             <w:tcMar>
-              <w:top w:w="90" w:type="dxa"/>
-              <w:start w:w="130" w:type="dxa"/>
-              <w:bottom w:w="90" w:type="dxa"/>
-              <w:end w:w="130" w:type="dxa"/>
+              <w:top w:w="60" w:type="dxa"/>
+              <w:start w:w="95" w:type="dxa"/>
+              <w:bottom w:w="60" w:type="dxa"/>
+              <w:end w:w="95" w:type="dxa"/>
             </w:tcMar>
             <w:vAlign w:val="center"/>
           </w:tcPr>
@@ -546,9 +497,9 @@
                 <w:rFonts w:ascii="Calibri" w:hAnsi="Calibri" w:eastAsia="Microsoft YaHei"/>
                 <w:b/>
                 <w:color w:val="1F2933"/>
-                <w:sz w:val="20"/>
+                <w:sz w:val="18"/>
               </w:rPr>
-              <w:t>国家/地区</w:t>
+              <w:t>负责人/导师（如适用）</w:t>
             </w:r>
           </w:p>
         </w:tc>
@@ -556,10 +507,10 @@
           <w:tcPr>
             <w:tcW w:type="dxa" w:w="2736"/>
             <w:tcMar>
-              <w:top w:w="90" w:type="dxa"/>
-              <w:start w:w="130" w:type="dxa"/>
-              <w:bottom w:w="90" w:type="dxa"/>
-              <w:end w:w="130" w:type="dxa"/>
+              <w:top w:w="60" w:type="dxa"/>
+              <w:start w:w="95" w:type="dxa"/>
+              <w:bottom w:w="60" w:type="dxa"/>
+              <w:end w:w="95" w:type="dxa"/>
             </w:tcMar>
             <w:vAlign w:val="center"/>
           </w:tcPr>
@@ -577,7 +528,7 @@
                 <w:rFonts w:ascii="Calibri" w:hAnsi="Calibri" w:eastAsia="Microsoft YaHei"/>
                 <w:b w:val="0"/>
                 <w:color w:val="1F2933"/>
-                <w:sz w:val="20"/>
+                <w:sz w:val="18"/>
               </w:rPr>
               <w:t xml:space="preserve"> </w:t>
             </w:r>
@@ -588,10 +539,10 @@
             <w:tcW w:type="dxa" w:w="1944"/>
             <w:shd w:fill="F4F6F8"/>
             <w:tcMar>
-              <w:top w:w="90" w:type="dxa"/>
-              <w:start w:w="130" w:type="dxa"/>
-              <w:bottom w:w="90" w:type="dxa"/>
-              <w:end w:w="130" w:type="dxa"/>
+              <w:top w:w="60" w:type="dxa"/>
+              <w:start w:w="95" w:type="dxa"/>
+              <w:bottom w:w="60" w:type="dxa"/>
+              <w:end w:w="95" w:type="dxa"/>
             </w:tcMar>
             <w:vAlign w:val="center"/>
           </w:tcPr>
@@ -609,9 +560,9 @@
                 <w:rFonts w:ascii="Calibri" w:hAnsi="Calibri" w:eastAsia="Microsoft YaHei"/>
                 <w:b/>
                 <w:color w:val="1F2933"/>
-                <w:sz w:val="20"/>
+                <w:sz w:val="18"/>
               </w:rPr>
-              <w:t>通讯地址</w:t>
+              <w:t>负责人邮箱</w:t>
             </w:r>
           </w:p>
         </w:tc>
@@ -619,10 +570,10 @@
           <w:tcPr>
             <w:tcW w:type="dxa" w:w="2736"/>
             <w:tcMar>
-              <w:top w:w="90" w:type="dxa"/>
-              <w:start w:w="130" w:type="dxa"/>
-              <w:bottom w:w="90" w:type="dxa"/>
-              <w:end w:w="130" w:type="dxa"/>
+              <w:top w:w="60" w:type="dxa"/>
+              <w:start w:w="95" w:type="dxa"/>
+              <w:bottom w:w="60" w:type="dxa"/>
+              <w:end w:w="95" w:type="dxa"/>
             </w:tcMar>
             <w:vAlign w:val="center"/>
           </w:tcPr>
@@ -640,298 +591,9 @@
                 <w:rFonts w:ascii="Calibri" w:hAnsi="Calibri" w:eastAsia="Microsoft YaHei"/>
                 <w:b w:val="0"/>
                 <w:color w:val="1F2933"/>
-                <w:sz w:val="20"/>
+                <w:sz w:val="18"/>
               </w:rPr>
               <w:t xml:space="preserve"> </w:t>
-            </w:r>
-          </w:p>
-        </w:tc>
-      </w:tr>
-      <w:tr>
-        <w:trPr>
-          <w:trHeight w:val="518" w:hRule="atLeast"/>
-        </w:trPr>
-        <w:tc>
-          <w:tcPr>
-            <w:tcW w:type="dxa" w:w="1944"/>
-            <w:shd w:fill="F4F6F8"/>
-            <w:tcMar>
-              <w:top w:w="90" w:type="dxa"/>
-              <w:start w:w="130" w:type="dxa"/>
-              <w:bottom w:w="90" w:type="dxa"/>
-              <w:end w:w="130" w:type="dxa"/>
-            </w:tcMar>
-            <w:vAlign w:val="center"/>
-          </w:tcPr>
-          <w:p>
-            <w:pPr>
-              <w:spacing w:before="0" w:after="0" w:line="259" w:lineRule="auto"/>
-            </w:pPr>
-            <w:r>
-              <w:rPr>
-                <w:rFonts w:ascii="Calibri" w:hAnsi="Calibri" w:eastAsia="Microsoft YaHei"/>
-              </w:rPr>
-            </w:r>
-            <w:r>
-              <w:rPr>
-                <w:rFonts w:ascii="Calibri" w:hAnsi="Calibri" w:eastAsia="Microsoft YaHei"/>
-                <w:b/>
-                <w:color w:val="1F2933"/>
-                <w:sz w:val="20"/>
-              </w:rPr>
-              <w:t>课题负责人/导师</w:t>
-            </w:r>
-          </w:p>
-        </w:tc>
-        <w:tc>
-          <w:tcPr>
-            <w:tcW w:type="dxa" w:w="2736"/>
-            <w:tcMar>
-              <w:top w:w="90" w:type="dxa"/>
-              <w:start w:w="130" w:type="dxa"/>
-              <w:bottom w:w="90" w:type="dxa"/>
-              <w:end w:w="130" w:type="dxa"/>
-            </w:tcMar>
-            <w:vAlign w:val="center"/>
-          </w:tcPr>
-          <w:p>
-            <w:pPr>
-              <w:spacing w:before="0" w:after="0" w:line="259" w:lineRule="auto"/>
-            </w:pPr>
-            <w:r>
-              <w:rPr>
-                <w:rFonts w:ascii="Calibri" w:hAnsi="Calibri" w:eastAsia="Microsoft YaHei"/>
-              </w:rPr>
-            </w:r>
-            <w:r>
-              <w:rPr>
-                <w:rFonts w:ascii="Calibri" w:hAnsi="Calibri" w:eastAsia="Microsoft YaHei"/>
-                <w:b w:val="0"/>
-                <w:color w:val="1F2933"/>
-                <w:sz w:val="20"/>
-              </w:rPr>
-              <w:t xml:space="preserve"> </w:t>
-            </w:r>
-          </w:p>
-        </w:tc>
-        <w:tc>
-          <w:tcPr>
-            <w:tcW w:type="dxa" w:w="1944"/>
-            <w:shd w:fill="F4F6F8"/>
-            <w:tcMar>
-              <w:top w:w="90" w:type="dxa"/>
-              <w:start w:w="130" w:type="dxa"/>
-              <w:bottom w:w="90" w:type="dxa"/>
-              <w:end w:w="130" w:type="dxa"/>
-            </w:tcMar>
-            <w:vAlign w:val="center"/>
-          </w:tcPr>
-          <w:p>
-            <w:pPr>
-              <w:spacing w:before="0" w:after="0" w:line="259" w:lineRule="auto"/>
-            </w:pPr>
-            <w:r>
-              <w:rPr>
-                <w:rFonts w:ascii="Calibri" w:hAnsi="Calibri" w:eastAsia="Microsoft YaHei"/>
-              </w:rPr>
-            </w:r>
-            <w:r>
-              <w:rPr>
-                <w:rFonts w:ascii="Calibri" w:hAnsi="Calibri" w:eastAsia="Microsoft YaHei"/>
-                <w:b/>
-                <w:color w:val="1F2933"/>
-                <w:sz w:val="20"/>
-              </w:rPr>
-              <w:t>负责人邮箱</w:t>
-            </w:r>
-          </w:p>
-        </w:tc>
-        <w:tc>
-          <w:tcPr>
-            <w:tcW w:type="dxa" w:w="2736"/>
-            <w:tcMar>
-              <w:top w:w="90" w:type="dxa"/>
-              <w:start w:w="130" w:type="dxa"/>
-              <w:bottom w:w="90" w:type="dxa"/>
-              <w:end w:w="130" w:type="dxa"/>
-            </w:tcMar>
-            <w:vAlign w:val="center"/>
-          </w:tcPr>
-          <w:p>
-            <w:pPr>
-              <w:spacing w:before="0" w:after="0" w:line="259" w:lineRule="auto"/>
-            </w:pPr>
-            <w:r>
-              <w:rPr>
-                <w:rFonts w:ascii="Calibri" w:hAnsi="Calibri" w:eastAsia="Microsoft YaHei"/>
-              </w:rPr>
-            </w:r>
-            <w:r>
-              <w:rPr>
-                <w:rFonts w:ascii="Calibri" w:hAnsi="Calibri" w:eastAsia="Microsoft YaHei"/>
-                <w:b w:val="0"/>
-                <w:color w:val="1F2933"/>
-                <w:sz w:val="20"/>
-              </w:rPr>
-              <w:t xml:space="preserve"> </w:t>
-            </w:r>
-          </w:p>
-        </w:tc>
-      </w:tr>
-    </w:tbl>
-    <w:p/>
-    <w:tbl>
-      <w:tblPr>
-        <w:tblW w:type="dxa" w:w="9360"/>
-        <w:jc w:val="left"/>
-        <w:tblLayout w:type="fixed"/>
-        <w:tblLook w:firstColumn="1" w:firstRow="1" w:lastColumn="0" w:lastRow="0" w:noHBand="0" w:noVBand="1" w:val="04A0"/>
-        <w:tblInd w:w="120" w:type="dxa"/>
-        <w:tblBorders>
-          <w:top w:val="single" w:sz="6" w:space="0" w:color="C9D0D6"/>
-          <w:left w:val="single" w:sz="6" w:space="0" w:color="C9D0D6"/>
-          <w:bottom w:val="single" w:sz="6" w:space="0" w:color="C9D0D6"/>
-          <w:right w:val="single" w:sz="6" w:space="0" w:color="C9D0D6"/>
-          <w:insideH w:val="single" w:sz="6" w:space="0" w:color="C9D0D6"/>
-          <w:insideV w:val="single" w:sz="6" w:space="0" w:color="C9D0D6"/>
-        </w:tblBorders>
-      </w:tblPr>
-      <w:tblGrid>
-        <w:gridCol w:w="2376"/>
-        <w:gridCol w:w="6984"/>
-      </w:tblGrid>
-      <w:tr>
-        <w:trPr>
-          <w:trHeight w:val="518" w:hRule="atLeast"/>
-        </w:trPr>
-        <w:tc>
-          <w:tcPr>
-            <w:tcW w:type="dxa" w:w="2376"/>
-            <w:shd w:fill="F5E9EA"/>
-            <w:tcMar>
-              <w:top w:w="90" w:type="dxa"/>
-              <w:start w:w="130" w:type="dxa"/>
-              <w:bottom w:w="90" w:type="dxa"/>
-              <w:end w:w="130" w:type="dxa"/>
-            </w:tcMar>
-            <w:vAlign w:val="center"/>
-          </w:tcPr>
-          <w:p>
-            <w:pPr>
-              <w:spacing w:before="0" w:after="0" w:line="259" w:lineRule="auto"/>
-            </w:pPr>
-            <w:r>
-              <w:rPr>
-                <w:rFonts w:ascii="Calibri" w:hAnsi="Calibri" w:eastAsia="Microsoft YaHei"/>
-              </w:rPr>
-            </w:r>
-            <w:r>
-              <w:rPr>
-                <w:rFonts w:ascii="Calibri" w:hAnsi="Calibri" w:eastAsia="Microsoft YaHei"/>
-                <w:b/>
-                <w:color w:val="4B1117"/>
-                <w:sz w:val="20"/>
-              </w:rPr>
-              <w:t>字段</w:t>
-            </w:r>
-          </w:p>
-        </w:tc>
-        <w:tc>
-          <w:tcPr>
-            <w:tcW w:type="dxa" w:w="6984"/>
-            <w:shd w:fill="F5E9EA"/>
-            <w:tcMar>
-              <w:top w:w="90" w:type="dxa"/>
-              <w:start w:w="130" w:type="dxa"/>
-              <w:bottom w:w="90" w:type="dxa"/>
-              <w:end w:w="130" w:type="dxa"/>
-            </w:tcMar>
-            <w:vAlign w:val="center"/>
-          </w:tcPr>
-          <w:p>
-            <w:pPr>
-              <w:spacing w:before="0" w:after="0" w:line="259" w:lineRule="auto"/>
-            </w:pPr>
-            <w:r>
-              <w:rPr>
-                <w:rFonts w:ascii="Calibri" w:hAnsi="Calibri" w:eastAsia="Microsoft YaHei"/>
-              </w:rPr>
-            </w:r>
-            <w:r>
-              <w:rPr>
-                <w:rFonts w:ascii="Calibri" w:hAnsi="Calibri" w:eastAsia="Microsoft YaHei"/>
-                <w:b/>
-                <w:color w:val="4B1117"/>
-                <w:sz w:val="20"/>
-              </w:rPr>
-              <w:t>填写内容</w:t>
-            </w:r>
-          </w:p>
-        </w:tc>
-      </w:tr>
-      <w:tr>
-        <w:trPr>
-          <w:trHeight w:val="1008" w:hRule="atLeast"/>
-        </w:trPr>
-        <w:tc>
-          <w:tcPr>
-            <w:tcW w:type="dxa" w:w="2376"/>
-            <w:tcMar>
-              <w:top w:w="90" w:type="dxa"/>
-              <w:start w:w="130" w:type="dxa"/>
-              <w:bottom w:w="90" w:type="dxa"/>
-              <w:end w:w="130" w:type="dxa"/>
-            </w:tcMar>
-            <w:vAlign w:val="center"/>
-          </w:tcPr>
-          <w:p>
-            <w:pPr>
-              <w:spacing w:before="0" w:after="0" w:line="259" w:lineRule="auto"/>
-            </w:pPr>
-            <w:r>
-              <w:rPr>
-                <w:rFonts w:ascii="Calibri" w:hAnsi="Calibri" w:eastAsia="Microsoft YaHei"/>
-              </w:rPr>
-            </w:r>
-            <w:r>
-              <w:rPr>
-                <w:rFonts w:ascii="Calibri" w:hAnsi="Calibri" w:eastAsia="Microsoft YaHei"/>
-                <w:b w:val="0"/>
-                <w:color w:val="1F2933"/>
-                <w:sz w:val="20"/>
-              </w:rPr>
-              <w:t>授权接触数据的项目成员</w:t>
-            </w:r>
-          </w:p>
-        </w:tc>
-        <w:tc>
-          <w:tcPr>
-            <w:tcW w:type="dxa" w:w="6984"/>
-            <w:tcMar>
-              <w:top w:w="90" w:type="dxa"/>
-              <w:start w:w="130" w:type="dxa"/>
-              <w:bottom w:w="90" w:type="dxa"/>
-              <w:end w:w="130" w:type="dxa"/>
-            </w:tcMar>
-            <w:vAlign w:val="center"/>
-          </w:tcPr>
-          <w:p>
-            <w:pPr>
-              <w:spacing w:before="0" w:after="0" w:line="259" w:lineRule="auto"/>
-            </w:pPr>
-            <w:r>
-              <w:rPr>
-                <w:rFonts w:ascii="Calibri" w:hAnsi="Calibri" w:eastAsia="Microsoft YaHei"/>
-              </w:rPr>
-            </w:r>
-            <w:r>
-              <w:rPr>
-                <w:rFonts w:ascii="Calibri" w:hAnsi="Calibri" w:eastAsia="Microsoft YaHei"/>
-                <w:b w:val="0"/>
-                <w:color w:val="1F2933"/>
-                <w:sz w:val="20"/>
-              </w:rPr>
-              <w:t>姓名、单位、邮箱、职责：</w:t>
             </w:r>
           </w:p>
         </w:tc>
@@ -946,7 +608,7 @@
         <w:rPr>
           <w:rFonts w:ascii="Calibri" w:hAnsi="Calibri" w:eastAsia="Microsoft YaHei"/>
         </w:rPr>
-        <w:t>二、研究计划</w:t>
+        <w:t>二、申请用途</w:t>
       </w:r>
     </w:p>
     <w:tbl>
@@ -966,22 +628,22 @@
         </w:tblBorders>
       </w:tblPr>
       <w:tblGrid>
-        <w:gridCol w:w="2592"/>
-        <w:gridCol w:w="6768"/>
+        <w:gridCol w:w="2088"/>
+        <w:gridCol w:w="7272"/>
       </w:tblGrid>
       <w:tr>
         <w:trPr>
-          <w:trHeight w:val="518" w:hRule="atLeast"/>
+          <w:trHeight w:val="403" w:hRule="atLeast"/>
         </w:trPr>
         <w:tc>
           <w:tcPr>
-            <w:tcW w:type="dxa" w:w="2592"/>
+            <w:tcW w:type="dxa" w:w="2088"/>
             <w:shd w:fill="F5E9EA"/>
             <w:tcMar>
-              <w:top w:w="90" w:type="dxa"/>
-              <w:start w:w="130" w:type="dxa"/>
-              <w:bottom w:w="90" w:type="dxa"/>
-              <w:end w:w="130" w:type="dxa"/>
+              <w:top w:w="60" w:type="dxa"/>
+              <w:start w:w="95" w:type="dxa"/>
+              <w:bottom w:w="60" w:type="dxa"/>
+              <w:end w:w="95" w:type="dxa"/>
             </w:tcMar>
             <w:vAlign w:val="center"/>
           </w:tcPr>
@@ -999,7 +661,7 @@
                 <w:rFonts w:ascii="Calibri" w:hAnsi="Calibri" w:eastAsia="Microsoft YaHei"/>
                 <w:b/>
                 <w:color w:val="4B1117"/>
-                <w:sz w:val="20"/>
+                <w:sz w:val="18"/>
               </w:rPr>
               <w:t>字段</w:t>
             </w:r>
@@ -1007,13 +669,13 @@
         </w:tc>
         <w:tc>
           <w:tcPr>
-            <w:tcW w:type="dxa" w:w="6768"/>
+            <w:tcW w:type="dxa" w:w="7272"/>
             <w:shd w:fill="F5E9EA"/>
             <w:tcMar>
-              <w:top w:w="90" w:type="dxa"/>
-              <w:start w:w="130" w:type="dxa"/>
-              <w:bottom w:w="90" w:type="dxa"/>
-              <w:end w:w="130" w:type="dxa"/>
+              <w:top w:w="60" w:type="dxa"/>
+              <w:start w:w="95" w:type="dxa"/>
+              <w:bottom w:w="60" w:type="dxa"/>
+              <w:end w:w="95" w:type="dxa"/>
             </w:tcMar>
             <w:vAlign w:val="center"/>
           </w:tcPr>
@@ -1031,7 +693,7 @@
                 <w:rFonts w:ascii="Calibri" w:hAnsi="Calibri" w:eastAsia="Microsoft YaHei"/>
                 <w:b/>
                 <w:color w:val="4B1117"/>
-                <w:sz w:val="20"/>
+                <w:sz w:val="18"/>
               </w:rPr>
               <w:t>填写内容</w:t>
             </w:r>
@@ -1040,16 +702,16 @@
       </w:tr>
       <w:tr>
         <w:trPr>
-          <w:trHeight w:val="547" w:hRule="atLeast"/>
+          <w:trHeight w:val="403" w:hRule="atLeast"/>
         </w:trPr>
         <w:tc>
           <w:tcPr>
-            <w:tcW w:type="dxa" w:w="2592"/>
+            <w:tcW w:type="dxa" w:w="2088"/>
             <w:tcMar>
-              <w:top w:w="90" w:type="dxa"/>
-              <w:start w:w="130" w:type="dxa"/>
-              <w:bottom w:w="90" w:type="dxa"/>
-              <w:end w:w="130" w:type="dxa"/>
+              <w:top w:w="60" w:type="dxa"/>
+              <w:start w:w="95" w:type="dxa"/>
+              <w:bottom w:w="60" w:type="dxa"/>
+              <w:end w:w="95" w:type="dxa"/>
             </w:tcMar>
             <w:vAlign w:val="center"/>
           </w:tcPr>
@@ -1067,7 +729,7 @@
                 <w:rFonts w:ascii="Calibri" w:hAnsi="Calibri" w:eastAsia="Microsoft YaHei"/>
                 <w:b w:val="0"/>
                 <w:color w:val="1F2933"/>
-                <w:sz w:val="20"/>
+                <w:sz w:val="18"/>
               </w:rPr>
               <w:t>课题名称</w:t>
             </w:r>
@@ -1075,12 +737,12 @@
         </w:tc>
         <w:tc>
           <w:tcPr>
-            <w:tcW w:type="dxa" w:w="6768"/>
+            <w:tcW w:type="dxa" w:w="7272"/>
             <w:tcMar>
-              <w:top w:w="90" w:type="dxa"/>
-              <w:start w:w="130" w:type="dxa"/>
-              <w:bottom w:w="90" w:type="dxa"/>
-              <w:end w:w="130" w:type="dxa"/>
+              <w:top w:w="60" w:type="dxa"/>
+              <w:start w:w="95" w:type="dxa"/>
+              <w:bottom w:w="60" w:type="dxa"/>
+              <w:end w:w="95" w:type="dxa"/>
             </w:tcMar>
             <w:vAlign w:val="center"/>
           </w:tcPr>
@@ -1098,7 +760,7 @@
                 <w:rFonts w:ascii="Calibri" w:hAnsi="Calibri" w:eastAsia="Microsoft YaHei"/>
                 <w:b w:val="0"/>
                 <w:color w:val="1F2933"/>
-                <w:sz w:val="20"/>
+                <w:sz w:val="18"/>
               </w:rPr>
               <w:t xml:space="preserve"> </w:t>
             </w:r>
@@ -1107,16 +769,16 @@
       </w:tr>
       <w:tr>
         <w:trPr>
-          <w:trHeight w:val="648" w:hRule="atLeast"/>
+          <w:trHeight w:val="461" w:hRule="atLeast"/>
         </w:trPr>
         <w:tc>
           <w:tcPr>
-            <w:tcW w:type="dxa" w:w="2592"/>
+            <w:tcW w:type="dxa" w:w="2088"/>
             <w:tcMar>
-              <w:top w:w="90" w:type="dxa"/>
-              <w:start w:w="130" w:type="dxa"/>
-              <w:bottom w:w="90" w:type="dxa"/>
-              <w:end w:w="130" w:type="dxa"/>
+              <w:top w:w="60" w:type="dxa"/>
+              <w:start w:w="95" w:type="dxa"/>
+              <w:bottom w:w="60" w:type="dxa"/>
+              <w:end w:w="95" w:type="dxa"/>
             </w:tcMar>
             <w:vAlign w:val="center"/>
           </w:tcPr>
@@ -1134,20 +796,20 @@
                 <w:rFonts w:ascii="Calibri" w:hAnsi="Calibri" w:eastAsia="Microsoft YaHei"/>
                 <w:b w:val="0"/>
                 <w:color w:val="1F2933"/>
-                <w:sz w:val="20"/>
+                <w:sz w:val="18"/>
               </w:rPr>
-              <w:t>研究类型</w:t>
+              <w:t>用途类型</w:t>
             </w:r>
           </w:p>
         </w:tc>
         <w:tc>
           <w:tcPr>
-            <w:tcW w:type="dxa" w:w="6768"/>
+            <w:tcW w:type="dxa" w:w="7272"/>
             <w:tcMar>
-              <w:top w:w="90" w:type="dxa"/>
-              <w:start w:w="130" w:type="dxa"/>
-              <w:bottom w:w="90" w:type="dxa"/>
-              <w:end w:w="130" w:type="dxa"/>
+              <w:top w:w="60" w:type="dxa"/>
+              <w:start w:w="95" w:type="dxa"/>
+              <w:bottom w:w="60" w:type="dxa"/>
+              <w:end w:w="95" w:type="dxa"/>
             </w:tcMar>
             <w:vAlign w:val="center"/>
           </w:tcPr>
@@ -1165,7 +827,7 @@
                 <w:rFonts w:ascii="Calibri" w:hAnsi="Calibri" w:eastAsia="Microsoft YaHei"/>
                 <w:b w:val="0"/>
                 <w:color w:val="1F2933"/>
-                <w:sz w:val="20"/>
+                <w:sz w:val="18"/>
               </w:rPr>
               <w:t>□ 学术论文  □ 学位论文  □ 教学/课程  □ 算法验证  □ 其他：</w:t>
             </w:r>
@@ -1174,16 +836,16 @@
       </w:tr>
       <w:tr>
         <w:trPr>
-          <w:trHeight w:val="1152" w:hRule="atLeast"/>
+          <w:trHeight w:val="749" w:hRule="atLeast"/>
         </w:trPr>
         <w:tc>
           <w:tcPr>
-            <w:tcW w:type="dxa" w:w="2592"/>
+            <w:tcW w:type="dxa" w:w="2088"/>
             <w:tcMar>
-              <w:top w:w="90" w:type="dxa"/>
-              <w:start w:w="130" w:type="dxa"/>
-              <w:bottom w:w="90" w:type="dxa"/>
-              <w:end w:w="130" w:type="dxa"/>
+              <w:top w:w="60" w:type="dxa"/>
+              <w:start w:w="95" w:type="dxa"/>
+              <w:bottom w:w="60" w:type="dxa"/>
+              <w:end w:w="95" w:type="dxa"/>
             </w:tcMar>
             <w:vAlign w:val="center"/>
           </w:tcPr>
@@ -1201,20 +863,20 @@
                 <w:rFonts w:ascii="Calibri" w:hAnsi="Calibri" w:eastAsia="Microsoft YaHei"/>
                 <w:b w:val="0"/>
                 <w:color w:val="1F2933"/>
-                <w:sz w:val="20"/>
+                <w:sz w:val="18"/>
               </w:rPr>
-              <w:t>研究目的与主要问题</w:t>
+              <w:t>研究简介</w:t>
             </w:r>
           </w:p>
         </w:tc>
         <w:tc>
           <w:tcPr>
-            <w:tcW w:type="dxa" w:w="6768"/>
+            <w:tcW w:type="dxa" w:w="7272"/>
             <w:tcMar>
-              <w:top w:w="90" w:type="dxa"/>
-              <w:start w:w="130" w:type="dxa"/>
-              <w:bottom w:w="90" w:type="dxa"/>
-              <w:end w:w="130" w:type="dxa"/>
+              <w:top w:w="60" w:type="dxa"/>
+              <w:start w:w="95" w:type="dxa"/>
+              <w:bottom w:w="60" w:type="dxa"/>
+              <w:end w:w="95" w:type="dxa"/>
             </w:tcMar>
             <w:vAlign w:val="center"/>
           </w:tcPr>
@@ -1232,25 +894,25 @@
                 <w:rFonts w:ascii="Calibri" w:hAnsi="Calibri" w:eastAsia="Microsoft YaHei"/>
                 <w:b w:val="0"/>
                 <w:color w:val="1F2933"/>
-                <w:sz w:val="20"/>
+                <w:sz w:val="18"/>
               </w:rPr>
-              <w:t xml:space="preserve"> </w:t>
+              <w:t>请用 2-3 句话说明研究问题、方法或预期分析：</w:t>
             </w:r>
           </w:p>
         </w:tc>
       </w:tr>
       <w:tr>
         <w:trPr>
-          <w:trHeight w:val="1152" w:hRule="atLeast"/>
+          <w:trHeight w:val="432" w:hRule="atLeast"/>
         </w:trPr>
         <w:tc>
           <w:tcPr>
-            <w:tcW w:type="dxa" w:w="2592"/>
+            <w:tcW w:type="dxa" w:w="2088"/>
             <w:tcMar>
-              <w:top w:w="90" w:type="dxa"/>
-              <w:start w:w="130" w:type="dxa"/>
-              <w:bottom w:w="90" w:type="dxa"/>
-              <w:end w:w="130" w:type="dxa"/>
+              <w:top w:w="60" w:type="dxa"/>
+              <w:start w:w="95" w:type="dxa"/>
+              <w:bottom w:w="60" w:type="dxa"/>
+              <w:end w:w="95" w:type="dxa"/>
             </w:tcMar>
             <w:vAlign w:val="center"/>
           </w:tcPr>
@@ -1268,20 +930,20 @@
                 <w:rFonts w:ascii="Calibri" w:hAnsi="Calibri" w:eastAsia="Microsoft YaHei"/>
                 <w:b w:val="0"/>
                 <w:color w:val="1F2933"/>
-                <w:sz w:val="20"/>
+                <w:sz w:val="18"/>
               </w:rPr>
-              <w:t>HIED 数据拟使用方式</w:t>
+              <w:t>申请数据</w:t>
             </w:r>
           </w:p>
         </w:tc>
         <w:tc>
           <w:tcPr>
-            <w:tcW w:type="dxa" w:w="6768"/>
+            <w:tcW w:type="dxa" w:w="7272"/>
             <w:tcMar>
-              <w:top w:w="90" w:type="dxa"/>
-              <w:start w:w="130" w:type="dxa"/>
-              <w:bottom w:w="90" w:type="dxa"/>
-              <w:end w:w="130" w:type="dxa"/>
+              <w:top w:w="60" w:type="dxa"/>
+              <w:start w:w="95" w:type="dxa"/>
+              <w:bottom w:w="60" w:type="dxa"/>
+              <w:end w:w="95" w:type="dxa"/>
             </w:tcMar>
             <w:vAlign w:val="center"/>
           </w:tcPr>
@@ -1299,25 +961,25 @@
                 <w:rFonts w:ascii="Calibri" w:hAnsi="Calibri" w:eastAsia="Microsoft YaHei"/>
                 <w:b w:val="0"/>
                 <w:color w:val="1F2933"/>
-                <w:sz w:val="20"/>
+                <w:sz w:val="18"/>
               </w:rPr>
-              <w:t xml:space="preserve"> </w:t>
+              <w:t>□ 预处理 EEG 试次数据（MATLAB .mat）  □ 数据说明文件</w:t>
             </w:r>
           </w:p>
         </w:tc>
       </w:tr>
       <w:tr>
         <w:trPr>
-          <w:trHeight w:val="1008" w:hRule="atLeast"/>
+          <w:trHeight w:val="403" w:hRule="atLeast"/>
         </w:trPr>
         <w:tc>
           <w:tcPr>
-            <w:tcW w:type="dxa" w:w="2592"/>
+            <w:tcW w:type="dxa" w:w="2088"/>
             <w:tcMar>
-              <w:top w:w="90" w:type="dxa"/>
-              <w:start w:w="130" w:type="dxa"/>
-              <w:bottom w:w="90" w:type="dxa"/>
-              <w:end w:w="130" w:type="dxa"/>
+              <w:top w:w="60" w:type="dxa"/>
+              <w:start w:w="95" w:type="dxa"/>
+              <w:bottom w:w="60" w:type="dxa"/>
+              <w:end w:w="95" w:type="dxa"/>
             </w:tcMar>
             <w:vAlign w:val="center"/>
           </w:tcPr>
@@ -1335,20 +997,20 @@
                 <w:rFonts w:ascii="Calibri" w:hAnsi="Calibri" w:eastAsia="Microsoft YaHei"/>
                 <w:b w:val="0"/>
                 <w:color w:val="1F2933"/>
-                <w:sz w:val="20"/>
+                <w:sz w:val="18"/>
               </w:rPr>
-              <w:t>分析环境与保存位置</w:t>
+              <w:t>使用期限</w:t>
             </w:r>
           </w:p>
         </w:tc>
         <w:tc>
           <w:tcPr>
-            <w:tcW w:type="dxa" w:w="6768"/>
+            <w:tcW w:type="dxa" w:w="7272"/>
             <w:tcMar>
-              <w:top w:w="90" w:type="dxa"/>
-              <w:start w:w="130" w:type="dxa"/>
-              <w:bottom w:w="90" w:type="dxa"/>
-              <w:end w:w="130" w:type="dxa"/>
+              <w:top w:w="60" w:type="dxa"/>
+              <w:start w:w="95" w:type="dxa"/>
+              <w:bottom w:w="60" w:type="dxa"/>
+              <w:end w:w="95" w:type="dxa"/>
             </w:tcMar>
             <w:vAlign w:val="center"/>
           </w:tcPr>
@@ -1366,208 +1028,7 @@
                 <w:rFonts w:ascii="Calibri" w:hAnsi="Calibri" w:eastAsia="Microsoft YaHei"/>
                 <w:b w:val="0"/>
                 <w:color w:val="1F2933"/>
-                <w:sz w:val="20"/>
-              </w:rPr>
-              <w:t>设备/服务器位置、访问权限、备份方式：</w:t>
-            </w:r>
-          </w:p>
-        </w:tc>
-      </w:tr>
-      <w:tr>
-        <w:trPr>
-          <w:trHeight w:val="792" w:hRule="atLeast"/>
-        </w:trPr>
-        <w:tc>
-          <w:tcPr>
-            <w:tcW w:type="dxa" w:w="2592"/>
-            <w:tcMar>
-              <w:top w:w="90" w:type="dxa"/>
-              <w:start w:w="130" w:type="dxa"/>
-              <w:bottom w:w="90" w:type="dxa"/>
-              <w:end w:w="130" w:type="dxa"/>
-            </w:tcMar>
-            <w:vAlign w:val="center"/>
-          </w:tcPr>
-          <w:p>
-            <w:pPr>
-              <w:spacing w:before="0" w:after="0" w:line="259" w:lineRule="auto"/>
-            </w:pPr>
-            <w:r>
-              <w:rPr>
-                <w:rFonts w:ascii="Calibri" w:hAnsi="Calibri" w:eastAsia="Microsoft YaHei"/>
-              </w:rPr>
-            </w:r>
-            <w:r>
-              <w:rPr>
-                <w:rFonts w:ascii="Calibri" w:hAnsi="Calibri" w:eastAsia="Microsoft YaHei"/>
-                <w:b w:val="0"/>
-                <w:color w:val="1F2933"/>
-                <w:sz w:val="20"/>
-              </w:rPr>
-              <w:t>伦理审批或单位备案</w:t>
-            </w:r>
-          </w:p>
-        </w:tc>
-        <w:tc>
-          <w:tcPr>
-            <w:tcW w:type="dxa" w:w="6768"/>
-            <w:tcMar>
-              <w:top w:w="90" w:type="dxa"/>
-              <w:start w:w="130" w:type="dxa"/>
-              <w:bottom w:w="90" w:type="dxa"/>
-              <w:end w:w="130" w:type="dxa"/>
-            </w:tcMar>
-            <w:vAlign w:val="center"/>
-          </w:tcPr>
-          <w:p>
-            <w:pPr>
-              <w:spacing w:before="0" w:after="0" w:line="259" w:lineRule="auto"/>
-            </w:pPr>
-            <w:r>
-              <w:rPr>
-                <w:rFonts w:ascii="Calibri" w:hAnsi="Calibri" w:eastAsia="Microsoft YaHei"/>
-              </w:rPr>
-            </w:r>
-            <w:r>
-              <w:rPr>
-                <w:rFonts w:ascii="Calibri" w:hAnsi="Calibri" w:eastAsia="Microsoft YaHei"/>
-                <w:b w:val="0"/>
-                <w:color w:val="1F2933"/>
-                <w:sz w:val="20"/>
-              </w:rPr>
-              <w:t>□ 已获批/备案，编号：          □ 正在办理  □ 不适用；说明：</w:t>
-            </w:r>
-          </w:p>
-        </w:tc>
-      </w:tr>
-      <w:tr>
-        <w:trPr>
-          <w:trHeight w:val="648" w:hRule="atLeast"/>
-        </w:trPr>
-        <w:tc>
-          <w:tcPr>
-            <w:tcW w:type="dxa" w:w="2592"/>
-            <w:tcMar>
-              <w:top w:w="90" w:type="dxa"/>
-              <w:start w:w="130" w:type="dxa"/>
-              <w:bottom w:w="90" w:type="dxa"/>
-              <w:end w:w="130" w:type="dxa"/>
-            </w:tcMar>
-            <w:vAlign w:val="center"/>
-          </w:tcPr>
-          <w:p>
-            <w:pPr>
-              <w:spacing w:before="0" w:after="0" w:line="259" w:lineRule="auto"/>
-            </w:pPr>
-            <w:r>
-              <w:rPr>
-                <w:rFonts w:ascii="Calibri" w:hAnsi="Calibri" w:eastAsia="Microsoft YaHei"/>
-              </w:rPr>
-            </w:r>
-            <w:r>
-              <w:rPr>
-                <w:rFonts w:ascii="Calibri" w:hAnsi="Calibri" w:eastAsia="Microsoft YaHei"/>
-                <w:b w:val="0"/>
-                <w:color w:val="1F2933"/>
-                <w:sz w:val="20"/>
-              </w:rPr>
-              <w:t>预期成果</w:t>
-            </w:r>
-          </w:p>
-        </w:tc>
-        <w:tc>
-          <w:tcPr>
-            <w:tcW w:type="dxa" w:w="6768"/>
-            <w:tcMar>
-              <w:top w:w="90" w:type="dxa"/>
-              <w:start w:w="130" w:type="dxa"/>
-              <w:bottom w:w="90" w:type="dxa"/>
-              <w:end w:w="130" w:type="dxa"/>
-            </w:tcMar>
-            <w:vAlign w:val="center"/>
-          </w:tcPr>
-          <w:p>
-            <w:pPr>
-              <w:spacing w:before="0" w:after="0" w:line="259" w:lineRule="auto"/>
-            </w:pPr>
-            <w:r>
-              <w:rPr>
-                <w:rFonts w:ascii="Calibri" w:hAnsi="Calibri" w:eastAsia="Microsoft YaHei"/>
-              </w:rPr>
-            </w:r>
-            <w:r>
-              <w:rPr>
-                <w:rFonts w:ascii="Calibri" w:hAnsi="Calibri" w:eastAsia="Microsoft YaHei"/>
-                <w:b w:val="0"/>
-                <w:color w:val="1F2933"/>
-                <w:sz w:val="20"/>
-              </w:rPr>
-              <w:t>期刊/会议论文、学位论文、报告、代码或其他：</w:t>
-            </w:r>
-          </w:p>
-        </w:tc>
-      </w:tr>
-      <w:tr>
-        <w:trPr>
-          <w:trHeight w:val="547" w:hRule="atLeast"/>
-        </w:trPr>
-        <w:tc>
-          <w:tcPr>
-            <w:tcW w:type="dxa" w:w="2592"/>
-            <w:tcMar>
-              <w:top w:w="90" w:type="dxa"/>
-              <w:start w:w="130" w:type="dxa"/>
-              <w:bottom w:w="90" w:type="dxa"/>
-              <w:end w:w="130" w:type="dxa"/>
-            </w:tcMar>
-            <w:vAlign w:val="center"/>
-          </w:tcPr>
-          <w:p>
-            <w:pPr>
-              <w:spacing w:before="0" w:after="0" w:line="259" w:lineRule="auto"/>
-            </w:pPr>
-            <w:r>
-              <w:rPr>
-                <w:rFonts w:ascii="Calibri" w:hAnsi="Calibri" w:eastAsia="Microsoft YaHei"/>
-              </w:rPr>
-            </w:r>
-            <w:r>
-              <w:rPr>
-                <w:rFonts w:ascii="Calibri" w:hAnsi="Calibri" w:eastAsia="Microsoft YaHei"/>
-                <w:b w:val="0"/>
-                <w:color w:val="1F2933"/>
-                <w:sz w:val="20"/>
-              </w:rPr>
-              <w:t>预计使用期限</w:t>
-            </w:r>
-          </w:p>
-        </w:tc>
-        <w:tc>
-          <w:tcPr>
-            <w:tcW w:type="dxa" w:w="6768"/>
-            <w:tcMar>
-              <w:top w:w="90" w:type="dxa"/>
-              <w:start w:w="130" w:type="dxa"/>
-              <w:bottom w:w="90" w:type="dxa"/>
-              <w:end w:w="130" w:type="dxa"/>
-            </w:tcMar>
-            <w:vAlign w:val="center"/>
-          </w:tcPr>
-          <w:p>
-            <w:pPr>
-              <w:spacing w:before="0" w:after="0" w:line="259" w:lineRule="auto"/>
-            </w:pPr>
-            <w:r>
-              <w:rPr>
-                <w:rFonts w:ascii="Calibri" w:hAnsi="Calibri" w:eastAsia="Microsoft YaHei"/>
-              </w:rPr>
-            </w:r>
-            <w:r>
-              <w:rPr>
-                <w:rFonts w:ascii="Calibri" w:hAnsi="Calibri" w:eastAsia="Microsoft YaHei"/>
-                <w:b w:val="0"/>
-                <w:color w:val="1F2933"/>
-                <w:sz w:val="20"/>
+                <w:sz w:val="18"/>
               </w:rPr>
               <w:t>自        年    月    日  至        年    月    日</w:t>
             </w:r>
@@ -1584,437 +1045,7 @@
         <w:rPr>
           <w:rFonts w:ascii="Calibri" w:hAnsi="Calibri" w:eastAsia="Microsoft YaHei"/>
         </w:rPr>
-        <w:t>三、申请数据范围</w:t>
-      </w:r>
-    </w:p>
-    <w:tbl>
-      <w:tblPr>
-        <w:tblW w:type="dxa" w:w="9360"/>
-        <w:jc w:val="left"/>
-        <w:tblLayout w:type="fixed"/>
-        <w:tblLook w:firstColumn="1" w:firstRow="1" w:lastColumn="0" w:lastRow="0" w:noHBand="0" w:noVBand="1" w:val="04A0"/>
-        <w:tblInd w:w="120" w:type="dxa"/>
-        <w:tblBorders>
-          <w:top w:val="single" w:sz="6" w:space="0" w:color="C9D0D6"/>
-          <w:left w:val="single" w:sz="6" w:space="0" w:color="C9D0D6"/>
-          <w:bottom w:val="single" w:sz="6" w:space="0" w:color="C9D0D6"/>
-          <w:right w:val="single" w:sz="6" w:space="0" w:color="C9D0D6"/>
-          <w:insideH w:val="single" w:sz="6" w:space="0" w:color="C9D0D6"/>
-          <w:insideV w:val="single" w:sz="6" w:space="0" w:color="C9D0D6"/>
-        </w:tblBorders>
-      </w:tblPr>
-      <w:tblGrid>
-        <w:gridCol w:w="792"/>
-        <w:gridCol w:w="2376"/>
-        <w:gridCol w:w="6192"/>
-      </w:tblGrid>
-      <w:tr>
-        <w:trPr>
-          <w:trHeight w:val="518" w:hRule="atLeast"/>
-        </w:trPr>
-        <w:tc>
-          <w:tcPr>
-            <w:tcW w:type="dxa" w:w="792"/>
-            <w:shd w:fill="F5E9EA"/>
-            <w:tcMar>
-              <w:top w:w="90" w:type="dxa"/>
-              <w:start w:w="130" w:type="dxa"/>
-              <w:bottom w:w="90" w:type="dxa"/>
-              <w:end w:w="130" w:type="dxa"/>
-            </w:tcMar>
-            <w:vAlign w:val="center"/>
-          </w:tcPr>
-          <w:p>
-            <w:pPr>
-              <w:spacing w:before="0" w:after="0" w:line="259" w:lineRule="auto"/>
-              <w:jc w:val="center"/>
-            </w:pPr>
-            <w:r>
-              <w:rPr>
-                <w:rFonts w:ascii="Calibri" w:hAnsi="Calibri" w:eastAsia="Microsoft YaHei"/>
-              </w:rPr>
-            </w:r>
-            <w:r>
-              <w:rPr>
-                <w:rFonts w:ascii="Calibri" w:hAnsi="Calibri" w:eastAsia="Microsoft YaHei"/>
-                <w:b/>
-                <w:color w:val="4B1117"/>
-                <w:sz w:val="20"/>
-              </w:rPr>
-              <w:t>选择</w:t>
-            </w:r>
-          </w:p>
-        </w:tc>
-        <w:tc>
-          <w:tcPr>
-            <w:tcW w:type="dxa" w:w="2376"/>
-            <w:shd w:fill="F5E9EA"/>
-            <w:tcMar>
-              <w:top w:w="90" w:type="dxa"/>
-              <w:start w:w="130" w:type="dxa"/>
-              <w:bottom w:w="90" w:type="dxa"/>
-              <w:end w:w="130" w:type="dxa"/>
-            </w:tcMar>
-            <w:vAlign w:val="center"/>
-          </w:tcPr>
-          <w:p>
-            <w:pPr>
-              <w:spacing w:before="0" w:after="0" w:line="259" w:lineRule="auto"/>
-            </w:pPr>
-            <w:r>
-              <w:rPr>
-                <w:rFonts w:ascii="Calibri" w:hAnsi="Calibri" w:eastAsia="Microsoft YaHei"/>
-              </w:rPr>
-            </w:r>
-            <w:r>
-              <w:rPr>
-                <w:rFonts w:ascii="Calibri" w:hAnsi="Calibri" w:eastAsia="Microsoft YaHei"/>
-                <w:b/>
-                <w:color w:val="4B1117"/>
-                <w:sz w:val="20"/>
-              </w:rPr>
-              <w:t>数据项</w:t>
-            </w:r>
-          </w:p>
-        </w:tc>
-        <w:tc>
-          <w:tcPr>
-            <w:tcW w:type="dxa" w:w="6192"/>
-            <w:shd w:fill="F5E9EA"/>
-            <w:tcMar>
-              <w:top w:w="90" w:type="dxa"/>
-              <w:start w:w="130" w:type="dxa"/>
-              <w:bottom w:w="90" w:type="dxa"/>
-              <w:end w:w="130" w:type="dxa"/>
-            </w:tcMar>
-            <w:vAlign w:val="center"/>
-          </w:tcPr>
-          <w:p>
-            <w:pPr>
-              <w:spacing w:before="0" w:after="0" w:line="259" w:lineRule="auto"/>
-            </w:pPr>
-            <w:r>
-              <w:rPr>
-                <w:rFonts w:ascii="Calibri" w:hAnsi="Calibri" w:eastAsia="Microsoft YaHei"/>
-              </w:rPr>
-            </w:r>
-            <w:r>
-              <w:rPr>
-                <w:rFonts w:ascii="Calibri" w:hAnsi="Calibri" w:eastAsia="Microsoft YaHei"/>
-                <w:b/>
-                <w:color w:val="4B1117"/>
-                <w:sz w:val="20"/>
-              </w:rPr>
-              <w:t>说明</w:t>
-            </w:r>
-          </w:p>
-        </w:tc>
-      </w:tr>
-      <w:tr>
-        <w:trPr>
-          <w:trHeight w:val="605" w:hRule="atLeast"/>
-        </w:trPr>
-        <w:tc>
-          <w:tcPr>
-            <w:tcW w:type="dxa" w:w="792"/>
-            <w:tcMar>
-              <w:top w:w="90" w:type="dxa"/>
-              <w:start w:w="130" w:type="dxa"/>
-              <w:bottom w:w="90" w:type="dxa"/>
-              <w:end w:w="130" w:type="dxa"/>
-            </w:tcMar>
-            <w:vAlign w:val="center"/>
-          </w:tcPr>
-          <w:p>
-            <w:pPr>
-              <w:spacing w:before="0" w:after="0" w:line="259" w:lineRule="auto"/>
-            </w:pPr>
-            <w:r>
-              <w:rPr>
-                <w:rFonts w:ascii="Calibri" w:hAnsi="Calibri" w:eastAsia="Microsoft YaHei"/>
-              </w:rPr>
-            </w:r>
-            <w:r>
-              <w:rPr>
-                <w:rFonts w:ascii="Calibri" w:hAnsi="Calibri" w:eastAsia="Microsoft YaHei"/>
-                <w:b w:val="0"/>
-                <w:color w:val="1F2933"/>
-                <w:sz w:val="20"/>
-              </w:rPr>
-              <w:t>□</w:t>
-            </w:r>
-          </w:p>
-        </w:tc>
-        <w:tc>
-          <w:tcPr>
-            <w:tcW w:type="dxa" w:w="2376"/>
-            <w:tcMar>
-              <w:top w:w="90" w:type="dxa"/>
-              <w:start w:w="130" w:type="dxa"/>
-              <w:bottom w:w="90" w:type="dxa"/>
-              <w:end w:w="130" w:type="dxa"/>
-            </w:tcMar>
-            <w:vAlign w:val="center"/>
-          </w:tcPr>
-          <w:p>
-            <w:pPr>
-              <w:spacing w:before="0" w:after="0" w:line="259" w:lineRule="auto"/>
-            </w:pPr>
-            <w:r>
-              <w:rPr>
-                <w:rFonts w:ascii="Calibri" w:hAnsi="Calibri" w:eastAsia="Microsoft YaHei"/>
-              </w:rPr>
-            </w:r>
-            <w:r>
-              <w:rPr>
-                <w:rFonts w:ascii="Calibri" w:hAnsi="Calibri" w:eastAsia="Microsoft YaHei"/>
-                <w:b w:val="0"/>
-                <w:color w:val="1F2933"/>
-                <w:sz w:val="20"/>
-              </w:rPr>
-              <w:t>预处理 EEG 试次数据</w:t>
-            </w:r>
-          </w:p>
-        </w:tc>
-        <w:tc>
-          <w:tcPr>
-            <w:tcW w:type="dxa" w:w="6192"/>
-            <w:tcMar>
-              <w:top w:w="90" w:type="dxa"/>
-              <w:start w:w="130" w:type="dxa"/>
-              <w:bottom w:w="90" w:type="dxa"/>
-              <w:end w:w="130" w:type="dxa"/>
-            </w:tcMar>
-            <w:vAlign w:val="center"/>
-          </w:tcPr>
-          <w:p>
-            <w:pPr>
-              <w:spacing w:before="0" w:after="0" w:line="259" w:lineRule="auto"/>
-            </w:pPr>
-            <w:r>
-              <w:rPr>
-                <w:rFonts w:ascii="Calibri" w:hAnsi="Calibri" w:eastAsia="Microsoft YaHei"/>
-              </w:rPr>
-            </w:r>
-            <w:r>
-              <w:rPr>
-                <w:rFonts w:ascii="Calibri" w:hAnsi="Calibri" w:eastAsia="Microsoft YaHei"/>
-                <w:b w:val="0"/>
-                <w:color w:val="1F2933"/>
-                <w:sz w:val="20"/>
-              </w:rPr>
-              <w:t>HIED/S01-S30 文件夹内的 MATLAB .mat 文件；每名受试者 30 个试次。</w:t>
-            </w:r>
-          </w:p>
-        </w:tc>
-      </w:tr>
-      <w:tr>
-        <w:trPr>
-          <w:trHeight w:val="605" w:hRule="atLeast"/>
-        </w:trPr>
-        <w:tc>
-          <w:tcPr>
-            <w:tcW w:type="dxa" w:w="792"/>
-            <w:tcMar>
-              <w:top w:w="90" w:type="dxa"/>
-              <w:start w:w="130" w:type="dxa"/>
-              <w:bottom w:w="90" w:type="dxa"/>
-              <w:end w:w="130" w:type="dxa"/>
-            </w:tcMar>
-            <w:vAlign w:val="center"/>
-          </w:tcPr>
-          <w:p>
-            <w:pPr>
-              <w:spacing w:before="0" w:after="0" w:line="259" w:lineRule="auto"/>
-            </w:pPr>
-            <w:r>
-              <w:rPr>
-                <w:rFonts w:ascii="Calibri" w:hAnsi="Calibri" w:eastAsia="Microsoft YaHei"/>
-              </w:rPr>
-            </w:r>
-            <w:r>
-              <w:rPr>
-                <w:rFonts w:ascii="Calibri" w:hAnsi="Calibri" w:eastAsia="Microsoft YaHei"/>
-                <w:b w:val="0"/>
-                <w:color w:val="1F2933"/>
-                <w:sz w:val="20"/>
-              </w:rPr>
-              <w:t>□</w:t>
-            </w:r>
-          </w:p>
-        </w:tc>
-        <w:tc>
-          <w:tcPr>
-            <w:tcW w:type="dxa" w:w="2376"/>
-            <w:tcMar>
-              <w:top w:w="90" w:type="dxa"/>
-              <w:start w:w="130" w:type="dxa"/>
-              <w:bottom w:w="90" w:type="dxa"/>
-              <w:end w:w="130" w:type="dxa"/>
-            </w:tcMar>
-            <w:vAlign w:val="center"/>
-          </w:tcPr>
-          <w:p>
-            <w:pPr>
-              <w:spacing w:before="0" w:after="0" w:line="259" w:lineRule="auto"/>
-            </w:pPr>
-            <w:r>
-              <w:rPr>
-                <w:rFonts w:ascii="Calibri" w:hAnsi="Calibri" w:eastAsia="Microsoft YaHei"/>
-              </w:rPr>
-            </w:r>
-            <w:r>
-              <w:rPr>
-                <w:rFonts w:ascii="Calibri" w:hAnsi="Calibri" w:eastAsia="Microsoft YaHei"/>
-                <w:b w:val="0"/>
-                <w:color w:val="1F2933"/>
-                <w:sz w:val="20"/>
-              </w:rPr>
-              <w:t>匿名被试统计信息</w:t>
-            </w:r>
-          </w:p>
-        </w:tc>
-        <w:tc>
-          <w:tcPr>
-            <w:tcW w:type="dxa" w:w="6192"/>
-            <w:tcMar>
-              <w:top w:w="90" w:type="dxa"/>
-              <w:start w:w="130" w:type="dxa"/>
-              <w:bottom w:w="90" w:type="dxa"/>
-              <w:end w:w="130" w:type="dxa"/>
-            </w:tcMar>
-            <w:vAlign w:val="center"/>
-          </w:tcPr>
-          <w:p>
-            <w:pPr>
-              <w:spacing w:before="0" w:after="0" w:line="259" w:lineRule="auto"/>
-            </w:pPr>
-            <w:r>
-              <w:rPr>
-                <w:rFonts w:ascii="Calibri" w:hAnsi="Calibri" w:eastAsia="Microsoft YaHei"/>
-              </w:rPr>
-            </w:r>
-            <w:r>
-              <w:rPr>
-                <w:rFonts w:ascii="Calibri" w:hAnsi="Calibri" w:eastAsia="Microsoft YaHei"/>
-                <w:b w:val="0"/>
-                <w:color w:val="1F2933"/>
-                <w:sz w:val="20"/>
-              </w:rPr>
-              <w:t>仅包含非直接身份标识的统计字段，用于样本描述和分组分析。</w:t>
-            </w:r>
-          </w:p>
-        </w:tc>
-      </w:tr>
-      <w:tr>
-        <w:trPr>
-          <w:trHeight w:val="605" w:hRule="atLeast"/>
-        </w:trPr>
-        <w:tc>
-          <w:tcPr>
-            <w:tcW w:type="dxa" w:w="792"/>
-            <w:tcMar>
-              <w:top w:w="90" w:type="dxa"/>
-              <w:start w:w="130" w:type="dxa"/>
-              <w:bottom w:w="90" w:type="dxa"/>
-              <w:end w:w="130" w:type="dxa"/>
-            </w:tcMar>
-            <w:vAlign w:val="center"/>
-          </w:tcPr>
-          <w:p>
-            <w:pPr>
-              <w:spacing w:before="0" w:after="0" w:line="259" w:lineRule="auto"/>
-            </w:pPr>
-            <w:r>
-              <w:rPr>
-                <w:rFonts w:ascii="Calibri" w:hAnsi="Calibri" w:eastAsia="Microsoft YaHei"/>
-              </w:rPr>
-            </w:r>
-            <w:r>
-              <w:rPr>
-                <w:rFonts w:ascii="Calibri" w:hAnsi="Calibri" w:eastAsia="Microsoft YaHei"/>
-                <w:b w:val="0"/>
-                <w:color w:val="1F2933"/>
-                <w:sz w:val="20"/>
-              </w:rPr>
-              <w:t>□</w:t>
-            </w:r>
-          </w:p>
-        </w:tc>
-        <w:tc>
-          <w:tcPr>
-            <w:tcW w:type="dxa" w:w="2376"/>
-            <w:tcMar>
-              <w:top w:w="90" w:type="dxa"/>
-              <w:start w:w="130" w:type="dxa"/>
-              <w:bottom w:w="90" w:type="dxa"/>
-              <w:end w:w="130" w:type="dxa"/>
-            </w:tcMar>
-            <w:vAlign w:val="center"/>
-          </w:tcPr>
-          <w:p>
-            <w:pPr>
-              <w:spacing w:before="0" w:after="0" w:line="259" w:lineRule="auto"/>
-            </w:pPr>
-            <w:r>
-              <w:rPr>
-                <w:rFonts w:ascii="Calibri" w:hAnsi="Calibri" w:eastAsia="Microsoft YaHei"/>
-              </w:rPr>
-            </w:r>
-            <w:r>
-              <w:rPr>
-                <w:rFonts w:ascii="Calibri" w:hAnsi="Calibri" w:eastAsia="Microsoft YaHei"/>
-                <w:b w:val="0"/>
-                <w:color w:val="1F2933"/>
-                <w:sz w:val="20"/>
-              </w:rPr>
-              <w:t>数据说明文件</w:t>
-            </w:r>
-          </w:p>
-        </w:tc>
-        <w:tc>
-          <w:tcPr>
-            <w:tcW w:type="dxa" w:w="6192"/>
-            <w:tcMar>
-              <w:top w:w="90" w:type="dxa"/>
-              <w:start w:w="130" w:type="dxa"/>
-              <w:bottom w:w="90" w:type="dxa"/>
-              <w:end w:w="130" w:type="dxa"/>
-            </w:tcMar>
-            <w:vAlign w:val="center"/>
-          </w:tcPr>
-          <w:p>
-            <w:pPr>
-              <w:spacing w:before="0" w:after="0" w:line="259" w:lineRule="auto"/>
-            </w:pPr>
-            <w:r>
-              <w:rPr>
-                <w:rFonts w:ascii="Calibri" w:hAnsi="Calibri" w:eastAsia="Microsoft YaHei"/>
-              </w:rPr>
-            </w:r>
-            <w:r>
-              <w:rPr>
-                <w:rFonts w:ascii="Calibri" w:hAnsi="Calibri" w:eastAsia="Microsoft YaHei"/>
-                <w:b w:val="0"/>
-                <w:color w:val="1F2933"/>
-                <w:sz w:val="20"/>
-              </w:rPr>
-              <w:t>变量名称、采样率、通道数量、文件组织方式和引用信息。</w:t>
-            </w:r>
-          </w:p>
-        </w:tc>
-      </w:tr>
-    </w:tbl>
-    <w:p/>
-    <w:p>
-      <w:pPr>
-        <w:pStyle w:val="Heading1"/>
-      </w:pPr>
-      <w:r>
-        <w:rPr>
-          <w:rFonts w:ascii="Calibri" w:hAnsi="Calibri" w:eastAsia="Microsoft YaHei"/>
-        </w:rPr>
-        <w:t>四、数据使用承诺</w:t>
+        <w:t>三、数据使用承诺</w:t>
       </w:r>
     </w:p>
     <w:tbl>
@@ -2039,17 +1070,17 @@
       </w:tblGrid>
       <w:tr>
         <w:trPr>
-          <w:trHeight w:val="518" w:hRule="atLeast"/>
+          <w:trHeight w:val="403" w:hRule="atLeast"/>
         </w:trPr>
         <w:tc>
           <w:tcPr>
             <w:tcW w:type="dxa" w:w="936"/>
             <w:shd w:fill="F5E9EA"/>
             <w:tcMar>
-              <w:top w:w="90" w:type="dxa"/>
-              <w:start w:w="130" w:type="dxa"/>
-              <w:bottom w:w="90" w:type="dxa"/>
-              <w:end w:w="130" w:type="dxa"/>
+              <w:top w:w="60" w:type="dxa"/>
+              <w:start w:w="95" w:type="dxa"/>
+              <w:bottom w:w="60" w:type="dxa"/>
+              <w:end w:w="95" w:type="dxa"/>
             </w:tcMar>
             <w:vAlign w:val="center"/>
           </w:tcPr>
@@ -2067,7 +1098,7 @@
                 <w:rFonts w:ascii="Calibri" w:hAnsi="Calibri" w:eastAsia="Microsoft YaHei"/>
                 <w:b/>
                 <w:color w:val="4B1117"/>
-                <w:sz w:val="20"/>
+                <w:sz w:val="18"/>
               </w:rPr>
               <w:t>确认</w:t>
             </w:r>
@@ -2078,10 +1109,10 @@
             <w:tcW w:type="dxa" w:w="8424"/>
             <w:shd w:fill="F5E9EA"/>
             <w:tcMar>
-              <w:top w:w="90" w:type="dxa"/>
-              <w:start w:w="130" w:type="dxa"/>
-              <w:bottom w:w="90" w:type="dxa"/>
-              <w:end w:w="130" w:type="dxa"/>
+              <w:top w:w="60" w:type="dxa"/>
+              <w:start w:w="95" w:type="dxa"/>
+              <w:bottom w:w="60" w:type="dxa"/>
+              <w:end w:w="95" w:type="dxa"/>
             </w:tcMar>
             <w:vAlign w:val="center"/>
           </w:tcPr>
@@ -2099,7 +1130,7 @@
                 <w:rFonts w:ascii="Calibri" w:hAnsi="Calibri" w:eastAsia="Microsoft YaHei"/>
                 <w:b/>
                 <w:color w:val="4B1117"/>
-                <w:sz w:val="20"/>
+                <w:sz w:val="18"/>
               </w:rPr>
               <w:t>承诺事项</w:t>
             </w:r>
@@ -2108,16 +1139,16 @@
       </w:tr>
       <w:tr>
         <w:trPr>
-          <w:trHeight w:val="547" w:hRule="atLeast"/>
+          <w:trHeight w:val="403" w:hRule="atLeast"/>
         </w:trPr>
         <w:tc>
           <w:tcPr>
             <w:tcW w:type="dxa" w:w="936"/>
             <w:tcMar>
-              <w:top w:w="90" w:type="dxa"/>
-              <w:start w:w="130" w:type="dxa"/>
-              <w:bottom w:w="90" w:type="dxa"/>
-              <w:end w:w="130" w:type="dxa"/>
+              <w:top w:w="60" w:type="dxa"/>
+              <w:start w:w="95" w:type="dxa"/>
+              <w:bottom w:w="60" w:type="dxa"/>
+              <w:end w:w="95" w:type="dxa"/>
             </w:tcMar>
             <w:vAlign w:val="center"/>
           </w:tcPr>
@@ -2135,7 +1166,7 @@
                 <w:rFonts w:ascii="Calibri" w:hAnsi="Calibri" w:eastAsia="Microsoft YaHei"/>
                 <w:b w:val="0"/>
                 <w:color w:val="1F2933"/>
-                <w:sz w:val="20"/>
+                <w:sz w:val="18"/>
               </w:rPr>
               <w:t>□</w:t>
             </w:r>
@@ -2145,10 +1176,10 @@
           <w:tcPr>
             <w:tcW w:type="dxa" w:w="8424"/>
             <w:tcMar>
-              <w:top w:w="90" w:type="dxa"/>
-              <w:start w:w="130" w:type="dxa"/>
-              <w:bottom w:w="90" w:type="dxa"/>
-              <w:end w:w="130" w:type="dxa"/>
+              <w:top w:w="60" w:type="dxa"/>
+              <w:start w:w="95" w:type="dxa"/>
+              <w:bottom w:w="60" w:type="dxa"/>
+              <w:end w:w="95" w:type="dxa"/>
             </w:tcMar>
             <w:vAlign w:val="center"/>
           </w:tcPr>
@@ -2166,25 +1197,25 @@
                 <w:rFonts w:ascii="Calibri" w:hAnsi="Calibri" w:eastAsia="Microsoft YaHei"/>
                 <w:b w:val="0"/>
                 <w:color w:val="1F2933"/>
-                <w:sz w:val="20"/>
+                <w:sz w:val="18"/>
               </w:rPr>
-              <w:t>申请材料真实、完整；数据仅用于本表所列研究目的。</w:t>
+              <w:t>数据仅用于本表所列学术或非商业研究目的。</w:t>
             </w:r>
           </w:p>
         </w:tc>
       </w:tr>
       <w:tr>
         <w:trPr>
-          <w:trHeight w:val="547" w:hRule="atLeast"/>
+          <w:trHeight w:val="403" w:hRule="atLeast"/>
         </w:trPr>
         <w:tc>
           <w:tcPr>
             <w:tcW w:type="dxa" w:w="936"/>
             <w:tcMar>
-              <w:top w:w="90" w:type="dxa"/>
-              <w:start w:w="130" w:type="dxa"/>
-              <w:bottom w:w="90" w:type="dxa"/>
-              <w:end w:w="130" w:type="dxa"/>
+              <w:top w:w="60" w:type="dxa"/>
+              <w:start w:w="95" w:type="dxa"/>
+              <w:bottom w:w="60" w:type="dxa"/>
+              <w:end w:w="95" w:type="dxa"/>
             </w:tcMar>
             <w:vAlign w:val="center"/>
           </w:tcPr>
@@ -2202,7 +1233,7 @@
                 <w:rFonts w:ascii="Calibri" w:hAnsi="Calibri" w:eastAsia="Microsoft YaHei"/>
                 <w:b w:val="0"/>
                 <w:color w:val="1F2933"/>
-                <w:sz w:val="20"/>
+                <w:sz w:val="18"/>
               </w:rPr>
               <w:t>□</w:t>
             </w:r>
@@ -2212,10 +1243,10 @@
           <w:tcPr>
             <w:tcW w:type="dxa" w:w="8424"/>
             <w:tcMar>
-              <w:top w:w="90" w:type="dxa"/>
-              <w:start w:w="130" w:type="dxa"/>
-              <w:bottom w:w="90" w:type="dxa"/>
-              <w:end w:w="130" w:type="dxa"/>
+              <w:top w:w="60" w:type="dxa"/>
+              <w:start w:w="95" w:type="dxa"/>
+              <w:bottom w:w="60" w:type="dxa"/>
+              <w:end w:w="95" w:type="dxa"/>
             </w:tcMar>
             <w:vAlign w:val="center"/>
           </w:tcPr>
@@ -2233,25 +1264,25 @@
                 <w:rFonts w:ascii="Calibri" w:hAnsi="Calibri" w:eastAsia="Microsoft YaHei"/>
                 <w:b w:val="0"/>
                 <w:color w:val="1F2933"/>
-                <w:sz w:val="20"/>
+                <w:sz w:val="18"/>
               </w:rPr>
-              <w:t>不将数据用于商业用途、产品训练、广告营销或与本申请无关的服务。</w:t>
+              <w:t>未经许可，不转让、共享、公开发布或上传数据。</w:t>
             </w:r>
           </w:p>
         </w:tc>
       </w:tr>
       <w:tr>
         <w:trPr>
-          <w:trHeight w:val="605" w:hRule="atLeast"/>
+          <w:trHeight w:val="403" w:hRule="atLeast"/>
         </w:trPr>
         <w:tc>
           <w:tcPr>
             <w:tcW w:type="dxa" w:w="936"/>
             <w:tcMar>
-              <w:top w:w="90" w:type="dxa"/>
-              <w:start w:w="130" w:type="dxa"/>
-              <w:bottom w:w="90" w:type="dxa"/>
-              <w:end w:w="130" w:type="dxa"/>
+              <w:top w:w="60" w:type="dxa"/>
+              <w:start w:w="95" w:type="dxa"/>
+              <w:bottom w:w="60" w:type="dxa"/>
+              <w:end w:w="95" w:type="dxa"/>
             </w:tcMar>
             <w:vAlign w:val="center"/>
           </w:tcPr>
@@ -2269,7 +1300,7 @@
                 <w:rFonts w:ascii="Calibri" w:hAnsi="Calibri" w:eastAsia="Microsoft YaHei"/>
                 <w:b w:val="0"/>
                 <w:color w:val="1F2933"/>
-                <w:sz w:val="20"/>
+                <w:sz w:val="18"/>
               </w:rPr>
               <w:t>□</w:t>
             </w:r>
@@ -2279,10 +1310,10 @@
           <w:tcPr>
             <w:tcW w:type="dxa" w:w="8424"/>
             <w:tcMar>
-              <w:top w:w="90" w:type="dxa"/>
-              <w:start w:w="130" w:type="dxa"/>
-              <w:bottom w:w="90" w:type="dxa"/>
-              <w:end w:w="130" w:type="dxa"/>
+              <w:top w:w="60" w:type="dxa"/>
+              <w:start w:w="95" w:type="dxa"/>
+              <w:bottom w:w="60" w:type="dxa"/>
+              <w:end w:w="95" w:type="dxa"/>
             </w:tcMar>
             <w:vAlign w:val="center"/>
           </w:tcPr>
@@ -2300,25 +1331,25 @@
                 <w:rFonts w:ascii="Calibri" w:hAnsi="Calibri" w:eastAsia="Microsoft YaHei"/>
                 <w:b w:val="0"/>
                 <w:color w:val="1F2933"/>
-                <w:sz w:val="20"/>
+                <w:sz w:val="18"/>
               </w:rPr>
-              <w:t>未经书面许可，不复制、转让、共享、公开发布或上传至第三方平台。</w:t>
+              <w:t>不尝试识别受试者身份，不与可识别个人信息关联。</w:t>
             </w:r>
           </w:p>
         </w:tc>
       </w:tr>
       <w:tr>
         <w:trPr>
-          <w:trHeight w:val="605" w:hRule="atLeast"/>
+          <w:trHeight w:val="432" w:hRule="atLeast"/>
         </w:trPr>
         <w:tc>
           <w:tcPr>
             <w:tcW w:type="dxa" w:w="936"/>
             <w:tcMar>
-              <w:top w:w="90" w:type="dxa"/>
-              <w:start w:w="130" w:type="dxa"/>
-              <w:bottom w:w="90" w:type="dxa"/>
-              <w:end w:w="130" w:type="dxa"/>
+              <w:top w:w="60" w:type="dxa"/>
+              <w:start w:w="95" w:type="dxa"/>
+              <w:bottom w:w="60" w:type="dxa"/>
+              <w:end w:w="95" w:type="dxa"/>
             </w:tcMar>
             <w:vAlign w:val="center"/>
           </w:tcPr>
@@ -2336,7 +1367,7 @@
                 <w:rFonts w:ascii="Calibri" w:hAnsi="Calibri" w:eastAsia="Microsoft YaHei"/>
                 <w:b w:val="0"/>
                 <w:color w:val="1F2933"/>
-                <w:sz w:val="20"/>
+                <w:sz w:val="18"/>
               </w:rPr>
               <w:t>□</w:t>
             </w:r>
@@ -2346,10 +1377,10 @@
           <w:tcPr>
             <w:tcW w:type="dxa" w:w="8424"/>
             <w:tcMar>
-              <w:top w:w="90" w:type="dxa"/>
-              <w:start w:w="130" w:type="dxa"/>
-              <w:bottom w:w="90" w:type="dxa"/>
-              <w:end w:w="130" w:type="dxa"/>
+              <w:top w:w="60" w:type="dxa"/>
+              <w:start w:w="95" w:type="dxa"/>
+              <w:bottom w:w="60" w:type="dxa"/>
+              <w:end w:w="95" w:type="dxa"/>
             </w:tcMar>
             <w:vAlign w:val="center"/>
           </w:tcPr>
@@ -2367,25 +1398,25 @@
                 <w:rFonts w:ascii="Calibri" w:hAnsi="Calibri" w:eastAsia="Microsoft YaHei"/>
                 <w:b w:val="0"/>
                 <w:color w:val="1F2933"/>
-                <w:sz w:val="20"/>
+                <w:sz w:val="18"/>
               </w:rPr>
-              <w:t>不尝试识别受试者身份，不将数据与可识别个人身份信息进行关联。</w:t>
+              <w:t>发表论文、报告、代码或展示材料时，按要求引用 HIED。</w:t>
             </w:r>
           </w:p>
         </w:tc>
       </w:tr>
       <w:tr>
         <w:trPr>
-          <w:trHeight w:val="605" w:hRule="atLeast"/>
+          <w:trHeight w:val="461" w:hRule="atLeast"/>
         </w:trPr>
         <w:tc>
           <w:tcPr>
             <w:tcW w:type="dxa" w:w="936"/>
             <w:tcMar>
-              <w:top w:w="90" w:type="dxa"/>
-              <w:start w:w="130" w:type="dxa"/>
-              <w:bottom w:w="90" w:type="dxa"/>
-              <w:end w:w="130" w:type="dxa"/>
+              <w:top w:w="60" w:type="dxa"/>
+              <w:start w:w="95" w:type="dxa"/>
+              <w:bottom w:w="60" w:type="dxa"/>
+              <w:end w:w="95" w:type="dxa"/>
             </w:tcMar>
             <w:vAlign w:val="center"/>
           </w:tcPr>
@@ -2403,7 +1434,7 @@
                 <w:rFonts w:ascii="Calibri" w:hAnsi="Calibri" w:eastAsia="Microsoft YaHei"/>
                 <w:b w:val="0"/>
                 <w:color w:val="1F2933"/>
-                <w:sz w:val="20"/>
+                <w:sz w:val="18"/>
               </w:rPr>
               <w:t>□</w:t>
             </w:r>
@@ -2413,10 +1444,10 @@
           <w:tcPr>
             <w:tcW w:type="dxa" w:w="8424"/>
             <w:tcMar>
-              <w:top w:w="90" w:type="dxa"/>
-              <w:start w:w="130" w:type="dxa"/>
-              <w:bottom w:w="90" w:type="dxa"/>
-              <w:end w:w="130" w:type="dxa"/>
+              <w:top w:w="60" w:type="dxa"/>
+              <w:start w:w="95" w:type="dxa"/>
+              <w:bottom w:w="60" w:type="dxa"/>
+              <w:end w:w="95" w:type="dxa"/>
             </w:tcMar>
             <w:vAlign w:val="center"/>
           </w:tcPr>
@@ -2434,221 +1465,15 @@
                 <w:rFonts w:ascii="Calibri" w:hAnsi="Calibri" w:eastAsia="Microsoft YaHei"/>
                 <w:b w:val="0"/>
                 <w:color w:val="1F2933"/>
-                <w:sz w:val="20"/>
+                <w:sz w:val="18"/>
               </w:rPr>
-              <w:t>数据仅由本表列明的授权成员接触，并存放于受控设备或受控服务器。</w:t>
-            </w:r>
-          </w:p>
-        </w:tc>
-      </w:tr>
-      <w:tr>
-        <w:trPr>
-          <w:trHeight w:val="691" w:hRule="atLeast"/>
-        </w:trPr>
-        <w:tc>
-          <w:tcPr>
-            <w:tcW w:type="dxa" w:w="936"/>
-            <w:tcMar>
-              <w:top w:w="90" w:type="dxa"/>
-              <w:start w:w="130" w:type="dxa"/>
-              <w:bottom w:w="90" w:type="dxa"/>
-              <w:end w:w="130" w:type="dxa"/>
-            </w:tcMar>
-            <w:vAlign w:val="center"/>
-          </w:tcPr>
-          <w:p>
-            <w:pPr>
-              <w:spacing w:before="0" w:after="0" w:line="259" w:lineRule="auto"/>
-            </w:pPr>
-            <w:r>
-              <w:rPr>
-                <w:rFonts w:ascii="Calibri" w:hAnsi="Calibri" w:eastAsia="Microsoft YaHei"/>
-              </w:rPr>
-            </w:r>
-            <w:r>
-              <w:rPr>
-                <w:rFonts w:ascii="Calibri" w:hAnsi="Calibri" w:eastAsia="Microsoft YaHei"/>
-                <w:b w:val="0"/>
-                <w:color w:val="1F2933"/>
-                <w:sz w:val="20"/>
-              </w:rPr>
-              <w:t>□</w:t>
-            </w:r>
-          </w:p>
-        </w:tc>
-        <w:tc>
-          <w:tcPr>
-            <w:tcW w:type="dxa" w:w="8424"/>
-            <w:tcMar>
-              <w:top w:w="90" w:type="dxa"/>
-              <w:start w:w="130" w:type="dxa"/>
-              <w:bottom w:w="90" w:type="dxa"/>
-              <w:end w:w="130" w:type="dxa"/>
-            </w:tcMar>
-            <w:vAlign w:val="center"/>
-          </w:tcPr>
-          <w:p>
-            <w:pPr>
-              <w:spacing w:before="0" w:after="0" w:line="259" w:lineRule="auto"/>
-            </w:pPr>
-            <w:r>
-              <w:rPr>
-                <w:rFonts w:ascii="Calibri" w:hAnsi="Calibri" w:eastAsia="Microsoft YaHei"/>
-              </w:rPr>
-            </w:r>
-            <w:r>
-              <w:rPr>
-                <w:rFonts w:ascii="Calibri" w:hAnsi="Calibri" w:eastAsia="Microsoft YaHei"/>
-                <w:b w:val="0"/>
-                <w:color w:val="1F2933"/>
-                <w:sz w:val="20"/>
-              </w:rPr>
-              <w:t>论文、预印本、报告、代码仓库或展示材料使用 HIED 时，按要求引用关联论文和数据说明。</w:t>
-            </w:r>
-          </w:p>
-        </w:tc>
-      </w:tr>
-      <w:tr>
-        <w:trPr>
-          <w:trHeight w:val="691" w:hRule="atLeast"/>
-        </w:trPr>
-        <w:tc>
-          <w:tcPr>
-            <w:tcW w:type="dxa" w:w="936"/>
-            <w:tcMar>
-              <w:top w:w="90" w:type="dxa"/>
-              <w:start w:w="130" w:type="dxa"/>
-              <w:bottom w:w="90" w:type="dxa"/>
-              <w:end w:w="130" w:type="dxa"/>
-            </w:tcMar>
-            <w:vAlign w:val="center"/>
-          </w:tcPr>
-          <w:p>
-            <w:pPr>
-              <w:spacing w:before="0" w:after="0" w:line="259" w:lineRule="auto"/>
-            </w:pPr>
-            <w:r>
-              <w:rPr>
-                <w:rFonts w:ascii="Calibri" w:hAnsi="Calibri" w:eastAsia="Microsoft YaHei"/>
-              </w:rPr>
-            </w:r>
-            <w:r>
-              <w:rPr>
-                <w:rFonts w:ascii="Calibri" w:hAnsi="Calibri" w:eastAsia="Microsoft YaHei"/>
-                <w:b w:val="0"/>
-                <w:color w:val="1F2933"/>
-                <w:sz w:val="20"/>
-              </w:rPr>
-              <w:t>□</w:t>
-            </w:r>
-          </w:p>
-        </w:tc>
-        <w:tc>
-          <w:tcPr>
-            <w:tcW w:type="dxa" w:w="8424"/>
-            <w:tcMar>
-              <w:top w:w="90" w:type="dxa"/>
-              <w:start w:w="130" w:type="dxa"/>
-              <w:bottom w:w="90" w:type="dxa"/>
-              <w:end w:w="130" w:type="dxa"/>
-            </w:tcMar>
-            <w:vAlign w:val="center"/>
-          </w:tcPr>
-          <w:p>
-            <w:pPr>
-              <w:spacing w:before="0" w:after="0" w:line="259" w:lineRule="auto"/>
-            </w:pPr>
-            <w:r>
-              <w:rPr>
-                <w:rFonts w:ascii="Calibri" w:hAnsi="Calibri" w:eastAsia="Microsoft YaHei"/>
-              </w:rPr>
-            </w:r>
-            <w:r>
-              <w:rPr>
-                <w:rFonts w:ascii="Calibri" w:hAnsi="Calibri" w:eastAsia="Microsoft YaHei"/>
-                <w:b w:val="0"/>
-                <w:color w:val="1F2933"/>
-                <w:sz w:val="20"/>
-              </w:rPr>
-              <w:t>研究范围、成员、保存地点或使用期限发生变化时，及时提交补充说明或重新申请。</w:t>
-            </w:r>
-          </w:p>
-        </w:tc>
-      </w:tr>
-      <w:tr>
-        <w:trPr>
-          <w:trHeight w:val="691" w:hRule="atLeast"/>
-        </w:trPr>
-        <w:tc>
-          <w:tcPr>
-            <w:tcW w:type="dxa" w:w="936"/>
-            <w:tcMar>
-              <w:top w:w="90" w:type="dxa"/>
-              <w:start w:w="130" w:type="dxa"/>
-              <w:bottom w:w="90" w:type="dxa"/>
-              <w:end w:w="130" w:type="dxa"/>
-            </w:tcMar>
-            <w:vAlign w:val="center"/>
-          </w:tcPr>
-          <w:p>
-            <w:pPr>
-              <w:spacing w:before="0" w:after="0" w:line="259" w:lineRule="auto"/>
-            </w:pPr>
-            <w:r>
-              <w:rPr>
-                <w:rFonts w:ascii="Calibri" w:hAnsi="Calibri" w:eastAsia="Microsoft YaHei"/>
-              </w:rPr>
-            </w:r>
-            <w:r>
-              <w:rPr>
-                <w:rFonts w:ascii="Calibri" w:hAnsi="Calibri" w:eastAsia="Microsoft YaHei"/>
-                <w:b w:val="0"/>
-                <w:color w:val="1F2933"/>
-                <w:sz w:val="20"/>
-              </w:rPr>
-              <w:t>□</w:t>
-            </w:r>
-          </w:p>
-        </w:tc>
-        <w:tc>
-          <w:tcPr>
-            <w:tcW w:type="dxa" w:w="8424"/>
-            <w:tcMar>
-              <w:top w:w="90" w:type="dxa"/>
-              <w:start w:w="130" w:type="dxa"/>
-              <w:bottom w:w="90" w:type="dxa"/>
-              <w:end w:w="130" w:type="dxa"/>
-            </w:tcMar>
-            <w:vAlign w:val="center"/>
-          </w:tcPr>
-          <w:p>
-            <w:pPr>
-              <w:spacing w:before="0" w:after="0" w:line="259" w:lineRule="auto"/>
-            </w:pPr>
-            <w:r>
-              <w:rPr>
-                <w:rFonts w:ascii="Calibri" w:hAnsi="Calibri" w:eastAsia="Microsoft YaHei"/>
-              </w:rPr>
-            </w:r>
-            <w:r>
-              <w:rPr>
-                <w:rFonts w:ascii="Calibri" w:hAnsi="Calibri" w:eastAsia="Microsoft YaHei"/>
-                <w:b w:val="0"/>
-                <w:color w:val="1F2933"/>
-                <w:sz w:val="20"/>
-              </w:rPr>
-              <w:t>使用期满或收到管理方书面要求后，按要求删除、归档或停止使用数据副本。</w:t>
+              <w:t>研究结束或收到管理方要求后，停止使用或删除数据副本。</w:t>
             </w:r>
           </w:p>
         </w:tc>
       </w:tr>
     </w:tbl>
     <w:p/>
-    <w:p>
-      <w:r>
-        <w:br w:type="page"/>
-      </w:r>
-    </w:p>
     <w:p>
       <w:pPr>
         <w:pStyle w:val="Heading1"/>
@@ -2657,941 +1482,95 @@
         <w:rPr>
           <w:rFonts w:ascii="Calibri" w:hAnsi="Calibri" w:eastAsia="Microsoft YaHei"/>
         </w:rPr>
-        <w:t>五、签字确认</w:t>
-      </w:r>
-    </w:p>
-    <w:tbl>
-      <w:tblPr>
-        <w:tblW w:type="dxa" w:w="9360"/>
-        <w:jc w:val="left"/>
-        <w:tblLayout w:type="fixed"/>
-        <w:tblLook w:firstColumn="1" w:firstRow="1" w:lastColumn="0" w:lastRow="0" w:noHBand="0" w:noVBand="1" w:val="04A0"/>
-        <w:tblInd w:w="120" w:type="dxa"/>
-        <w:tblBorders>
-          <w:top w:val="single" w:sz="6" w:space="0" w:color="C9D0D6"/>
-          <w:left w:val="single" w:sz="6" w:space="0" w:color="C9D0D6"/>
-          <w:bottom w:val="single" w:sz="6" w:space="0" w:color="C9D0D6"/>
-          <w:right w:val="single" w:sz="6" w:space="0" w:color="C9D0D6"/>
-          <w:insideH w:val="single" w:sz="6" w:space="0" w:color="C9D0D6"/>
-          <w:insideV w:val="single" w:sz="6" w:space="0" w:color="C9D0D6"/>
-        </w:tblBorders>
-      </w:tblPr>
-      <w:tblGrid>
-        <w:gridCol w:w="2664"/>
-        <w:gridCol w:w="4536"/>
-        <w:gridCol w:w="2160"/>
-      </w:tblGrid>
-      <w:tr>
-        <w:trPr>
-          <w:trHeight w:val="518" w:hRule="atLeast"/>
-        </w:trPr>
-        <w:tc>
-          <w:tcPr>
-            <w:tcW w:type="dxa" w:w="2664"/>
-            <w:shd w:fill="F5E9EA"/>
-            <w:tcMar>
-              <w:top w:w="90" w:type="dxa"/>
-              <w:start w:w="130" w:type="dxa"/>
-              <w:bottom w:w="90" w:type="dxa"/>
-              <w:end w:w="130" w:type="dxa"/>
-            </w:tcMar>
-            <w:vAlign w:val="center"/>
-          </w:tcPr>
-          <w:p>
-            <w:pPr>
-              <w:spacing w:before="0" w:after="0" w:line="259" w:lineRule="auto"/>
-              <w:jc w:val="center"/>
-            </w:pPr>
-            <w:r>
-              <w:rPr>
-                <w:rFonts w:ascii="Calibri" w:hAnsi="Calibri" w:eastAsia="Microsoft YaHei"/>
-              </w:rPr>
-            </w:r>
-            <w:r>
-              <w:rPr>
-                <w:rFonts w:ascii="Calibri" w:hAnsi="Calibri" w:eastAsia="Microsoft YaHei"/>
-                <w:b/>
-                <w:color w:val="4B1117"/>
-                <w:sz w:val="20"/>
-              </w:rPr>
-              <w:t>签署项</w:t>
-            </w:r>
-          </w:p>
-        </w:tc>
-        <w:tc>
-          <w:tcPr>
-            <w:tcW w:type="dxa" w:w="4536"/>
-            <w:shd w:fill="F5E9EA"/>
-            <w:tcMar>
-              <w:top w:w="90" w:type="dxa"/>
-              <w:start w:w="130" w:type="dxa"/>
-              <w:bottom w:w="90" w:type="dxa"/>
-              <w:end w:w="130" w:type="dxa"/>
-            </w:tcMar>
-            <w:vAlign w:val="center"/>
-          </w:tcPr>
-          <w:p>
-            <w:pPr>
-              <w:spacing w:before="0" w:after="0" w:line="259" w:lineRule="auto"/>
-            </w:pPr>
-            <w:r>
-              <w:rPr>
-                <w:rFonts w:ascii="Calibri" w:hAnsi="Calibri" w:eastAsia="Microsoft YaHei"/>
-              </w:rPr>
-            </w:r>
-            <w:r>
-              <w:rPr>
-                <w:rFonts w:ascii="Calibri" w:hAnsi="Calibri" w:eastAsia="Microsoft YaHei"/>
-                <w:b/>
-                <w:color w:val="4B1117"/>
-                <w:sz w:val="20"/>
-              </w:rPr>
-              <w:t>签名/盖章</w:t>
-            </w:r>
-          </w:p>
-        </w:tc>
-        <w:tc>
-          <w:tcPr>
-            <w:tcW w:type="dxa" w:w="2160"/>
-            <w:shd w:fill="F5E9EA"/>
-            <w:tcMar>
-              <w:top w:w="90" w:type="dxa"/>
-              <w:start w:w="130" w:type="dxa"/>
-              <w:bottom w:w="90" w:type="dxa"/>
-              <w:end w:w="130" w:type="dxa"/>
-            </w:tcMar>
-            <w:vAlign w:val="center"/>
-          </w:tcPr>
-          <w:p>
-            <w:pPr>
-              <w:spacing w:before="0" w:after="0" w:line="259" w:lineRule="auto"/>
-            </w:pPr>
-            <w:r>
-              <w:rPr>
-                <w:rFonts w:ascii="Calibri" w:hAnsi="Calibri" w:eastAsia="Microsoft YaHei"/>
-              </w:rPr>
-            </w:r>
-            <w:r>
-              <w:rPr>
-                <w:rFonts w:ascii="Calibri" w:hAnsi="Calibri" w:eastAsia="Microsoft YaHei"/>
-                <w:b/>
-                <w:color w:val="4B1117"/>
-                <w:sz w:val="20"/>
-              </w:rPr>
-              <w:t>日期</w:t>
-            </w:r>
-          </w:p>
-        </w:tc>
-      </w:tr>
-      <w:tr>
-        <w:trPr>
-          <w:trHeight w:val="792" w:hRule="atLeast"/>
-        </w:trPr>
-        <w:tc>
-          <w:tcPr>
-            <w:tcW w:type="dxa" w:w="2664"/>
-            <w:tcMar>
-              <w:top w:w="90" w:type="dxa"/>
-              <w:start w:w="130" w:type="dxa"/>
-              <w:bottom w:w="90" w:type="dxa"/>
-              <w:end w:w="130" w:type="dxa"/>
-            </w:tcMar>
-            <w:vAlign w:val="center"/>
-          </w:tcPr>
-          <w:p>
-            <w:pPr>
-              <w:spacing w:before="0" w:after="0" w:line="259" w:lineRule="auto"/>
-            </w:pPr>
-            <w:r>
-              <w:rPr>
-                <w:rFonts w:ascii="Calibri" w:hAnsi="Calibri" w:eastAsia="Microsoft YaHei"/>
-              </w:rPr>
-            </w:r>
-            <w:r>
-              <w:rPr>
-                <w:rFonts w:ascii="Calibri" w:hAnsi="Calibri" w:eastAsia="Microsoft YaHei"/>
-                <w:b w:val="0"/>
-                <w:color w:val="1F2933"/>
-                <w:sz w:val="20"/>
-              </w:rPr>
-              <w:t>申请人</w:t>
-            </w:r>
-          </w:p>
-        </w:tc>
-        <w:tc>
-          <w:tcPr>
-            <w:tcW w:type="dxa" w:w="4536"/>
-            <w:tcMar>
-              <w:top w:w="90" w:type="dxa"/>
-              <w:start w:w="130" w:type="dxa"/>
-              <w:bottom w:w="90" w:type="dxa"/>
-              <w:end w:w="130" w:type="dxa"/>
-            </w:tcMar>
-            <w:vAlign w:val="center"/>
-          </w:tcPr>
-          <w:p>
-            <w:pPr>
-              <w:spacing w:before="0" w:after="0" w:line="259" w:lineRule="auto"/>
-            </w:pPr>
-            <w:r>
-              <w:rPr>
-                <w:rFonts w:ascii="Calibri" w:hAnsi="Calibri" w:eastAsia="Microsoft YaHei"/>
-              </w:rPr>
-            </w:r>
-            <w:r>
-              <w:rPr>
-                <w:rFonts w:ascii="Calibri" w:hAnsi="Calibri" w:eastAsia="Microsoft YaHei"/>
-                <w:b w:val="0"/>
-                <w:color w:val="1F2933"/>
-                <w:sz w:val="20"/>
-              </w:rPr>
-              <w:t xml:space="preserve"> </w:t>
-            </w:r>
-          </w:p>
-        </w:tc>
-        <w:tc>
-          <w:tcPr>
-            <w:tcW w:type="dxa" w:w="2160"/>
-            <w:tcMar>
-              <w:top w:w="90" w:type="dxa"/>
-              <w:start w:w="130" w:type="dxa"/>
-              <w:bottom w:w="90" w:type="dxa"/>
-              <w:end w:w="130" w:type="dxa"/>
-            </w:tcMar>
-            <w:vAlign w:val="center"/>
-          </w:tcPr>
-          <w:p>
-            <w:pPr>
-              <w:spacing w:before="0" w:after="0" w:line="259" w:lineRule="auto"/>
-            </w:pPr>
-            <w:r>
-              <w:rPr>
-                <w:rFonts w:ascii="Calibri" w:hAnsi="Calibri" w:eastAsia="Microsoft YaHei"/>
-              </w:rPr>
-            </w:r>
-            <w:r>
-              <w:rPr>
-                <w:rFonts w:ascii="Calibri" w:hAnsi="Calibri" w:eastAsia="Microsoft YaHei"/>
-                <w:b w:val="0"/>
-                <w:color w:val="1F2933"/>
-                <w:sz w:val="20"/>
-              </w:rPr>
-              <w:t xml:space="preserve">        年    月    日</w:t>
-            </w:r>
-          </w:p>
-        </w:tc>
-      </w:tr>
-      <w:tr>
-        <w:trPr>
-          <w:trHeight w:val="792" w:hRule="atLeast"/>
-        </w:trPr>
-        <w:tc>
-          <w:tcPr>
-            <w:tcW w:type="dxa" w:w="2664"/>
-            <w:tcMar>
-              <w:top w:w="90" w:type="dxa"/>
-              <w:start w:w="130" w:type="dxa"/>
-              <w:bottom w:w="90" w:type="dxa"/>
-              <w:end w:w="130" w:type="dxa"/>
-            </w:tcMar>
-            <w:vAlign w:val="center"/>
-          </w:tcPr>
-          <w:p>
-            <w:pPr>
-              <w:spacing w:before="0" w:after="0" w:line="259" w:lineRule="auto"/>
-            </w:pPr>
-            <w:r>
-              <w:rPr>
-                <w:rFonts w:ascii="Calibri" w:hAnsi="Calibri" w:eastAsia="Microsoft YaHei"/>
-              </w:rPr>
-            </w:r>
-            <w:r>
-              <w:rPr>
-                <w:rFonts w:ascii="Calibri" w:hAnsi="Calibri" w:eastAsia="Microsoft YaHei"/>
-                <w:b w:val="0"/>
-                <w:color w:val="1F2933"/>
-                <w:sz w:val="20"/>
-              </w:rPr>
-              <w:t>课题负责人/导师</w:t>
-            </w:r>
-          </w:p>
-        </w:tc>
-        <w:tc>
-          <w:tcPr>
-            <w:tcW w:type="dxa" w:w="4536"/>
-            <w:tcMar>
-              <w:top w:w="90" w:type="dxa"/>
-              <w:start w:w="130" w:type="dxa"/>
-              <w:bottom w:w="90" w:type="dxa"/>
-              <w:end w:w="130" w:type="dxa"/>
-            </w:tcMar>
-            <w:vAlign w:val="center"/>
-          </w:tcPr>
-          <w:p>
-            <w:pPr>
-              <w:spacing w:before="0" w:after="0" w:line="259" w:lineRule="auto"/>
-            </w:pPr>
-            <w:r>
-              <w:rPr>
-                <w:rFonts w:ascii="Calibri" w:hAnsi="Calibri" w:eastAsia="Microsoft YaHei"/>
-              </w:rPr>
-            </w:r>
-            <w:r>
-              <w:rPr>
-                <w:rFonts w:ascii="Calibri" w:hAnsi="Calibri" w:eastAsia="Microsoft YaHei"/>
-                <w:b w:val="0"/>
-                <w:color w:val="1F2933"/>
-                <w:sz w:val="20"/>
-              </w:rPr>
-              <w:t xml:space="preserve"> </w:t>
-            </w:r>
-          </w:p>
-        </w:tc>
-        <w:tc>
-          <w:tcPr>
-            <w:tcW w:type="dxa" w:w="2160"/>
-            <w:tcMar>
-              <w:top w:w="90" w:type="dxa"/>
-              <w:start w:w="130" w:type="dxa"/>
-              <w:bottom w:w="90" w:type="dxa"/>
-              <w:end w:w="130" w:type="dxa"/>
-            </w:tcMar>
-            <w:vAlign w:val="center"/>
-          </w:tcPr>
-          <w:p>
-            <w:pPr>
-              <w:spacing w:before="0" w:after="0" w:line="259" w:lineRule="auto"/>
-            </w:pPr>
-            <w:r>
-              <w:rPr>
-                <w:rFonts w:ascii="Calibri" w:hAnsi="Calibri" w:eastAsia="Microsoft YaHei"/>
-              </w:rPr>
-            </w:r>
-            <w:r>
-              <w:rPr>
-                <w:rFonts w:ascii="Calibri" w:hAnsi="Calibri" w:eastAsia="Microsoft YaHei"/>
-                <w:b w:val="0"/>
-                <w:color w:val="1F2933"/>
-                <w:sz w:val="20"/>
-              </w:rPr>
-              <w:t xml:space="preserve">        年    月    日</w:t>
-            </w:r>
-          </w:p>
-        </w:tc>
-      </w:tr>
-      <w:tr>
-        <w:trPr>
-          <w:trHeight w:val="936" w:hRule="atLeast"/>
-        </w:trPr>
-        <w:tc>
-          <w:tcPr>
-            <w:tcW w:type="dxa" w:w="2664"/>
-            <w:tcMar>
-              <w:top w:w="90" w:type="dxa"/>
-              <w:start w:w="130" w:type="dxa"/>
-              <w:bottom w:w="90" w:type="dxa"/>
-              <w:end w:w="130" w:type="dxa"/>
-            </w:tcMar>
-            <w:vAlign w:val="center"/>
-          </w:tcPr>
-          <w:p>
-            <w:pPr>
-              <w:spacing w:before="0" w:after="0" w:line="259" w:lineRule="auto"/>
-            </w:pPr>
-            <w:r>
-              <w:rPr>
-                <w:rFonts w:ascii="Calibri" w:hAnsi="Calibri" w:eastAsia="Microsoft YaHei"/>
-              </w:rPr>
-            </w:r>
-            <w:r>
-              <w:rPr>
-                <w:rFonts w:ascii="Calibri" w:hAnsi="Calibri" w:eastAsia="Microsoft YaHei"/>
-                <w:b w:val="0"/>
-                <w:color w:val="1F2933"/>
-                <w:sz w:val="20"/>
-              </w:rPr>
-              <w:t>所在单位/部门意见（如需）</w:t>
-            </w:r>
-          </w:p>
-        </w:tc>
-        <w:tc>
-          <w:tcPr>
-            <w:tcW w:type="dxa" w:w="4536"/>
-            <w:tcMar>
-              <w:top w:w="90" w:type="dxa"/>
-              <w:start w:w="130" w:type="dxa"/>
-              <w:bottom w:w="90" w:type="dxa"/>
-              <w:end w:w="130" w:type="dxa"/>
-            </w:tcMar>
-            <w:vAlign w:val="center"/>
-          </w:tcPr>
-          <w:p>
-            <w:pPr>
-              <w:spacing w:before="0" w:after="0" w:line="259" w:lineRule="auto"/>
-            </w:pPr>
-            <w:r>
-              <w:rPr>
-                <w:rFonts w:ascii="Calibri" w:hAnsi="Calibri" w:eastAsia="Microsoft YaHei"/>
-              </w:rPr>
-            </w:r>
-            <w:r>
-              <w:rPr>
-                <w:rFonts w:ascii="Calibri" w:hAnsi="Calibri" w:eastAsia="Microsoft YaHei"/>
-                <w:b w:val="0"/>
-                <w:color w:val="1F2933"/>
-                <w:sz w:val="20"/>
-              </w:rPr>
-              <w:t xml:space="preserve"> </w:t>
-            </w:r>
-          </w:p>
-        </w:tc>
-        <w:tc>
-          <w:tcPr>
-            <w:tcW w:type="dxa" w:w="2160"/>
-            <w:tcMar>
-              <w:top w:w="90" w:type="dxa"/>
-              <w:start w:w="130" w:type="dxa"/>
-              <w:bottom w:w="90" w:type="dxa"/>
-              <w:end w:w="130" w:type="dxa"/>
-            </w:tcMar>
-            <w:vAlign w:val="center"/>
-          </w:tcPr>
-          <w:p>
-            <w:pPr>
-              <w:spacing w:before="0" w:after="0" w:line="259" w:lineRule="auto"/>
-            </w:pPr>
-            <w:r>
-              <w:rPr>
-                <w:rFonts w:ascii="Calibri" w:hAnsi="Calibri" w:eastAsia="Microsoft YaHei"/>
-              </w:rPr>
-            </w:r>
-            <w:r>
-              <w:rPr>
-                <w:rFonts w:ascii="Calibri" w:hAnsi="Calibri" w:eastAsia="Microsoft YaHei"/>
-                <w:b w:val="0"/>
-                <w:color w:val="1F2933"/>
-                <w:sz w:val="20"/>
-              </w:rPr>
-              <w:t xml:space="preserve">        年    月    日</w:t>
-            </w:r>
-          </w:p>
-        </w:tc>
-      </w:tr>
-    </w:tbl>
-    <w:p/>
-    <w:p>
-      <w:r>
-        <w:br w:type="page"/>
+        <w:t>四、签字确认</w:t>
       </w:r>
     </w:p>
     <w:p>
       <w:pPr>
-        <w:pStyle w:val="Heading1"/>
+        <w:spacing w:before="0" w:after="40" w:line="240" w:lineRule="auto"/>
       </w:pPr>
       <w:r>
         <w:rPr>
           <w:rFonts w:ascii="Calibri" w:hAnsi="Calibri" w:eastAsia="Microsoft YaHei"/>
+          <w:b/>
+          <w:color w:val="1F2933"/>
+          <w:sz w:val="18"/>
         </w:rPr>
-        <w:t>六、审核意见</w:t>
+        <w:t>申请人签名：</w:t>
+      </w:r>
+      <w:r>
+        <w:rPr>
+          <w:rFonts w:ascii="Calibri" w:hAnsi="Calibri" w:eastAsia="Microsoft YaHei"/>
+          <w:b w:val="0"/>
+          <w:color w:val="1F2933"/>
+          <w:sz w:val="18"/>
+        </w:rPr>
+        <w:t>____________________________</w:t>
+      </w:r>
+      <w:r>
+        <w:rPr>
+          <w:rFonts w:ascii="Calibri" w:hAnsi="Calibri" w:eastAsia="Microsoft YaHei"/>
+          <w:b/>
+          <w:color w:val="1F2933"/>
+          <w:sz w:val="18"/>
+        </w:rPr>
+        <w:t xml:space="preserve">    日期：</w:t>
+      </w:r>
+      <w:r>
+        <w:rPr>
+          <w:rFonts w:ascii="Calibri" w:hAnsi="Calibri" w:eastAsia="Microsoft YaHei"/>
+          <w:b w:val="0"/>
+          <w:color w:val="1F2933"/>
+          <w:sz w:val="18"/>
+        </w:rPr>
+        <w:t>________________</w:t>
       </w:r>
     </w:p>
-    <w:tbl>
-      <w:tblPr>
-        <w:tblW w:type="dxa" w:w="9360"/>
-        <w:jc w:val="left"/>
-        <w:tblLayout w:type="fixed"/>
-        <w:tblLook w:firstColumn="1" w:firstRow="1" w:lastColumn="0" w:lastRow="0" w:noHBand="0" w:noVBand="1" w:val="04A0"/>
-        <w:tblInd w:w="120" w:type="dxa"/>
-        <w:tblBorders>
-          <w:top w:val="single" w:sz="6" w:space="0" w:color="C9D0D6"/>
-          <w:left w:val="single" w:sz="6" w:space="0" w:color="C9D0D6"/>
-          <w:bottom w:val="single" w:sz="6" w:space="0" w:color="C9D0D6"/>
-          <w:right w:val="single" w:sz="6" w:space="0" w:color="C9D0D6"/>
-          <w:insideH w:val="single" w:sz="6" w:space="0" w:color="C9D0D6"/>
-          <w:insideV w:val="single" w:sz="6" w:space="0" w:color="C9D0D6"/>
-        </w:tblBorders>
-      </w:tblPr>
-      <w:tblGrid>
-        <w:gridCol w:w="2448"/>
-        <w:gridCol w:w="6912"/>
-      </w:tblGrid>
-      <w:tr>
-        <w:trPr>
-          <w:trHeight w:val="518" w:hRule="atLeast"/>
-        </w:trPr>
-        <w:tc>
-          <w:tcPr>
-            <w:tcW w:type="dxa" w:w="2448"/>
-            <w:shd w:fill="F5E9EA"/>
-            <w:tcMar>
-              <w:top w:w="90" w:type="dxa"/>
-              <w:start w:w="130" w:type="dxa"/>
-              <w:bottom w:w="90" w:type="dxa"/>
-              <w:end w:w="130" w:type="dxa"/>
-            </w:tcMar>
-            <w:vAlign w:val="center"/>
-          </w:tcPr>
-          <w:p>
-            <w:pPr>
-              <w:spacing w:before="0" w:after="0" w:line="259" w:lineRule="auto"/>
-            </w:pPr>
-            <w:r>
-              <w:rPr>
-                <w:rFonts w:ascii="Calibri" w:hAnsi="Calibri" w:eastAsia="Microsoft YaHei"/>
-              </w:rPr>
-            </w:r>
-            <w:r>
-              <w:rPr>
-                <w:rFonts w:ascii="Calibri" w:hAnsi="Calibri" w:eastAsia="Microsoft YaHei"/>
-                <w:b/>
-                <w:color w:val="4B1117"/>
-                <w:sz w:val="20"/>
-              </w:rPr>
-              <w:t>审核字段</w:t>
-            </w:r>
-          </w:p>
-        </w:tc>
-        <w:tc>
-          <w:tcPr>
-            <w:tcW w:type="dxa" w:w="6912"/>
-            <w:shd w:fill="F5E9EA"/>
-            <w:tcMar>
-              <w:top w:w="90" w:type="dxa"/>
-              <w:start w:w="130" w:type="dxa"/>
-              <w:bottom w:w="90" w:type="dxa"/>
-              <w:end w:w="130" w:type="dxa"/>
-            </w:tcMar>
-            <w:vAlign w:val="center"/>
-          </w:tcPr>
-          <w:p>
-            <w:pPr>
-              <w:spacing w:before="0" w:after="0" w:line="259" w:lineRule="auto"/>
-            </w:pPr>
-            <w:r>
-              <w:rPr>
-                <w:rFonts w:ascii="Calibri" w:hAnsi="Calibri" w:eastAsia="Microsoft YaHei"/>
-              </w:rPr>
-            </w:r>
-            <w:r>
-              <w:rPr>
-                <w:rFonts w:ascii="Calibri" w:hAnsi="Calibri" w:eastAsia="Microsoft YaHei"/>
-                <w:b/>
-                <w:color w:val="4B1117"/>
-                <w:sz w:val="20"/>
-              </w:rPr>
-              <w:t>填写内容</w:t>
-            </w:r>
-          </w:p>
-        </w:tc>
-      </w:tr>
-      <w:tr>
-        <w:trPr>
-          <w:trHeight w:val="576" w:hRule="atLeast"/>
-        </w:trPr>
-        <w:tc>
-          <w:tcPr>
-            <w:tcW w:type="dxa" w:w="2448"/>
-            <w:tcMar>
-              <w:top w:w="90" w:type="dxa"/>
-              <w:start w:w="130" w:type="dxa"/>
-              <w:bottom w:w="90" w:type="dxa"/>
-              <w:end w:w="130" w:type="dxa"/>
-            </w:tcMar>
-            <w:vAlign w:val="center"/>
-          </w:tcPr>
-          <w:p>
-            <w:pPr>
-              <w:spacing w:before="0" w:after="0" w:line="259" w:lineRule="auto"/>
-            </w:pPr>
-            <w:r>
-              <w:rPr>
-                <w:rFonts w:ascii="Calibri" w:hAnsi="Calibri" w:eastAsia="Microsoft YaHei"/>
-              </w:rPr>
-            </w:r>
-            <w:r>
-              <w:rPr>
-                <w:rFonts w:ascii="Calibri" w:hAnsi="Calibri" w:eastAsia="Microsoft YaHei"/>
-                <w:b w:val="0"/>
-                <w:color w:val="1F2933"/>
-                <w:sz w:val="20"/>
-              </w:rPr>
-              <w:t>审核结果</w:t>
-            </w:r>
-          </w:p>
-        </w:tc>
-        <w:tc>
-          <w:tcPr>
-            <w:tcW w:type="dxa" w:w="6912"/>
-            <w:tcMar>
-              <w:top w:w="90" w:type="dxa"/>
-              <w:start w:w="130" w:type="dxa"/>
-              <w:bottom w:w="90" w:type="dxa"/>
-              <w:end w:w="130" w:type="dxa"/>
-            </w:tcMar>
-            <w:vAlign w:val="center"/>
-          </w:tcPr>
-          <w:p>
-            <w:pPr>
-              <w:spacing w:before="0" w:after="0" w:line="259" w:lineRule="auto"/>
-            </w:pPr>
-            <w:r>
-              <w:rPr>
-                <w:rFonts w:ascii="Calibri" w:hAnsi="Calibri" w:eastAsia="Microsoft YaHei"/>
-              </w:rPr>
-            </w:r>
-            <w:r>
-              <w:rPr>
-                <w:rFonts w:ascii="Calibri" w:hAnsi="Calibri" w:eastAsia="Microsoft YaHei"/>
-                <w:b w:val="0"/>
-                <w:color w:val="1F2933"/>
-                <w:sz w:val="20"/>
-              </w:rPr>
-              <w:t>□ 同意提供  □ 需补充材料  □ 不予提供</w:t>
-            </w:r>
-          </w:p>
-        </w:tc>
-      </w:tr>
-      <w:tr>
-        <w:trPr>
-          <w:trHeight w:val="792" w:hRule="atLeast"/>
-        </w:trPr>
-        <w:tc>
-          <w:tcPr>
-            <w:tcW w:type="dxa" w:w="2448"/>
-            <w:tcMar>
-              <w:top w:w="90" w:type="dxa"/>
-              <w:start w:w="130" w:type="dxa"/>
-              <w:bottom w:w="90" w:type="dxa"/>
-              <w:end w:w="130" w:type="dxa"/>
-            </w:tcMar>
-            <w:vAlign w:val="center"/>
-          </w:tcPr>
-          <w:p>
-            <w:pPr>
-              <w:spacing w:before="0" w:after="0" w:line="259" w:lineRule="auto"/>
-            </w:pPr>
-            <w:r>
-              <w:rPr>
-                <w:rFonts w:ascii="Calibri" w:hAnsi="Calibri" w:eastAsia="Microsoft YaHei"/>
-              </w:rPr>
-            </w:r>
-            <w:r>
-              <w:rPr>
-                <w:rFonts w:ascii="Calibri" w:hAnsi="Calibri" w:eastAsia="Microsoft YaHei"/>
-                <w:b w:val="0"/>
-                <w:color w:val="1F2933"/>
-                <w:sz w:val="20"/>
-              </w:rPr>
-              <w:t>批准数据范围</w:t>
-            </w:r>
-          </w:p>
-        </w:tc>
-        <w:tc>
-          <w:tcPr>
-            <w:tcW w:type="dxa" w:w="6912"/>
-            <w:tcMar>
-              <w:top w:w="90" w:type="dxa"/>
-              <w:start w:w="130" w:type="dxa"/>
-              <w:bottom w:w="90" w:type="dxa"/>
-              <w:end w:w="130" w:type="dxa"/>
-            </w:tcMar>
-            <w:vAlign w:val="center"/>
-          </w:tcPr>
-          <w:p>
-            <w:pPr>
-              <w:spacing w:before="0" w:after="0" w:line="259" w:lineRule="auto"/>
-            </w:pPr>
-            <w:r>
-              <w:rPr>
-                <w:rFonts w:ascii="Calibri" w:hAnsi="Calibri" w:eastAsia="Microsoft YaHei"/>
-              </w:rPr>
-            </w:r>
-            <w:r>
-              <w:rPr>
-                <w:rFonts w:ascii="Calibri" w:hAnsi="Calibri" w:eastAsia="Microsoft YaHei"/>
-                <w:b w:val="0"/>
-                <w:color w:val="1F2933"/>
-                <w:sz w:val="20"/>
-              </w:rPr>
-              <w:t xml:space="preserve"> </w:t>
-            </w:r>
-          </w:p>
-        </w:tc>
-      </w:tr>
-      <w:tr>
-        <w:trPr>
-          <w:trHeight w:val="576" w:hRule="atLeast"/>
-        </w:trPr>
-        <w:tc>
-          <w:tcPr>
-            <w:tcW w:type="dxa" w:w="2448"/>
-            <w:tcMar>
-              <w:top w:w="90" w:type="dxa"/>
-              <w:start w:w="130" w:type="dxa"/>
-              <w:bottom w:w="90" w:type="dxa"/>
-              <w:end w:w="130" w:type="dxa"/>
-            </w:tcMar>
-            <w:vAlign w:val="center"/>
-          </w:tcPr>
-          <w:p>
-            <w:pPr>
-              <w:spacing w:before="0" w:after="0" w:line="259" w:lineRule="auto"/>
-            </w:pPr>
-            <w:r>
-              <w:rPr>
-                <w:rFonts w:ascii="Calibri" w:hAnsi="Calibri" w:eastAsia="Microsoft YaHei"/>
-              </w:rPr>
-            </w:r>
-            <w:r>
-              <w:rPr>
-                <w:rFonts w:ascii="Calibri" w:hAnsi="Calibri" w:eastAsia="Microsoft YaHei"/>
-                <w:b w:val="0"/>
-                <w:color w:val="1F2933"/>
-                <w:sz w:val="20"/>
-              </w:rPr>
-              <w:t>数据使用期限</w:t>
-            </w:r>
-          </w:p>
-        </w:tc>
-        <w:tc>
-          <w:tcPr>
-            <w:tcW w:type="dxa" w:w="6912"/>
-            <w:tcMar>
-              <w:top w:w="90" w:type="dxa"/>
-              <w:start w:w="130" w:type="dxa"/>
-              <w:bottom w:w="90" w:type="dxa"/>
-              <w:end w:w="130" w:type="dxa"/>
-            </w:tcMar>
-            <w:vAlign w:val="center"/>
-          </w:tcPr>
-          <w:p>
-            <w:pPr>
-              <w:spacing w:before="0" w:after="0" w:line="259" w:lineRule="auto"/>
-            </w:pPr>
-            <w:r>
-              <w:rPr>
-                <w:rFonts w:ascii="Calibri" w:hAnsi="Calibri" w:eastAsia="Microsoft YaHei"/>
-              </w:rPr>
-            </w:r>
-            <w:r>
-              <w:rPr>
-                <w:rFonts w:ascii="Calibri" w:hAnsi="Calibri" w:eastAsia="Microsoft YaHei"/>
-                <w:b w:val="0"/>
-                <w:color w:val="1F2933"/>
-                <w:sz w:val="20"/>
-              </w:rPr>
-              <w:t>自        年    月    日  至        年    月    日</w:t>
-            </w:r>
-          </w:p>
-        </w:tc>
-      </w:tr>
-      <w:tr>
-        <w:trPr>
-          <w:trHeight w:val="1296" w:hRule="atLeast"/>
-        </w:trPr>
-        <w:tc>
-          <w:tcPr>
-            <w:tcW w:type="dxa" w:w="2448"/>
-            <w:tcMar>
-              <w:top w:w="90" w:type="dxa"/>
-              <w:start w:w="130" w:type="dxa"/>
-              <w:bottom w:w="90" w:type="dxa"/>
-              <w:end w:w="130" w:type="dxa"/>
-            </w:tcMar>
-            <w:vAlign w:val="center"/>
-          </w:tcPr>
-          <w:p>
-            <w:pPr>
-              <w:spacing w:before="0" w:after="0" w:line="259" w:lineRule="auto"/>
-            </w:pPr>
-            <w:r>
-              <w:rPr>
-                <w:rFonts w:ascii="Calibri" w:hAnsi="Calibri" w:eastAsia="Microsoft YaHei"/>
-              </w:rPr>
-            </w:r>
-            <w:r>
-              <w:rPr>
-                <w:rFonts w:ascii="Calibri" w:hAnsi="Calibri" w:eastAsia="Microsoft YaHei"/>
-                <w:b w:val="0"/>
-                <w:color w:val="1F2933"/>
-                <w:sz w:val="20"/>
-              </w:rPr>
-              <w:t>审核意见</w:t>
-            </w:r>
-          </w:p>
-        </w:tc>
-        <w:tc>
-          <w:tcPr>
-            <w:tcW w:type="dxa" w:w="6912"/>
-            <w:tcMar>
-              <w:top w:w="90" w:type="dxa"/>
-              <w:start w:w="130" w:type="dxa"/>
-              <w:bottom w:w="90" w:type="dxa"/>
-              <w:end w:w="130" w:type="dxa"/>
-            </w:tcMar>
-            <w:vAlign w:val="center"/>
-          </w:tcPr>
-          <w:p>
-            <w:pPr>
-              <w:spacing w:before="0" w:after="0" w:line="259" w:lineRule="auto"/>
-            </w:pPr>
-            <w:r>
-              <w:rPr>
-                <w:rFonts w:ascii="Calibri" w:hAnsi="Calibri" w:eastAsia="Microsoft YaHei"/>
-              </w:rPr>
-            </w:r>
-            <w:r>
-              <w:rPr>
-                <w:rFonts w:ascii="Calibri" w:hAnsi="Calibri" w:eastAsia="Microsoft YaHei"/>
-                <w:b w:val="0"/>
-                <w:color w:val="1F2933"/>
-                <w:sz w:val="20"/>
-              </w:rPr>
-              <w:t xml:space="preserve"> </w:t>
-            </w:r>
-          </w:p>
-        </w:tc>
-      </w:tr>
-      <w:tr>
-        <w:trPr>
-          <w:trHeight w:val="576" w:hRule="atLeast"/>
-        </w:trPr>
-        <w:tc>
-          <w:tcPr>
-            <w:tcW w:type="dxa" w:w="2448"/>
-            <w:tcMar>
-              <w:top w:w="90" w:type="dxa"/>
-              <w:start w:w="130" w:type="dxa"/>
-              <w:bottom w:w="90" w:type="dxa"/>
-              <w:end w:w="130" w:type="dxa"/>
-            </w:tcMar>
-            <w:vAlign w:val="center"/>
-          </w:tcPr>
-          <w:p>
-            <w:pPr>
-              <w:spacing w:before="0" w:after="0" w:line="259" w:lineRule="auto"/>
-            </w:pPr>
-            <w:r>
-              <w:rPr>
-                <w:rFonts w:ascii="Calibri" w:hAnsi="Calibri" w:eastAsia="Microsoft YaHei"/>
-              </w:rPr>
-            </w:r>
-            <w:r>
-              <w:rPr>
-                <w:rFonts w:ascii="Calibri" w:hAnsi="Calibri" w:eastAsia="Microsoft YaHei"/>
-                <w:b w:val="0"/>
-                <w:color w:val="1F2933"/>
-                <w:sz w:val="20"/>
-              </w:rPr>
-              <w:t>审核人</w:t>
-            </w:r>
-          </w:p>
-        </w:tc>
-        <w:tc>
-          <w:tcPr>
-            <w:tcW w:type="dxa" w:w="6912"/>
-            <w:tcMar>
-              <w:top w:w="90" w:type="dxa"/>
-              <w:start w:w="130" w:type="dxa"/>
-              <w:bottom w:w="90" w:type="dxa"/>
-              <w:end w:w="130" w:type="dxa"/>
-            </w:tcMar>
-            <w:vAlign w:val="center"/>
-          </w:tcPr>
-          <w:p>
-            <w:pPr>
-              <w:spacing w:before="0" w:after="0" w:line="259" w:lineRule="auto"/>
-            </w:pPr>
-            <w:r>
-              <w:rPr>
-                <w:rFonts w:ascii="Calibri" w:hAnsi="Calibri" w:eastAsia="Microsoft YaHei"/>
-              </w:rPr>
-            </w:r>
-            <w:r>
-              <w:rPr>
-                <w:rFonts w:ascii="Calibri" w:hAnsi="Calibri" w:eastAsia="Microsoft YaHei"/>
-                <w:b w:val="0"/>
-                <w:color w:val="1F2933"/>
-                <w:sz w:val="20"/>
-              </w:rPr>
-              <w:t xml:space="preserve"> </w:t>
-            </w:r>
-          </w:p>
-        </w:tc>
-      </w:tr>
-      <w:tr>
-        <w:trPr>
-          <w:trHeight w:val="576" w:hRule="atLeast"/>
-        </w:trPr>
-        <w:tc>
-          <w:tcPr>
-            <w:tcW w:type="dxa" w:w="2448"/>
-            <w:tcMar>
-              <w:top w:w="90" w:type="dxa"/>
-              <w:start w:w="130" w:type="dxa"/>
-              <w:bottom w:w="90" w:type="dxa"/>
-              <w:end w:w="130" w:type="dxa"/>
-            </w:tcMar>
-            <w:vAlign w:val="center"/>
-          </w:tcPr>
-          <w:p>
-            <w:pPr>
-              <w:spacing w:before="0" w:after="0" w:line="259" w:lineRule="auto"/>
-            </w:pPr>
-            <w:r>
-              <w:rPr>
-                <w:rFonts w:ascii="Calibri" w:hAnsi="Calibri" w:eastAsia="Microsoft YaHei"/>
-              </w:rPr>
-            </w:r>
-            <w:r>
-              <w:rPr>
-                <w:rFonts w:ascii="Calibri" w:hAnsi="Calibri" w:eastAsia="Microsoft YaHei"/>
-                <w:b w:val="0"/>
-                <w:color w:val="1F2933"/>
-                <w:sz w:val="20"/>
-              </w:rPr>
-              <w:t>审核日期</w:t>
-            </w:r>
-          </w:p>
-        </w:tc>
-        <w:tc>
-          <w:tcPr>
-            <w:tcW w:type="dxa" w:w="6912"/>
-            <w:tcMar>
-              <w:top w:w="90" w:type="dxa"/>
-              <w:start w:w="130" w:type="dxa"/>
-              <w:bottom w:w="90" w:type="dxa"/>
-              <w:end w:w="130" w:type="dxa"/>
-            </w:tcMar>
-            <w:vAlign w:val="center"/>
-          </w:tcPr>
-          <w:p>
-            <w:pPr>
-              <w:spacing w:before="0" w:after="0" w:line="259" w:lineRule="auto"/>
-            </w:pPr>
-            <w:r>
-              <w:rPr>
-                <w:rFonts w:ascii="Calibri" w:hAnsi="Calibri" w:eastAsia="Microsoft YaHei"/>
-              </w:rPr>
-            </w:r>
-            <w:r>
-              <w:rPr>
-                <w:rFonts w:ascii="Calibri" w:hAnsi="Calibri" w:eastAsia="Microsoft YaHei"/>
-                <w:b w:val="0"/>
-                <w:color w:val="1F2933"/>
-                <w:sz w:val="20"/>
-              </w:rPr>
-              <w:t xml:space="preserve">        年    月    日</w:t>
-            </w:r>
-          </w:p>
-        </w:tc>
-      </w:tr>
-    </w:tbl>
-    <w:p/>
+    <w:p>
+      <w:pPr>
+        <w:spacing w:before="0" w:after="40" w:line="240" w:lineRule="auto"/>
+      </w:pPr>
+      <w:r>
+        <w:rPr>
+          <w:rFonts w:ascii="Calibri" w:hAnsi="Calibri" w:eastAsia="Microsoft YaHei"/>
+          <w:b/>
+          <w:color w:val="1F2933"/>
+          <w:sz w:val="18"/>
+        </w:rPr>
+        <w:t>负责人/导师签名（如适用）：</w:t>
+      </w:r>
+      <w:r>
+        <w:rPr>
+          <w:rFonts w:ascii="Calibri" w:hAnsi="Calibri" w:eastAsia="Microsoft YaHei"/>
+          <w:b w:val="0"/>
+          <w:color w:val="1F2933"/>
+          <w:sz w:val="18"/>
+        </w:rPr>
+        <w:t>____________________________</w:t>
+      </w:r>
+      <w:r>
+        <w:rPr>
+          <w:rFonts w:ascii="Calibri" w:hAnsi="Calibri" w:eastAsia="Microsoft YaHei"/>
+          <w:b/>
+          <w:color w:val="1F2933"/>
+          <w:sz w:val="18"/>
+        </w:rPr>
+        <w:t xml:space="preserve">    日期：</w:t>
+      </w:r>
+      <w:r>
+        <w:rPr>
+          <w:rFonts w:ascii="Calibri" w:hAnsi="Calibri" w:eastAsia="Microsoft YaHei"/>
+          <w:b w:val="0"/>
+          <w:color w:val="1F2933"/>
+          <w:sz w:val="18"/>
+        </w:rPr>
+        <w:t>________________</w:t>
+      </w:r>
+    </w:p>
     <w:sectPr>
       <w:footerReference w:type="default" r:id="rId9"/>
       <w:pgSz w:w="12240" w:h="15840"/>
-      <w:pgMar w:top="1440" w:right="1440" w:bottom="1440" w:left="1440" w:header="708" w:footer="708" w:gutter="0"/>
+      <w:pgMar w:top="835" w:right="1080" w:bottom="835" w:left="1080" w:header="432" w:footer="432" w:gutter="0"/>
       <w:cols w:space="720"/>
       <w:docGrid w:linePitch="360"/>
     </w:sectPr>
@@ -3610,7 +1589,7 @@
       <w:rPr>
         <w:rFonts w:ascii="Calibri" w:hAnsi="Calibri" w:eastAsia="Microsoft YaHei"/>
         <w:color w:val="5D6970"/>
-        <w:sz w:val="17"/>
+        <w:sz w:val="15"/>
       </w:rPr>
       <w:t>HIED 数据使用申请表 | jasonsongrain@hotmail.com</w:t>
     </w:r>
@@ -3982,12 +1961,12 @@
     <w:qFormat/>
     <w:rsid w:val="00FC693F"/>
     <w:pPr>
-      <w:spacing w:after="120" w:line="264" w:lineRule="auto"/>
+      <w:spacing w:after="60" w:line="240" w:lineRule="auto"/>
     </w:pPr>
     <w:rPr>
       <w:rFonts w:ascii="Calibri" w:hAnsi="Calibri" w:eastAsia="Microsoft YaHei"/>
       <w:color w:val="1F2933"/>
-      <w:sz w:val="22"/>
+      <w:sz w:val="19"/>
     </w:rPr>
   </w:style>
   <w:style w:type="paragraph" w:styleId="Header">
@@ -4045,7 +2024,7 @@
     <w:pPr>
       <w:keepNext/>
       <w:keepLines/>
-      <w:spacing w:before="320" w:after="160"/>
+      <w:spacing w:before="140" w:after="60"/>
       <w:outlineLvl w:val="0"/>
     </w:pPr>
     <w:rPr>
@@ -4053,7 +2032,7 @@
       <w:b/>
       <w:bCs/>
       <w:color w:val="4B1117"/>
-      <w:sz w:val="32"/>
+      <w:sz w:val="25"/>
       <w:szCs w:val="28"/>
     </w:rPr>
   </w:style>
@@ -4069,7 +2048,7 @@
     <w:pPr>
       <w:keepNext/>
       <w:keepLines/>
-      <w:spacing w:before="240" w:after="120"/>
+      <w:spacing w:before="120" w:after="60"/>
       <w:outlineLvl w:val="1"/>
     </w:pPr>
     <w:rPr>
@@ -4077,7 +2056,7 @@
       <w:b/>
       <w:bCs/>
       <w:color w:val="7D111A"/>
-      <w:sz w:val="26"/>
+      <w:sz w:val="23"/>
       <w:szCs w:val="26"/>
     </w:rPr>
   </w:style>
@@ -4093,7 +2072,7 @@
     <w:pPr>
       <w:keepNext/>
       <w:keepLines/>
-      <w:spacing w:before="160" w:after="80"/>
+      <w:spacing w:before="100" w:after="40"/>
       <w:outlineLvl w:val="2"/>
     </w:pPr>
     <w:rPr>
@@ -4101,7 +2080,7 @@
       <w:b/>
       <w:bCs/>
       <w:color w:val="7D111A"/>
-      <w:sz w:val="24"/>
+      <w:sz w:val="21"/>
     </w:rPr>
   </w:style>
   <w:style w:type="paragraph" w:styleId="Heading4">
@@ -4335,7 +2314,7 @@
       <w:pBdr>
         <w:bottom w:val="single" w:sz="8" w:space="4" w:color="4F81BD" w:themeColor="accent1"/>
       </w:pBdr>
-      <w:spacing w:after="80" w:line="240" w:lineRule="auto"/>
+      <w:spacing w:after="0" w:line="240" w:lineRule="auto"/>
       <w:contextualSpacing/>
     </w:pPr>
     <w:rPr>
@@ -4344,7 +2323,7 @@
       <w:color w:val="4B1117"/>
       <w:spacing w:val="5"/>
       <w:kern w:val="28"/>
-      <w:sz w:val="44"/>
+      <w:sz w:val="36"/>
       <w:szCs w:val="52"/>
     </w:rPr>
   </w:style>
@@ -4375,7 +2354,7 @@
       <w:numPr>
         <w:ilvl w:val="1"/>
       </w:numPr>
-      <w:spacing w:after="240"/>
+      <w:spacing w:after="100"/>
     </w:pPr>
     <w:rPr>
       <w:rFonts w:asciiTheme="majorHAnsi" w:eastAsiaTheme="majorEastAsia" w:hAnsiTheme="majorHAnsi" w:cstheme="majorBidi" w:ascii="Calibri" w:hAnsi="Calibri" w:eastAsia="Microsoft YaHei"/>
@@ -4383,7 +2362,7 @@
       <w:iCs/>
       <w:color w:val="5D6970"/>
       <w:spacing w:val="15"/>
-      <w:sz w:val="22"/>
+      <w:sz w:val="19"/>
       <w:szCs w:val="24"/>
     </w:rPr>
   </w:style>

</xml_diff>

<commit_message>
Update HIED license agreements
</commit_message>
<xml_diff>
--- a/HIED_Data_Request_Form_CN.docx
+++ b/HIED_Data_Request_Form_CN.docx
@@ -4,1573 +4,507 @@
   <w:body>
     <w:p>
       <w:pPr>
-        <w:pStyle w:val="Title"/>
+        <w:spacing w:before="0" w:after="200" w:line="240" w:lineRule="auto"/>
         <w:jc w:val="center"/>
       </w:pPr>
       <w:r>
         <w:rPr>
-          <w:rFonts w:ascii="Calibri" w:hAnsi="Calibri" w:eastAsia="Microsoft YaHei"/>
+          <w:rFonts w:ascii="Times New Roman" w:hAnsi="Times New Roman" w:eastAsia="Microsoft YaHei"/>
+          <w:b/>
+          <w:sz w:val="31"/>
         </w:rPr>
-        <w:t>HIED 数据申请表</w:t>
+        <w:t>HIED 数据集使用许可协议</w:t>
       </w:r>
     </w:p>
     <w:p>
       <w:pPr>
-        <w:pStyle w:val="Subtitle"/>
-        <w:jc w:val="center"/>
+        <w:spacing w:before="0" w:after="120" w:line="252" w:lineRule="auto"/>
+        <w:jc w:val="both"/>
       </w:pPr>
       <w:r>
         <w:rPr>
-          <w:rFonts w:ascii="Calibri" w:hAnsi="Calibri" w:eastAsia="Microsoft YaHei"/>
+          <w:rFonts w:ascii="Times New Roman" w:hAnsi="Times New Roman" w:eastAsia="Microsoft YaHei"/>
+          <w:b w:val="0"/>
+          <w:color w:val="000000"/>
+          <w:sz w:val="19"/>
         </w:rPr>
-        <w:t>听障人群脑电情绪识别数据集</w:t>
+        <w:t>签署本文件即表示 HIED（听障人群脑电情绪识别数据集）使用者同意遵守以下条款。本协议填写并签署后，请发送至数据集联系邮箱。</w:t>
       </w:r>
     </w:p>
     <w:p>
       <w:pPr>
-        <w:spacing w:before="0" w:after="80" w:line="240" w:lineRule="auto"/>
-        <w:jc w:val="center"/>
+        <w:spacing w:before="60" w:after="40" w:line="240" w:lineRule="auto"/>
       </w:pPr>
       <w:r>
         <w:rPr>
-          <w:rFonts w:ascii="Calibri" w:hAnsi="Calibri" w:eastAsia="Microsoft YaHei"/>
-          <w:b w:val="0"/>
-          <w:color w:val="5D6970"/>
-          <w:sz w:val="18"/>
+          <w:rFonts w:ascii="Times New Roman" w:hAnsi="Times New Roman" w:eastAsia="Microsoft YaHei"/>
+          <w:b/>
+          <w:color w:val="000000"/>
+          <w:sz w:val="20"/>
         </w:rPr>
-        <w:t>提交邮箱：jasonsongrain@hotmail.com；HIED 预处理 EEG 数据面向学术或非商业研究申请开放。</w:t>
+        <w:t>1.    学术与非商业使用</w:t>
       </w:r>
     </w:p>
     <w:p>
       <w:pPr>
-        <w:pStyle w:val="Heading1"/>
+        <w:spacing w:before="0" w:after="60" w:line="245" w:lineRule="auto"/>
+        <w:jc w:val="both"/>
       </w:pPr>
       <w:r>
         <w:rPr>
-          <w:rFonts w:ascii="Calibri" w:hAnsi="Calibri" w:eastAsia="Microsoft YaHei"/>
+          <w:rFonts w:ascii="Times New Roman" w:hAnsi="Times New Roman" w:eastAsia="Microsoft YaHei"/>
+          <w:b w:val="0"/>
+          <w:color w:val="000000"/>
+          <w:sz w:val="18"/>
         </w:rPr>
-        <w:t>一、申请人信息</w:t>
-      </w:r>
-    </w:p>
-    <w:tbl>
-      <w:tblPr>
-        <w:tblW w:type="dxa" w:w="9360"/>
-        <w:jc w:val="left"/>
-        <w:tblLayout w:type="fixed"/>
-        <w:tblLook w:firstColumn="1" w:firstRow="1" w:lastColumn="0" w:lastRow="0" w:noHBand="0" w:noVBand="1" w:val="04A0"/>
-        <w:tblInd w:w="120" w:type="dxa"/>
-        <w:tblBorders>
-          <w:top w:val="single" w:sz="6" w:space="0" w:color="C9D0D6"/>
-          <w:left w:val="single" w:sz="6" w:space="0" w:color="C9D0D6"/>
-          <w:bottom w:val="single" w:sz="6" w:space="0" w:color="C9D0D6"/>
-          <w:right w:val="single" w:sz="6" w:space="0" w:color="C9D0D6"/>
-          <w:insideH w:val="single" w:sz="6" w:space="0" w:color="C9D0D6"/>
-          <w:insideV w:val="single" w:sz="6" w:space="0" w:color="C9D0D6"/>
-        </w:tblBorders>
-      </w:tblPr>
-      <w:tblGrid>
-        <w:gridCol w:w="1944"/>
-        <w:gridCol w:w="2736"/>
-        <w:gridCol w:w="1944"/>
-        <w:gridCol w:w="2736"/>
-      </w:tblGrid>
-      <w:tr>
-        <w:trPr>
-          <w:trHeight w:val="389" w:hRule="atLeast"/>
-        </w:trPr>
-        <w:tc>
-          <w:tcPr>
-            <w:tcW w:type="dxa" w:w="1944"/>
-            <w:shd w:fill="F4F6F8"/>
-            <w:tcMar>
-              <w:top w:w="60" w:type="dxa"/>
-              <w:start w:w="95" w:type="dxa"/>
-              <w:bottom w:w="60" w:type="dxa"/>
-              <w:end w:w="95" w:type="dxa"/>
-            </w:tcMar>
-            <w:vAlign w:val="center"/>
-          </w:tcPr>
-          <w:p>
-            <w:pPr>
-              <w:spacing w:before="0" w:after="0" w:line="259" w:lineRule="auto"/>
-            </w:pPr>
-            <w:r>
-              <w:rPr>
-                <w:rFonts w:ascii="Calibri" w:hAnsi="Calibri" w:eastAsia="Microsoft YaHei"/>
-              </w:rPr>
-            </w:r>
-            <w:r>
-              <w:rPr>
-                <w:rFonts w:ascii="Calibri" w:hAnsi="Calibri" w:eastAsia="Microsoft YaHei"/>
-                <w:b/>
-                <w:color w:val="1F2933"/>
-                <w:sz w:val="18"/>
-              </w:rPr>
-              <w:t>姓名</w:t>
-            </w:r>
-          </w:p>
-        </w:tc>
-        <w:tc>
-          <w:tcPr>
-            <w:tcW w:type="dxa" w:w="2736"/>
-            <w:tcMar>
-              <w:top w:w="60" w:type="dxa"/>
-              <w:start w:w="95" w:type="dxa"/>
-              <w:bottom w:w="60" w:type="dxa"/>
-              <w:end w:w="95" w:type="dxa"/>
-            </w:tcMar>
-            <w:vAlign w:val="center"/>
-          </w:tcPr>
-          <w:p>
-            <w:pPr>
-              <w:spacing w:before="0" w:after="0" w:line="259" w:lineRule="auto"/>
-            </w:pPr>
-            <w:r>
-              <w:rPr>
-                <w:rFonts w:ascii="Calibri" w:hAnsi="Calibri" w:eastAsia="Microsoft YaHei"/>
-              </w:rPr>
-            </w:r>
-            <w:r>
-              <w:rPr>
-                <w:rFonts w:ascii="Calibri" w:hAnsi="Calibri" w:eastAsia="Microsoft YaHei"/>
-                <w:b w:val="0"/>
-                <w:color w:val="1F2933"/>
-                <w:sz w:val="18"/>
-              </w:rPr>
-              <w:t xml:space="preserve"> </w:t>
-            </w:r>
-          </w:p>
-        </w:tc>
-        <w:tc>
-          <w:tcPr>
-            <w:tcW w:type="dxa" w:w="1944"/>
-            <w:shd w:fill="F4F6F8"/>
-            <w:tcMar>
-              <w:top w:w="60" w:type="dxa"/>
-              <w:start w:w="95" w:type="dxa"/>
-              <w:bottom w:w="60" w:type="dxa"/>
-              <w:end w:w="95" w:type="dxa"/>
-            </w:tcMar>
-            <w:vAlign w:val="center"/>
-          </w:tcPr>
-          <w:p>
-            <w:pPr>
-              <w:spacing w:before="0" w:after="0" w:line="259" w:lineRule="auto"/>
-            </w:pPr>
-            <w:r>
-              <w:rPr>
-                <w:rFonts w:ascii="Calibri" w:hAnsi="Calibri" w:eastAsia="Microsoft YaHei"/>
-              </w:rPr>
-            </w:r>
-            <w:r>
-              <w:rPr>
-                <w:rFonts w:ascii="Calibri" w:hAnsi="Calibri" w:eastAsia="Microsoft YaHei"/>
-                <w:b/>
-                <w:color w:val="1F2933"/>
-                <w:sz w:val="18"/>
-              </w:rPr>
-              <w:t>身份/职称</w:t>
-            </w:r>
-          </w:p>
-        </w:tc>
-        <w:tc>
-          <w:tcPr>
-            <w:tcW w:type="dxa" w:w="2736"/>
-            <w:tcMar>
-              <w:top w:w="60" w:type="dxa"/>
-              <w:start w:w="95" w:type="dxa"/>
-              <w:bottom w:w="60" w:type="dxa"/>
-              <w:end w:w="95" w:type="dxa"/>
-            </w:tcMar>
-            <w:vAlign w:val="center"/>
-          </w:tcPr>
-          <w:p>
-            <w:pPr>
-              <w:spacing w:before="0" w:after="0" w:line="259" w:lineRule="auto"/>
-            </w:pPr>
-            <w:r>
-              <w:rPr>
-                <w:rFonts w:ascii="Calibri" w:hAnsi="Calibri" w:eastAsia="Microsoft YaHei"/>
-              </w:rPr>
-            </w:r>
-            <w:r>
-              <w:rPr>
-                <w:rFonts w:ascii="Calibri" w:hAnsi="Calibri" w:eastAsia="Microsoft YaHei"/>
-                <w:b w:val="0"/>
-                <w:color w:val="1F2933"/>
-                <w:sz w:val="18"/>
-              </w:rPr>
-              <w:t xml:space="preserve"> </w:t>
-            </w:r>
-          </w:p>
-        </w:tc>
-      </w:tr>
-      <w:tr>
-        <w:trPr>
-          <w:trHeight w:val="389" w:hRule="atLeast"/>
-        </w:trPr>
-        <w:tc>
-          <w:tcPr>
-            <w:tcW w:type="dxa" w:w="1944"/>
-            <w:shd w:fill="F4F6F8"/>
-            <w:tcMar>
-              <w:top w:w="60" w:type="dxa"/>
-              <w:start w:w="95" w:type="dxa"/>
-              <w:bottom w:w="60" w:type="dxa"/>
-              <w:end w:w="95" w:type="dxa"/>
-            </w:tcMar>
-            <w:vAlign w:val="center"/>
-          </w:tcPr>
-          <w:p>
-            <w:pPr>
-              <w:spacing w:before="0" w:after="0" w:line="259" w:lineRule="auto"/>
-            </w:pPr>
-            <w:r>
-              <w:rPr>
-                <w:rFonts w:ascii="Calibri" w:hAnsi="Calibri" w:eastAsia="Microsoft YaHei"/>
-              </w:rPr>
-            </w:r>
-            <w:r>
-              <w:rPr>
-                <w:rFonts w:ascii="Calibri" w:hAnsi="Calibri" w:eastAsia="Microsoft YaHei"/>
-                <w:b/>
-                <w:color w:val="1F2933"/>
-                <w:sz w:val="18"/>
-              </w:rPr>
-              <w:t>单位</w:t>
-            </w:r>
-          </w:p>
-        </w:tc>
-        <w:tc>
-          <w:tcPr>
-            <w:tcW w:type="dxa" w:w="2736"/>
-            <w:tcMar>
-              <w:top w:w="60" w:type="dxa"/>
-              <w:start w:w="95" w:type="dxa"/>
-              <w:bottom w:w="60" w:type="dxa"/>
-              <w:end w:w="95" w:type="dxa"/>
-            </w:tcMar>
-            <w:vAlign w:val="center"/>
-          </w:tcPr>
-          <w:p>
-            <w:pPr>
-              <w:spacing w:before="0" w:after="0" w:line="259" w:lineRule="auto"/>
-            </w:pPr>
-            <w:r>
-              <w:rPr>
-                <w:rFonts w:ascii="Calibri" w:hAnsi="Calibri" w:eastAsia="Microsoft YaHei"/>
-              </w:rPr>
-            </w:r>
-            <w:r>
-              <w:rPr>
-                <w:rFonts w:ascii="Calibri" w:hAnsi="Calibri" w:eastAsia="Microsoft YaHei"/>
-                <w:b w:val="0"/>
-                <w:color w:val="1F2933"/>
-                <w:sz w:val="18"/>
-              </w:rPr>
-              <w:t xml:space="preserve"> </w:t>
-            </w:r>
-          </w:p>
-        </w:tc>
-        <w:tc>
-          <w:tcPr>
-            <w:tcW w:type="dxa" w:w="1944"/>
-            <w:shd w:fill="F4F6F8"/>
-            <w:tcMar>
-              <w:top w:w="60" w:type="dxa"/>
-              <w:start w:w="95" w:type="dxa"/>
-              <w:bottom w:w="60" w:type="dxa"/>
-              <w:end w:w="95" w:type="dxa"/>
-            </w:tcMar>
-            <w:vAlign w:val="center"/>
-          </w:tcPr>
-          <w:p>
-            <w:pPr>
-              <w:spacing w:before="0" w:after="0" w:line="259" w:lineRule="auto"/>
-            </w:pPr>
-            <w:r>
-              <w:rPr>
-                <w:rFonts w:ascii="Calibri" w:hAnsi="Calibri" w:eastAsia="Microsoft YaHei"/>
-              </w:rPr>
-            </w:r>
-            <w:r>
-              <w:rPr>
-                <w:rFonts w:ascii="Calibri" w:hAnsi="Calibri" w:eastAsia="Microsoft YaHei"/>
-                <w:b/>
-                <w:color w:val="1F2933"/>
-                <w:sz w:val="18"/>
-              </w:rPr>
-              <w:t>院系/团队</w:t>
-            </w:r>
-          </w:p>
-        </w:tc>
-        <w:tc>
-          <w:tcPr>
-            <w:tcW w:type="dxa" w:w="2736"/>
-            <w:tcMar>
-              <w:top w:w="60" w:type="dxa"/>
-              <w:start w:w="95" w:type="dxa"/>
-              <w:bottom w:w="60" w:type="dxa"/>
-              <w:end w:w="95" w:type="dxa"/>
-            </w:tcMar>
-            <w:vAlign w:val="center"/>
-          </w:tcPr>
-          <w:p>
-            <w:pPr>
-              <w:spacing w:before="0" w:after="0" w:line="259" w:lineRule="auto"/>
-            </w:pPr>
-            <w:r>
-              <w:rPr>
-                <w:rFonts w:ascii="Calibri" w:hAnsi="Calibri" w:eastAsia="Microsoft YaHei"/>
-              </w:rPr>
-            </w:r>
-            <w:r>
-              <w:rPr>
-                <w:rFonts w:ascii="Calibri" w:hAnsi="Calibri" w:eastAsia="Microsoft YaHei"/>
-                <w:b w:val="0"/>
-                <w:color w:val="1F2933"/>
-                <w:sz w:val="18"/>
-              </w:rPr>
-              <w:t xml:space="preserve"> </w:t>
-            </w:r>
-          </w:p>
-        </w:tc>
-      </w:tr>
-      <w:tr>
-        <w:trPr>
-          <w:trHeight w:val="389" w:hRule="atLeast"/>
-        </w:trPr>
-        <w:tc>
-          <w:tcPr>
-            <w:tcW w:type="dxa" w:w="1944"/>
-            <w:shd w:fill="F4F6F8"/>
-            <w:tcMar>
-              <w:top w:w="60" w:type="dxa"/>
-              <w:start w:w="95" w:type="dxa"/>
-              <w:bottom w:w="60" w:type="dxa"/>
-              <w:end w:w="95" w:type="dxa"/>
-            </w:tcMar>
-            <w:vAlign w:val="center"/>
-          </w:tcPr>
-          <w:p>
-            <w:pPr>
-              <w:spacing w:before="0" w:after="0" w:line="259" w:lineRule="auto"/>
-            </w:pPr>
-            <w:r>
-              <w:rPr>
-                <w:rFonts w:ascii="Calibri" w:hAnsi="Calibri" w:eastAsia="Microsoft YaHei"/>
-              </w:rPr>
-            </w:r>
-            <w:r>
-              <w:rPr>
-                <w:rFonts w:ascii="Calibri" w:hAnsi="Calibri" w:eastAsia="Microsoft YaHei"/>
-                <w:b/>
-                <w:color w:val="1F2933"/>
-                <w:sz w:val="18"/>
-              </w:rPr>
-              <w:t>邮箱</w:t>
-            </w:r>
-          </w:p>
-        </w:tc>
-        <w:tc>
-          <w:tcPr>
-            <w:tcW w:type="dxa" w:w="2736"/>
-            <w:tcMar>
-              <w:top w:w="60" w:type="dxa"/>
-              <w:start w:w="95" w:type="dxa"/>
-              <w:bottom w:w="60" w:type="dxa"/>
-              <w:end w:w="95" w:type="dxa"/>
-            </w:tcMar>
-            <w:vAlign w:val="center"/>
-          </w:tcPr>
-          <w:p>
-            <w:pPr>
-              <w:spacing w:before="0" w:after="0" w:line="259" w:lineRule="auto"/>
-            </w:pPr>
-            <w:r>
-              <w:rPr>
-                <w:rFonts w:ascii="Calibri" w:hAnsi="Calibri" w:eastAsia="Microsoft YaHei"/>
-              </w:rPr>
-            </w:r>
-            <w:r>
-              <w:rPr>
-                <w:rFonts w:ascii="Calibri" w:hAnsi="Calibri" w:eastAsia="Microsoft YaHei"/>
-                <w:b w:val="0"/>
-                <w:color w:val="1F2933"/>
-                <w:sz w:val="18"/>
-              </w:rPr>
-              <w:t xml:space="preserve"> </w:t>
-            </w:r>
-          </w:p>
-        </w:tc>
-        <w:tc>
-          <w:tcPr>
-            <w:tcW w:type="dxa" w:w="1944"/>
-            <w:shd w:fill="F4F6F8"/>
-            <w:tcMar>
-              <w:top w:w="60" w:type="dxa"/>
-              <w:start w:w="95" w:type="dxa"/>
-              <w:bottom w:w="60" w:type="dxa"/>
-              <w:end w:w="95" w:type="dxa"/>
-            </w:tcMar>
-            <w:vAlign w:val="center"/>
-          </w:tcPr>
-          <w:p>
-            <w:pPr>
-              <w:spacing w:before="0" w:after="0" w:line="259" w:lineRule="auto"/>
-            </w:pPr>
-            <w:r>
-              <w:rPr>
-                <w:rFonts w:ascii="Calibri" w:hAnsi="Calibri" w:eastAsia="Microsoft YaHei"/>
-              </w:rPr>
-            </w:r>
-            <w:r>
-              <w:rPr>
-                <w:rFonts w:ascii="Calibri" w:hAnsi="Calibri" w:eastAsia="Microsoft YaHei"/>
-                <w:b/>
-                <w:color w:val="1F2933"/>
-                <w:sz w:val="18"/>
-              </w:rPr>
-              <w:t>联系电话</w:t>
-            </w:r>
-          </w:p>
-        </w:tc>
-        <w:tc>
-          <w:tcPr>
-            <w:tcW w:type="dxa" w:w="2736"/>
-            <w:tcMar>
-              <w:top w:w="60" w:type="dxa"/>
-              <w:start w:w="95" w:type="dxa"/>
-              <w:bottom w:w="60" w:type="dxa"/>
-              <w:end w:w="95" w:type="dxa"/>
-            </w:tcMar>
-            <w:vAlign w:val="center"/>
-          </w:tcPr>
-          <w:p>
-            <w:pPr>
-              <w:spacing w:before="0" w:after="0" w:line="259" w:lineRule="auto"/>
-            </w:pPr>
-            <w:r>
-              <w:rPr>
-                <w:rFonts w:ascii="Calibri" w:hAnsi="Calibri" w:eastAsia="Microsoft YaHei"/>
-              </w:rPr>
-            </w:r>
-            <w:r>
-              <w:rPr>
-                <w:rFonts w:ascii="Calibri" w:hAnsi="Calibri" w:eastAsia="Microsoft YaHei"/>
-                <w:b w:val="0"/>
-                <w:color w:val="1F2933"/>
-                <w:sz w:val="18"/>
-              </w:rPr>
-              <w:t xml:space="preserve"> </w:t>
-            </w:r>
-          </w:p>
-        </w:tc>
-      </w:tr>
-      <w:tr>
-        <w:trPr>
-          <w:trHeight w:val="389" w:hRule="atLeast"/>
-        </w:trPr>
-        <w:tc>
-          <w:tcPr>
-            <w:tcW w:type="dxa" w:w="1944"/>
-            <w:shd w:fill="F4F6F8"/>
-            <w:tcMar>
-              <w:top w:w="60" w:type="dxa"/>
-              <w:start w:w="95" w:type="dxa"/>
-              <w:bottom w:w="60" w:type="dxa"/>
-              <w:end w:w="95" w:type="dxa"/>
-            </w:tcMar>
-            <w:vAlign w:val="center"/>
-          </w:tcPr>
-          <w:p>
-            <w:pPr>
-              <w:spacing w:before="0" w:after="0" w:line="259" w:lineRule="auto"/>
-            </w:pPr>
-            <w:r>
-              <w:rPr>
-                <w:rFonts w:ascii="Calibri" w:hAnsi="Calibri" w:eastAsia="Microsoft YaHei"/>
-              </w:rPr>
-            </w:r>
-            <w:r>
-              <w:rPr>
-                <w:rFonts w:ascii="Calibri" w:hAnsi="Calibri" w:eastAsia="Microsoft YaHei"/>
-                <w:b/>
-                <w:color w:val="1F2933"/>
-                <w:sz w:val="18"/>
-              </w:rPr>
-              <w:t>负责人/导师（如适用）</w:t>
-            </w:r>
-          </w:p>
-        </w:tc>
-        <w:tc>
-          <w:tcPr>
-            <w:tcW w:type="dxa" w:w="2736"/>
-            <w:tcMar>
-              <w:top w:w="60" w:type="dxa"/>
-              <w:start w:w="95" w:type="dxa"/>
-              <w:bottom w:w="60" w:type="dxa"/>
-              <w:end w:w="95" w:type="dxa"/>
-            </w:tcMar>
-            <w:vAlign w:val="center"/>
-          </w:tcPr>
-          <w:p>
-            <w:pPr>
-              <w:spacing w:before="0" w:after="0" w:line="259" w:lineRule="auto"/>
-            </w:pPr>
-            <w:r>
-              <w:rPr>
-                <w:rFonts w:ascii="Calibri" w:hAnsi="Calibri" w:eastAsia="Microsoft YaHei"/>
-              </w:rPr>
-            </w:r>
-            <w:r>
-              <w:rPr>
-                <w:rFonts w:ascii="Calibri" w:hAnsi="Calibri" w:eastAsia="Microsoft YaHei"/>
-                <w:b w:val="0"/>
-                <w:color w:val="1F2933"/>
-                <w:sz w:val="18"/>
-              </w:rPr>
-              <w:t xml:space="preserve"> </w:t>
-            </w:r>
-          </w:p>
-        </w:tc>
-        <w:tc>
-          <w:tcPr>
-            <w:tcW w:type="dxa" w:w="1944"/>
-            <w:shd w:fill="F4F6F8"/>
-            <w:tcMar>
-              <w:top w:w="60" w:type="dxa"/>
-              <w:start w:w="95" w:type="dxa"/>
-              <w:bottom w:w="60" w:type="dxa"/>
-              <w:end w:w="95" w:type="dxa"/>
-            </w:tcMar>
-            <w:vAlign w:val="center"/>
-          </w:tcPr>
-          <w:p>
-            <w:pPr>
-              <w:spacing w:before="0" w:after="0" w:line="259" w:lineRule="auto"/>
-            </w:pPr>
-            <w:r>
-              <w:rPr>
-                <w:rFonts w:ascii="Calibri" w:hAnsi="Calibri" w:eastAsia="Microsoft YaHei"/>
-              </w:rPr>
-            </w:r>
-            <w:r>
-              <w:rPr>
-                <w:rFonts w:ascii="Calibri" w:hAnsi="Calibri" w:eastAsia="Microsoft YaHei"/>
-                <w:b/>
-                <w:color w:val="1F2933"/>
-                <w:sz w:val="18"/>
-              </w:rPr>
-              <w:t>负责人邮箱</w:t>
-            </w:r>
-          </w:p>
-        </w:tc>
-        <w:tc>
-          <w:tcPr>
-            <w:tcW w:type="dxa" w:w="2736"/>
-            <w:tcMar>
-              <w:top w:w="60" w:type="dxa"/>
-              <w:start w:w="95" w:type="dxa"/>
-              <w:bottom w:w="60" w:type="dxa"/>
-              <w:end w:w="95" w:type="dxa"/>
-            </w:tcMar>
-            <w:vAlign w:val="center"/>
-          </w:tcPr>
-          <w:p>
-            <w:pPr>
-              <w:spacing w:before="0" w:after="0" w:line="259" w:lineRule="auto"/>
-            </w:pPr>
-            <w:r>
-              <w:rPr>
-                <w:rFonts w:ascii="Calibri" w:hAnsi="Calibri" w:eastAsia="Microsoft YaHei"/>
-              </w:rPr>
-            </w:r>
-            <w:r>
-              <w:rPr>
-                <w:rFonts w:ascii="Calibri" w:hAnsi="Calibri" w:eastAsia="Microsoft YaHei"/>
-                <w:b w:val="0"/>
-                <w:color w:val="1F2933"/>
-                <w:sz w:val="18"/>
-              </w:rPr>
-              <w:t xml:space="preserve"> </w:t>
-            </w:r>
-          </w:p>
-        </w:tc>
-      </w:tr>
-    </w:tbl>
-    <w:p/>
-    <w:p>
-      <w:pPr>
-        <w:pStyle w:val="Heading1"/>
-      </w:pPr>
-      <w:r>
-        <w:rPr>
-          <w:rFonts w:ascii="Calibri" w:hAnsi="Calibri" w:eastAsia="Microsoft YaHei"/>
-        </w:rPr>
-        <w:t>二、申请用途</w:t>
-      </w:r>
-    </w:p>
-    <w:tbl>
-      <w:tblPr>
-        <w:tblW w:type="dxa" w:w="9360"/>
-        <w:jc w:val="left"/>
-        <w:tblLayout w:type="fixed"/>
-        <w:tblLook w:firstColumn="1" w:firstRow="1" w:lastColumn="0" w:lastRow="0" w:noHBand="0" w:noVBand="1" w:val="04A0"/>
-        <w:tblInd w:w="120" w:type="dxa"/>
-        <w:tblBorders>
-          <w:top w:val="single" w:sz="6" w:space="0" w:color="C9D0D6"/>
-          <w:left w:val="single" w:sz="6" w:space="0" w:color="C9D0D6"/>
-          <w:bottom w:val="single" w:sz="6" w:space="0" w:color="C9D0D6"/>
-          <w:right w:val="single" w:sz="6" w:space="0" w:color="C9D0D6"/>
-          <w:insideH w:val="single" w:sz="6" w:space="0" w:color="C9D0D6"/>
-          <w:insideV w:val="single" w:sz="6" w:space="0" w:color="C9D0D6"/>
-        </w:tblBorders>
-      </w:tblPr>
-      <w:tblGrid>
-        <w:gridCol w:w="2088"/>
-        <w:gridCol w:w="7272"/>
-      </w:tblGrid>
-      <w:tr>
-        <w:trPr>
-          <w:trHeight w:val="403" w:hRule="atLeast"/>
-        </w:trPr>
-        <w:tc>
-          <w:tcPr>
-            <w:tcW w:type="dxa" w:w="2088"/>
-            <w:shd w:fill="F5E9EA"/>
-            <w:tcMar>
-              <w:top w:w="60" w:type="dxa"/>
-              <w:start w:w="95" w:type="dxa"/>
-              <w:bottom w:w="60" w:type="dxa"/>
-              <w:end w:w="95" w:type="dxa"/>
-            </w:tcMar>
-            <w:vAlign w:val="center"/>
-          </w:tcPr>
-          <w:p>
-            <w:pPr>
-              <w:spacing w:before="0" w:after="0" w:line="259" w:lineRule="auto"/>
-            </w:pPr>
-            <w:r>
-              <w:rPr>
-                <w:rFonts w:ascii="Calibri" w:hAnsi="Calibri" w:eastAsia="Microsoft YaHei"/>
-              </w:rPr>
-            </w:r>
-            <w:r>
-              <w:rPr>
-                <w:rFonts w:ascii="Calibri" w:hAnsi="Calibri" w:eastAsia="Microsoft YaHei"/>
-                <w:b/>
-                <w:color w:val="4B1117"/>
-                <w:sz w:val="18"/>
-              </w:rPr>
-              <w:t>字段</w:t>
-            </w:r>
-          </w:p>
-        </w:tc>
-        <w:tc>
-          <w:tcPr>
-            <w:tcW w:type="dxa" w:w="7272"/>
-            <w:shd w:fill="F5E9EA"/>
-            <w:tcMar>
-              <w:top w:w="60" w:type="dxa"/>
-              <w:start w:w="95" w:type="dxa"/>
-              <w:bottom w:w="60" w:type="dxa"/>
-              <w:end w:w="95" w:type="dxa"/>
-            </w:tcMar>
-            <w:vAlign w:val="center"/>
-          </w:tcPr>
-          <w:p>
-            <w:pPr>
-              <w:spacing w:before="0" w:after="0" w:line="259" w:lineRule="auto"/>
-            </w:pPr>
-            <w:r>
-              <w:rPr>
-                <w:rFonts w:ascii="Calibri" w:hAnsi="Calibri" w:eastAsia="Microsoft YaHei"/>
-              </w:rPr>
-            </w:r>
-            <w:r>
-              <w:rPr>
-                <w:rFonts w:ascii="Calibri" w:hAnsi="Calibri" w:eastAsia="Microsoft YaHei"/>
-                <w:b/>
-                <w:color w:val="4B1117"/>
-                <w:sz w:val="18"/>
-              </w:rPr>
-              <w:t>填写内容</w:t>
-            </w:r>
-          </w:p>
-        </w:tc>
-      </w:tr>
-      <w:tr>
-        <w:trPr>
-          <w:trHeight w:val="403" w:hRule="atLeast"/>
-        </w:trPr>
-        <w:tc>
-          <w:tcPr>
-            <w:tcW w:type="dxa" w:w="2088"/>
-            <w:tcMar>
-              <w:top w:w="60" w:type="dxa"/>
-              <w:start w:w="95" w:type="dxa"/>
-              <w:bottom w:w="60" w:type="dxa"/>
-              <w:end w:w="95" w:type="dxa"/>
-            </w:tcMar>
-            <w:vAlign w:val="center"/>
-          </w:tcPr>
-          <w:p>
-            <w:pPr>
-              <w:spacing w:before="0" w:after="0" w:line="259" w:lineRule="auto"/>
-            </w:pPr>
-            <w:r>
-              <w:rPr>
-                <w:rFonts w:ascii="Calibri" w:hAnsi="Calibri" w:eastAsia="Microsoft YaHei"/>
-              </w:rPr>
-            </w:r>
-            <w:r>
-              <w:rPr>
-                <w:rFonts w:ascii="Calibri" w:hAnsi="Calibri" w:eastAsia="Microsoft YaHei"/>
-                <w:b w:val="0"/>
-                <w:color w:val="1F2933"/>
-                <w:sz w:val="18"/>
-              </w:rPr>
-              <w:t>课题名称</w:t>
-            </w:r>
-          </w:p>
-        </w:tc>
-        <w:tc>
-          <w:tcPr>
-            <w:tcW w:type="dxa" w:w="7272"/>
-            <w:tcMar>
-              <w:top w:w="60" w:type="dxa"/>
-              <w:start w:w="95" w:type="dxa"/>
-              <w:bottom w:w="60" w:type="dxa"/>
-              <w:end w:w="95" w:type="dxa"/>
-            </w:tcMar>
-            <w:vAlign w:val="center"/>
-          </w:tcPr>
-          <w:p>
-            <w:pPr>
-              <w:spacing w:before="0" w:after="0" w:line="259" w:lineRule="auto"/>
-            </w:pPr>
-            <w:r>
-              <w:rPr>
-                <w:rFonts w:ascii="Calibri" w:hAnsi="Calibri" w:eastAsia="Microsoft YaHei"/>
-              </w:rPr>
-            </w:r>
-            <w:r>
-              <w:rPr>
-                <w:rFonts w:ascii="Calibri" w:hAnsi="Calibri" w:eastAsia="Microsoft YaHei"/>
-                <w:b w:val="0"/>
-                <w:color w:val="1F2933"/>
-                <w:sz w:val="18"/>
-              </w:rPr>
-              <w:t xml:space="preserve"> </w:t>
-            </w:r>
-          </w:p>
-        </w:tc>
-      </w:tr>
-      <w:tr>
-        <w:trPr>
-          <w:trHeight w:val="461" w:hRule="atLeast"/>
-        </w:trPr>
-        <w:tc>
-          <w:tcPr>
-            <w:tcW w:type="dxa" w:w="2088"/>
-            <w:tcMar>
-              <w:top w:w="60" w:type="dxa"/>
-              <w:start w:w="95" w:type="dxa"/>
-              <w:bottom w:w="60" w:type="dxa"/>
-              <w:end w:w="95" w:type="dxa"/>
-            </w:tcMar>
-            <w:vAlign w:val="center"/>
-          </w:tcPr>
-          <w:p>
-            <w:pPr>
-              <w:spacing w:before="0" w:after="0" w:line="259" w:lineRule="auto"/>
-            </w:pPr>
-            <w:r>
-              <w:rPr>
-                <w:rFonts w:ascii="Calibri" w:hAnsi="Calibri" w:eastAsia="Microsoft YaHei"/>
-              </w:rPr>
-            </w:r>
-            <w:r>
-              <w:rPr>
-                <w:rFonts w:ascii="Calibri" w:hAnsi="Calibri" w:eastAsia="Microsoft YaHei"/>
-                <w:b w:val="0"/>
-                <w:color w:val="1F2933"/>
-                <w:sz w:val="18"/>
-              </w:rPr>
-              <w:t>用途类型</w:t>
-            </w:r>
-          </w:p>
-        </w:tc>
-        <w:tc>
-          <w:tcPr>
-            <w:tcW w:type="dxa" w:w="7272"/>
-            <w:tcMar>
-              <w:top w:w="60" w:type="dxa"/>
-              <w:start w:w="95" w:type="dxa"/>
-              <w:bottom w:w="60" w:type="dxa"/>
-              <w:end w:w="95" w:type="dxa"/>
-            </w:tcMar>
-            <w:vAlign w:val="center"/>
-          </w:tcPr>
-          <w:p>
-            <w:pPr>
-              <w:spacing w:before="0" w:after="0" w:line="259" w:lineRule="auto"/>
-            </w:pPr>
-            <w:r>
-              <w:rPr>
-                <w:rFonts w:ascii="Calibri" w:hAnsi="Calibri" w:eastAsia="Microsoft YaHei"/>
-              </w:rPr>
-            </w:r>
-            <w:r>
-              <w:rPr>
-                <w:rFonts w:ascii="Calibri" w:hAnsi="Calibri" w:eastAsia="Microsoft YaHei"/>
-                <w:b w:val="0"/>
-                <w:color w:val="1F2933"/>
-                <w:sz w:val="18"/>
-              </w:rPr>
-              <w:t>□ 学术论文  □ 学位论文  □ 教学/课程  □ 算法验证  □ 其他：</w:t>
-            </w:r>
-          </w:p>
-        </w:tc>
-      </w:tr>
-      <w:tr>
-        <w:trPr>
-          <w:trHeight w:val="749" w:hRule="atLeast"/>
-        </w:trPr>
-        <w:tc>
-          <w:tcPr>
-            <w:tcW w:type="dxa" w:w="2088"/>
-            <w:tcMar>
-              <w:top w:w="60" w:type="dxa"/>
-              <w:start w:w="95" w:type="dxa"/>
-              <w:bottom w:w="60" w:type="dxa"/>
-              <w:end w:w="95" w:type="dxa"/>
-            </w:tcMar>
-            <w:vAlign w:val="center"/>
-          </w:tcPr>
-          <w:p>
-            <w:pPr>
-              <w:spacing w:before="0" w:after="0" w:line="259" w:lineRule="auto"/>
-            </w:pPr>
-            <w:r>
-              <w:rPr>
-                <w:rFonts w:ascii="Calibri" w:hAnsi="Calibri" w:eastAsia="Microsoft YaHei"/>
-              </w:rPr>
-            </w:r>
-            <w:r>
-              <w:rPr>
-                <w:rFonts w:ascii="Calibri" w:hAnsi="Calibri" w:eastAsia="Microsoft YaHei"/>
-                <w:b w:val="0"/>
-                <w:color w:val="1F2933"/>
-                <w:sz w:val="18"/>
-              </w:rPr>
-              <w:t>研究简介</w:t>
-            </w:r>
-          </w:p>
-        </w:tc>
-        <w:tc>
-          <w:tcPr>
-            <w:tcW w:type="dxa" w:w="7272"/>
-            <w:tcMar>
-              <w:top w:w="60" w:type="dxa"/>
-              <w:start w:w="95" w:type="dxa"/>
-              <w:bottom w:w="60" w:type="dxa"/>
-              <w:end w:w="95" w:type="dxa"/>
-            </w:tcMar>
-            <w:vAlign w:val="center"/>
-          </w:tcPr>
-          <w:p>
-            <w:pPr>
-              <w:spacing w:before="0" w:after="0" w:line="259" w:lineRule="auto"/>
-            </w:pPr>
-            <w:r>
-              <w:rPr>
-                <w:rFonts w:ascii="Calibri" w:hAnsi="Calibri" w:eastAsia="Microsoft YaHei"/>
-              </w:rPr>
-            </w:r>
-            <w:r>
-              <w:rPr>
-                <w:rFonts w:ascii="Calibri" w:hAnsi="Calibri" w:eastAsia="Microsoft YaHei"/>
-                <w:b w:val="0"/>
-                <w:color w:val="1F2933"/>
-                <w:sz w:val="18"/>
-              </w:rPr>
-              <w:t>请用 2-3 句话说明研究问题、方法或预期分析：</w:t>
-            </w:r>
-          </w:p>
-        </w:tc>
-      </w:tr>
-      <w:tr>
-        <w:trPr>
-          <w:trHeight w:val="432" w:hRule="atLeast"/>
-        </w:trPr>
-        <w:tc>
-          <w:tcPr>
-            <w:tcW w:type="dxa" w:w="2088"/>
-            <w:tcMar>
-              <w:top w:w="60" w:type="dxa"/>
-              <w:start w:w="95" w:type="dxa"/>
-              <w:bottom w:w="60" w:type="dxa"/>
-              <w:end w:w="95" w:type="dxa"/>
-            </w:tcMar>
-            <w:vAlign w:val="center"/>
-          </w:tcPr>
-          <w:p>
-            <w:pPr>
-              <w:spacing w:before="0" w:after="0" w:line="259" w:lineRule="auto"/>
-            </w:pPr>
-            <w:r>
-              <w:rPr>
-                <w:rFonts w:ascii="Calibri" w:hAnsi="Calibri" w:eastAsia="Microsoft YaHei"/>
-              </w:rPr>
-            </w:r>
-            <w:r>
-              <w:rPr>
-                <w:rFonts w:ascii="Calibri" w:hAnsi="Calibri" w:eastAsia="Microsoft YaHei"/>
-                <w:b w:val="0"/>
-                <w:color w:val="1F2933"/>
-                <w:sz w:val="18"/>
-              </w:rPr>
-              <w:t>申请数据</w:t>
-            </w:r>
-          </w:p>
-        </w:tc>
-        <w:tc>
-          <w:tcPr>
-            <w:tcW w:type="dxa" w:w="7272"/>
-            <w:tcMar>
-              <w:top w:w="60" w:type="dxa"/>
-              <w:start w:w="95" w:type="dxa"/>
-              <w:bottom w:w="60" w:type="dxa"/>
-              <w:end w:w="95" w:type="dxa"/>
-            </w:tcMar>
-            <w:vAlign w:val="center"/>
-          </w:tcPr>
-          <w:p>
-            <w:pPr>
-              <w:spacing w:before="0" w:after="0" w:line="259" w:lineRule="auto"/>
-            </w:pPr>
-            <w:r>
-              <w:rPr>
-                <w:rFonts w:ascii="Calibri" w:hAnsi="Calibri" w:eastAsia="Microsoft YaHei"/>
-              </w:rPr>
-            </w:r>
-            <w:r>
-              <w:rPr>
-                <w:rFonts w:ascii="Calibri" w:hAnsi="Calibri" w:eastAsia="Microsoft YaHei"/>
-                <w:b w:val="0"/>
-                <w:color w:val="1F2933"/>
-                <w:sz w:val="18"/>
-              </w:rPr>
-              <w:t>□ 预处理 EEG 试次数据（MATLAB .mat）  □ 数据说明文件</w:t>
-            </w:r>
-          </w:p>
-        </w:tc>
-      </w:tr>
-      <w:tr>
-        <w:trPr>
-          <w:trHeight w:val="403" w:hRule="atLeast"/>
-        </w:trPr>
-        <w:tc>
-          <w:tcPr>
-            <w:tcW w:type="dxa" w:w="2088"/>
-            <w:tcMar>
-              <w:top w:w="60" w:type="dxa"/>
-              <w:start w:w="95" w:type="dxa"/>
-              <w:bottom w:w="60" w:type="dxa"/>
-              <w:end w:w="95" w:type="dxa"/>
-            </w:tcMar>
-            <w:vAlign w:val="center"/>
-          </w:tcPr>
-          <w:p>
-            <w:pPr>
-              <w:spacing w:before="0" w:after="0" w:line="259" w:lineRule="auto"/>
-            </w:pPr>
-            <w:r>
-              <w:rPr>
-                <w:rFonts w:ascii="Calibri" w:hAnsi="Calibri" w:eastAsia="Microsoft YaHei"/>
-              </w:rPr>
-            </w:r>
-            <w:r>
-              <w:rPr>
-                <w:rFonts w:ascii="Calibri" w:hAnsi="Calibri" w:eastAsia="Microsoft YaHei"/>
-                <w:b w:val="0"/>
-                <w:color w:val="1F2933"/>
-                <w:sz w:val="18"/>
-              </w:rPr>
-              <w:t>使用期限</w:t>
-            </w:r>
-          </w:p>
-        </w:tc>
-        <w:tc>
-          <w:tcPr>
-            <w:tcW w:type="dxa" w:w="7272"/>
-            <w:tcMar>
-              <w:top w:w="60" w:type="dxa"/>
-              <w:start w:w="95" w:type="dxa"/>
-              <w:bottom w:w="60" w:type="dxa"/>
-              <w:end w:w="95" w:type="dxa"/>
-            </w:tcMar>
-            <w:vAlign w:val="center"/>
-          </w:tcPr>
-          <w:p>
-            <w:pPr>
-              <w:spacing w:before="0" w:after="0" w:line="259" w:lineRule="auto"/>
-            </w:pPr>
-            <w:r>
-              <w:rPr>
-                <w:rFonts w:ascii="Calibri" w:hAnsi="Calibri" w:eastAsia="Microsoft YaHei"/>
-              </w:rPr>
-            </w:r>
-            <w:r>
-              <w:rPr>
-                <w:rFonts w:ascii="Calibri" w:hAnsi="Calibri" w:eastAsia="Microsoft YaHei"/>
-                <w:b w:val="0"/>
-                <w:color w:val="1F2933"/>
-                <w:sz w:val="18"/>
-              </w:rPr>
-              <w:t>自        年    月    日  至        年    月    日</w:t>
-            </w:r>
-          </w:p>
-        </w:tc>
-      </w:tr>
-    </w:tbl>
-    <w:p/>
-    <w:p>
-      <w:pPr>
-        <w:pStyle w:val="Heading1"/>
-      </w:pPr>
-      <w:r>
-        <w:rPr>
-          <w:rFonts w:ascii="Calibri" w:hAnsi="Calibri" w:eastAsia="Microsoft YaHei"/>
-        </w:rPr>
-        <w:t>三、数据使用承诺</w:t>
-      </w:r>
-    </w:p>
-    <w:tbl>
-      <w:tblPr>
-        <w:tblW w:type="dxa" w:w="9360"/>
-        <w:jc w:val="left"/>
-        <w:tblLayout w:type="fixed"/>
-        <w:tblLook w:firstColumn="1" w:firstRow="1" w:lastColumn="0" w:lastRow="0" w:noHBand="0" w:noVBand="1" w:val="04A0"/>
-        <w:tblInd w:w="120" w:type="dxa"/>
-        <w:tblBorders>
-          <w:top w:val="single" w:sz="6" w:space="0" w:color="C9D0D6"/>
-          <w:left w:val="single" w:sz="6" w:space="0" w:color="C9D0D6"/>
-          <w:bottom w:val="single" w:sz="6" w:space="0" w:color="C9D0D6"/>
-          <w:right w:val="single" w:sz="6" w:space="0" w:color="C9D0D6"/>
-          <w:insideH w:val="single" w:sz="6" w:space="0" w:color="C9D0D6"/>
-          <w:insideV w:val="single" w:sz="6" w:space="0" w:color="C9D0D6"/>
-        </w:tblBorders>
-      </w:tblPr>
-      <w:tblGrid>
-        <w:gridCol w:w="936"/>
-        <w:gridCol w:w="8424"/>
-      </w:tblGrid>
-      <w:tr>
-        <w:trPr>
-          <w:trHeight w:val="403" w:hRule="atLeast"/>
-        </w:trPr>
-        <w:tc>
-          <w:tcPr>
-            <w:tcW w:type="dxa" w:w="936"/>
-            <w:shd w:fill="F5E9EA"/>
-            <w:tcMar>
-              <w:top w:w="60" w:type="dxa"/>
-              <w:start w:w="95" w:type="dxa"/>
-              <w:bottom w:w="60" w:type="dxa"/>
-              <w:end w:w="95" w:type="dxa"/>
-            </w:tcMar>
-            <w:vAlign w:val="center"/>
-          </w:tcPr>
-          <w:p>
-            <w:pPr>
-              <w:spacing w:before="0" w:after="0" w:line="259" w:lineRule="auto"/>
-            </w:pPr>
-            <w:r>
-              <w:rPr>
-                <w:rFonts w:ascii="Calibri" w:hAnsi="Calibri" w:eastAsia="Microsoft YaHei"/>
-              </w:rPr>
-            </w:r>
-            <w:r>
-              <w:rPr>
-                <w:rFonts w:ascii="Calibri" w:hAnsi="Calibri" w:eastAsia="Microsoft YaHei"/>
-                <w:b/>
-                <w:color w:val="4B1117"/>
-                <w:sz w:val="18"/>
-              </w:rPr>
-              <w:t>确认</w:t>
-            </w:r>
-          </w:p>
-        </w:tc>
-        <w:tc>
-          <w:tcPr>
-            <w:tcW w:type="dxa" w:w="8424"/>
-            <w:shd w:fill="F5E9EA"/>
-            <w:tcMar>
-              <w:top w:w="60" w:type="dxa"/>
-              <w:start w:w="95" w:type="dxa"/>
-              <w:bottom w:w="60" w:type="dxa"/>
-              <w:end w:w="95" w:type="dxa"/>
-            </w:tcMar>
-            <w:vAlign w:val="center"/>
-          </w:tcPr>
-          <w:p>
-            <w:pPr>
-              <w:spacing w:before="0" w:after="0" w:line="259" w:lineRule="auto"/>
-            </w:pPr>
-            <w:r>
-              <w:rPr>
-                <w:rFonts w:ascii="Calibri" w:hAnsi="Calibri" w:eastAsia="Microsoft YaHei"/>
-              </w:rPr>
-            </w:r>
-            <w:r>
-              <w:rPr>
-                <w:rFonts w:ascii="Calibri" w:hAnsi="Calibri" w:eastAsia="Microsoft YaHei"/>
-                <w:b/>
-                <w:color w:val="4B1117"/>
-                <w:sz w:val="18"/>
-              </w:rPr>
-              <w:t>承诺事项</w:t>
-            </w:r>
-          </w:p>
-        </w:tc>
-      </w:tr>
-      <w:tr>
-        <w:trPr>
-          <w:trHeight w:val="403" w:hRule="atLeast"/>
-        </w:trPr>
-        <w:tc>
-          <w:tcPr>
-            <w:tcW w:type="dxa" w:w="936"/>
-            <w:tcMar>
-              <w:top w:w="60" w:type="dxa"/>
-              <w:start w:w="95" w:type="dxa"/>
-              <w:bottom w:w="60" w:type="dxa"/>
-              <w:end w:w="95" w:type="dxa"/>
-            </w:tcMar>
-            <w:vAlign w:val="center"/>
-          </w:tcPr>
-          <w:p>
-            <w:pPr>
-              <w:spacing w:before="0" w:after="0" w:line="259" w:lineRule="auto"/>
-            </w:pPr>
-            <w:r>
-              <w:rPr>
-                <w:rFonts w:ascii="Calibri" w:hAnsi="Calibri" w:eastAsia="Microsoft YaHei"/>
-              </w:rPr>
-            </w:r>
-            <w:r>
-              <w:rPr>
-                <w:rFonts w:ascii="Calibri" w:hAnsi="Calibri" w:eastAsia="Microsoft YaHei"/>
-                <w:b w:val="0"/>
-                <w:color w:val="1F2933"/>
-                <w:sz w:val="18"/>
-              </w:rPr>
-              <w:t>□</w:t>
-            </w:r>
-          </w:p>
-        </w:tc>
-        <w:tc>
-          <w:tcPr>
-            <w:tcW w:type="dxa" w:w="8424"/>
-            <w:tcMar>
-              <w:top w:w="60" w:type="dxa"/>
-              <w:start w:w="95" w:type="dxa"/>
-              <w:bottom w:w="60" w:type="dxa"/>
-              <w:end w:w="95" w:type="dxa"/>
-            </w:tcMar>
-            <w:vAlign w:val="center"/>
-          </w:tcPr>
-          <w:p>
-            <w:pPr>
-              <w:spacing w:before="0" w:after="0" w:line="259" w:lineRule="auto"/>
-            </w:pPr>
-            <w:r>
-              <w:rPr>
-                <w:rFonts w:ascii="Calibri" w:hAnsi="Calibri" w:eastAsia="Microsoft YaHei"/>
-              </w:rPr>
-            </w:r>
-            <w:r>
-              <w:rPr>
-                <w:rFonts w:ascii="Calibri" w:hAnsi="Calibri" w:eastAsia="Microsoft YaHei"/>
-                <w:b w:val="0"/>
-                <w:color w:val="1F2933"/>
-                <w:sz w:val="18"/>
-              </w:rPr>
-              <w:t>数据仅用于本表所列学术或非商业研究目的。</w:t>
-            </w:r>
-          </w:p>
-        </w:tc>
-      </w:tr>
-      <w:tr>
-        <w:trPr>
-          <w:trHeight w:val="403" w:hRule="atLeast"/>
-        </w:trPr>
-        <w:tc>
-          <w:tcPr>
-            <w:tcW w:type="dxa" w:w="936"/>
-            <w:tcMar>
-              <w:top w:w="60" w:type="dxa"/>
-              <w:start w:w="95" w:type="dxa"/>
-              <w:bottom w:w="60" w:type="dxa"/>
-              <w:end w:w="95" w:type="dxa"/>
-            </w:tcMar>
-            <w:vAlign w:val="center"/>
-          </w:tcPr>
-          <w:p>
-            <w:pPr>
-              <w:spacing w:before="0" w:after="0" w:line="259" w:lineRule="auto"/>
-            </w:pPr>
-            <w:r>
-              <w:rPr>
-                <w:rFonts w:ascii="Calibri" w:hAnsi="Calibri" w:eastAsia="Microsoft YaHei"/>
-              </w:rPr>
-            </w:r>
-            <w:r>
-              <w:rPr>
-                <w:rFonts w:ascii="Calibri" w:hAnsi="Calibri" w:eastAsia="Microsoft YaHei"/>
-                <w:b w:val="0"/>
-                <w:color w:val="1F2933"/>
-                <w:sz w:val="18"/>
-              </w:rPr>
-              <w:t>□</w:t>
-            </w:r>
-          </w:p>
-        </w:tc>
-        <w:tc>
-          <w:tcPr>
-            <w:tcW w:type="dxa" w:w="8424"/>
-            <w:tcMar>
-              <w:top w:w="60" w:type="dxa"/>
-              <w:start w:w="95" w:type="dxa"/>
-              <w:bottom w:w="60" w:type="dxa"/>
-              <w:end w:w="95" w:type="dxa"/>
-            </w:tcMar>
-            <w:vAlign w:val="center"/>
-          </w:tcPr>
-          <w:p>
-            <w:pPr>
-              <w:spacing w:before="0" w:after="0" w:line="259" w:lineRule="auto"/>
-            </w:pPr>
-            <w:r>
-              <w:rPr>
-                <w:rFonts w:ascii="Calibri" w:hAnsi="Calibri" w:eastAsia="Microsoft YaHei"/>
-              </w:rPr>
-            </w:r>
-            <w:r>
-              <w:rPr>
-                <w:rFonts w:ascii="Calibri" w:hAnsi="Calibri" w:eastAsia="Microsoft YaHei"/>
-                <w:b w:val="0"/>
-                <w:color w:val="1F2933"/>
-                <w:sz w:val="18"/>
-              </w:rPr>
-              <w:t>未经许可，不转让、共享、公开发布或上传数据。</w:t>
-            </w:r>
-          </w:p>
-        </w:tc>
-      </w:tr>
-      <w:tr>
-        <w:trPr>
-          <w:trHeight w:val="403" w:hRule="atLeast"/>
-        </w:trPr>
-        <w:tc>
-          <w:tcPr>
-            <w:tcW w:type="dxa" w:w="936"/>
-            <w:tcMar>
-              <w:top w:w="60" w:type="dxa"/>
-              <w:start w:w="95" w:type="dxa"/>
-              <w:bottom w:w="60" w:type="dxa"/>
-              <w:end w:w="95" w:type="dxa"/>
-            </w:tcMar>
-            <w:vAlign w:val="center"/>
-          </w:tcPr>
-          <w:p>
-            <w:pPr>
-              <w:spacing w:before="0" w:after="0" w:line="259" w:lineRule="auto"/>
-            </w:pPr>
-            <w:r>
-              <w:rPr>
-                <w:rFonts w:ascii="Calibri" w:hAnsi="Calibri" w:eastAsia="Microsoft YaHei"/>
-              </w:rPr>
-            </w:r>
-            <w:r>
-              <w:rPr>
-                <w:rFonts w:ascii="Calibri" w:hAnsi="Calibri" w:eastAsia="Microsoft YaHei"/>
-                <w:b w:val="0"/>
-                <w:color w:val="1F2933"/>
-                <w:sz w:val="18"/>
-              </w:rPr>
-              <w:t>□</w:t>
-            </w:r>
-          </w:p>
-        </w:tc>
-        <w:tc>
-          <w:tcPr>
-            <w:tcW w:type="dxa" w:w="8424"/>
-            <w:tcMar>
-              <w:top w:w="60" w:type="dxa"/>
-              <w:start w:w="95" w:type="dxa"/>
-              <w:bottom w:w="60" w:type="dxa"/>
-              <w:end w:w="95" w:type="dxa"/>
-            </w:tcMar>
-            <w:vAlign w:val="center"/>
-          </w:tcPr>
-          <w:p>
-            <w:pPr>
-              <w:spacing w:before="0" w:after="0" w:line="259" w:lineRule="auto"/>
-            </w:pPr>
-            <w:r>
-              <w:rPr>
-                <w:rFonts w:ascii="Calibri" w:hAnsi="Calibri" w:eastAsia="Microsoft YaHei"/>
-              </w:rPr>
-            </w:r>
-            <w:r>
-              <w:rPr>
-                <w:rFonts w:ascii="Calibri" w:hAnsi="Calibri" w:eastAsia="Microsoft YaHei"/>
-                <w:b w:val="0"/>
-                <w:color w:val="1F2933"/>
-                <w:sz w:val="18"/>
-              </w:rPr>
-              <w:t>不尝试识别受试者身份，不与可识别个人信息关联。</w:t>
-            </w:r>
-          </w:p>
-        </w:tc>
-      </w:tr>
-      <w:tr>
-        <w:trPr>
-          <w:trHeight w:val="432" w:hRule="atLeast"/>
-        </w:trPr>
-        <w:tc>
-          <w:tcPr>
-            <w:tcW w:type="dxa" w:w="936"/>
-            <w:tcMar>
-              <w:top w:w="60" w:type="dxa"/>
-              <w:start w:w="95" w:type="dxa"/>
-              <w:bottom w:w="60" w:type="dxa"/>
-              <w:end w:w="95" w:type="dxa"/>
-            </w:tcMar>
-            <w:vAlign w:val="center"/>
-          </w:tcPr>
-          <w:p>
-            <w:pPr>
-              <w:spacing w:before="0" w:after="0" w:line="259" w:lineRule="auto"/>
-            </w:pPr>
-            <w:r>
-              <w:rPr>
-                <w:rFonts w:ascii="Calibri" w:hAnsi="Calibri" w:eastAsia="Microsoft YaHei"/>
-              </w:rPr>
-            </w:r>
-            <w:r>
-              <w:rPr>
-                <w:rFonts w:ascii="Calibri" w:hAnsi="Calibri" w:eastAsia="Microsoft YaHei"/>
-                <w:b w:val="0"/>
-                <w:color w:val="1F2933"/>
-                <w:sz w:val="18"/>
-              </w:rPr>
-              <w:t>□</w:t>
-            </w:r>
-          </w:p>
-        </w:tc>
-        <w:tc>
-          <w:tcPr>
-            <w:tcW w:type="dxa" w:w="8424"/>
-            <w:tcMar>
-              <w:top w:w="60" w:type="dxa"/>
-              <w:start w:w="95" w:type="dxa"/>
-              <w:bottom w:w="60" w:type="dxa"/>
-              <w:end w:w="95" w:type="dxa"/>
-            </w:tcMar>
-            <w:vAlign w:val="center"/>
-          </w:tcPr>
-          <w:p>
-            <w:pPr>
-              <w:spacing w:before="0" w:after="0" w:line="259" w:lineRule="auto"/>
-            </w:pPr>
-            <w:r>
-              <w:rPr>
-                <w:rFonts w:ascii="Calibri" w:hAnsi="Calibri" w:eastAsia="Microsoft YaHei"/>
-              </w:rPr>
-            </w:r>
-            <w:r>
-              <w:rPr>
-                <w:rFonts w:ascii="Calibri" w:hAnsi="Calibri" w:eastAsia="Microsoft YaHei"/>
-                <w:b w:val="0"/>
-                <w:color w:val="1F2933"/>
-                <w:sz w:val="18"/>
-              </w:rPr>
-              <w:t>发表论文、报告、代码或展示材料时，按要求引用 HIED。</w:t>
-            </w:r>
-          </w:p>
-        </w:tc>
-      </w:tr>
-      <w:tr>
-        <w:trPr>
-          <w:trHeight w:val="461" w:hRule="atLeast"/>
-        </w:trPr>
-        <w:tc>
-          <w:tcPr>
-            <w:tcW w:type="dxa" w:w="936"/>
-            <w:tcMar>
-              <w:top w:w="60" w:type="dxa"/>
-              <w:start w:w="95" w:type="dxa"/>
-              <w:bottom w:w="60" w:type="dxa"/>
-              <w:end w:w="95" w:type="dxa"/>
-            </w:tcMar>
-            <w:vAlign w:val="center"/>
-          </w:tcPr>
-          <w:p>
-            <w:pPr>
-              <w:spacing w:before="0" w:after="0" w:line="259" w:lineRule="auto"/>
-            </w:pPr>
-            <w:r>
-              <w:rPr>
-                <w:rFonts w:ascii="Calibri" w:hAnsi="Calibri" w:eastAsia="Microsoft YaHei"/>
-              </w:rPr>
-            </w:r>
-            <w:r>
-              <w:rPr>
-                <w:rFonts w:ascii="Calibri" w:hAnsi="Calibri" w:eastAsia="Microsoft YaHei"/>
-                <w:b w:val="0"/>
-                <w:color w:val="1F2933"/>
-                <w:sz w:val="18"/>
-              </w:rPr>
-              <w:t>□</w:t>
-            </w:r>
-          </w:p>
-        </w:tc>
-        <w:tc>
-          <w:tcPr>
-            <w:tcW w:type="dxa" w:w="8424"/>
-            <w:tcMar>
-              <w:top w:w="60" w:type="dxa"/>
-              <w:start w:w="95" w:type="dxa"/>
-              <w:bottom w:w="60" w:type="dxa"/>
-              <w:end w:w="95" w:type="dxa"/>
-            </w:tcMar>
-            <w:vAlign w:val="center"/>
-          </w:tcPr>
-          <w:p>
-            <w:pPr>
-              <w:spacing w:before="0" w:after="0" w:line="259" w:lineRule="auto"/>
-            </w:pPr>
-            <w:r>
-              <w:rPr>
-                <w:rFonts w:ascii="Calibri" w:hAnsi="Calibri" w:eastAsia="Microsoft YaHei"/>
-              </w:rPr>
-            </w:r>
-            <w:r>
-              <w:rPr>
-                <w:rFonts w:ascii="Calibri" w:hAnsi="Calibri" w:eastAsia="Microsoft YaHei"/>
-                <w:b w:val="0"/>
-                <w:color w:val="1F2933"/>
-                <w:sz w:val="18"/>
-              </w:rPr>
-              <w:t>研究结束或收到管理方要求后，停止使用或删除数据副本。</w:t>
-            </w:r>
-          </w:p>
-        </w:tc>
-      </w:tr>
-    </w:tbl>
-    <w:p/>
-    <w:p>
-      <w:pPr>
-        <w:pStyle w:val="Heading1"/>
-      </w:pPr>
-      <w:r>
-        <w:rPr>
-          <w:rFonts w:ascii="Calibri" w:hAnsi="Calibri" w:eastAsia="Microsoft YaHei"/>
-        </w:rPr>
-        <w:t>四、签字确认</w:t>
+        <w:t>HIED 数据仅可用于学术研究或其他非商业研究活动，不得用于商业产品、收费服务、商业模型训练或验证、数据转售、军事应用或其他商业目的。</w:t>
       </w:r>
     </w:p>
     <w:p>
       <w:pPr>
-        <w:spacing w:before="0" w:after="40" w:line="240" w:lineRule="auto"/>
+        <w:spacing w:before="60" w:after="40" w:line="240" w:lineRule="auto"/>
       </w:pPr>
       <w:r>
         <w:rPr>
-          <w:rFonts w:ascii="Calibri" w:hAnsi="Calibri" w:eastAsia="Microsoft YaHei"/>
+          <w:rFonts w:ascii="Times New Roman" w:hAnsi="Times New Roman" w:eastAsia="Microsoft YaHei"/>
           <w:b/>
-          <w:color w:val="1F2933"/>
-          <w:sz w:val="18"/>
+          <w:color w:val="000000"/>
+          <w:sz w:val="20"/>
         </w:rPr>
-        <w:t>申请人签名：</w:t>
-      </w:r>
-      <w:r>
-        <w:rPr>
-          <w:rFonts w:ascii="Calibri" w:hAnsi="Calibri" w:eastAsia="Microsoft YaHei"/>
-          <w:b w:val="0"/>
-          <w:color w:val="1F2933"/>
-          <w:sz w:val="18"/>
-        </w:rPr>
-        <w:t>____________________________</w:t>
-      </w:r>
-      <w:r>
-        <w:rPr>
-          <w:rFonts w:ascii="Calibri" w:hAnsi="Calibri" w:eastAsia="Microsoft YaHei"/>
-          <w:b/>
-          <w:color w:val="1F2933"/>
-          <w:sz w:val="18"/>
-        </w:rPr>
-        <w:t xml:space="preserve">    日期：</w:t>
-      </w:r>
-      <w:r>
-        <w:rPr>
-          <w:rFonts w:ascii="Calibri" w:hAnsi="Calibri" w:eastAsia="Microsoft YaHei"/>
-          <w:b w:val="0"/>
-          <w:color w:val="1F2933"/>
-          <w:sz w:val="18"/>
-        </w:rPr>
-        <w:t>________________</w:t>
+        <w:t>2.    数据分发</w:t>
       </w:r>
     </w:p>
     <w:p>
       <w:pPr>
-        <w:spacing w:before="0" w:after="40" w:line="240" w:lineRule="auto"/>
+        <w:spacing w:before="0" w:after="60" w:line="245" w:lineRule="auto"/>
+        <w:jc w:val="both"/>
       </w:pPr>
       <w:r>
         <w:rPr>
-          <w:rFonts w:ascii="Calibri" w:hAnsi="Calibri" w:eastAsia="Microsoft YaHei"/>
-          <w:b/>
-          <w:color w:val="1F2933"/>
+          <w:rFonts w:ascii="Times New Roman" w:hAnsi="Times New Roman" w:eastAsia="Microsoft YaHei"/>
+          <w:b w:val="0"/>
+          <w:color w:val="000000"/>
           <w:sz w:val="18"/>
         </w:rPr>
-        <w:t>负责人/导师签名（如适用）：</w:t>
+        <w:t>使用者不得以任何形式转让、共享、公开发布、上传或再分发 HIED 数据或其中任何部分；仅可在学术论文、报告或展示中使用少量必要结果用于说明研究方法与结论。</w:t>
+      </w:r>
+    </w:p>
+    <w:p>
+      <w:pPr>
+        <w:spacing w:before="60" w:after="40" w:line="240" w:lineRule="auto"/>
+      </w:pPr>
+      <w:r>
+        <w:rPr>
+          <w:rFonts w:ascii="Times New Roman" w:hAnsi="Times New Roman" w:eastAsia="Microsoft YaHei"/>
+          <w:b/>
+          <w:color w:val="000000"/>
+          <w:sz w:val="20"/>
+        </w:rPr>
+        <w:t>3.    数据访问</w:t>
+      </w:r>
+    </w:p>
+    <w:p>
+      <w:pPr>
+        <w:spacing w:before="0" w:after="60" w:line="245" w:lineRule="auto"/>
+        <w:jc w:val="both"/>
+      </w:pPr>
+      <w:r>
+        <w:rPr>
+          <w:rFonts w:ascii="Times New Roman" w:hAnsi="Times New Roman" w:eastAsia="Microsoft YaHei"/>
+          <w:b w:val="0"/>
+          <w:color w:val="000000"/>
+          <w:sz w:val="18"/>
+        </w:rPr>
+        <w:t>使用者须在本协议填写、签署并通过审核后方可使用 HIED 数据。数据管理方提供的访问链接或传输方式仅限获批使用者本人或获批团队使用，不得转交他人。</w:t>
+      </w:r>
+    </w:p>
+    <w:p>
+      <w:pPr>
+        <w:spacing w:before="60" w:after="40" w:line="240" w:lineRule="auto"/>
+      </w:pPr>
+      <w:r>
+        <w:rPr>
+          <w:rFonts w:ascii="Times New Roman" w:hAnsi="Times New Roman" w:eastAsia="Microsoft YaHei"/>
+          <w:b/>
+          <w:color w:val="000000"/>
+          <w:sz w:val="20"/>
+        </w:rPr>
+        <w:t>4.    数据保护</w:t>
+      </w:r>
+    </w:p>
+    <w:p>
+      <w:pPr>
+        <w:spacing w:before="0" w:after="60" w:line="245" w:lineRule="auto"/>
+        <w:jc w:val="both"/>
+      </w:pPr>
+      <w:r>
+        <w:rPr>
+          <w:rFonts w:ascii="Times New Roman" w:hAnsi="Times New Roman" w:eastAsia="Microsoft YaHei"/>
+          <w:b w:val="0"/>
+          <w:color w:val="000000"/>
+          <w:sz w:val="18"/>
+        </w:rPr>
+        <w:t>使用者不得尝试识别受试者身份，不得将 HIED 数据与可识别个人信息关联，并应采取合理措施保存数据，防止未经授权的访问、复制或传播。</w:t>
+      </w:r>
+    </w:p>
+    <w:p>
+      <w:pPr>
+        <w:spacing w:before="60" w:after="40" w:line="240" w:lineRule="auto"/>
+      </w:pPr>
+      <w:r>
+        <w:rPr>
+          <w:rFonts w:ascii="Times New Roman" w:hAnsi="Times New Roman" w:eastAsia="Microsoft YaHei"/>
+          <w:b/>
+          <w:color w:val="000000"/>
+          <w:sz w:val="20"/>
+        </w:rPr>
+        <w:t>5.    协议变更</w:t>
+      </w:r>
+    </w:p>
+    <w:p>
+      <w:pPr>
+        <w:spacing w:before="0" w:after="60" w:line="245" w:lineRule="auto"/>
+        <w:jc w:val="both"/>
+      </w:pPr>
+      <w:r>
+        <w:rPr>
+          <w:rFonts w:ascii="Times New Roman" w:hAnsi="Times New Roman" w:eastAsia="Microsoft YaHei"/>
+          <w:b w:val="0"/>
+          <w:color w:val="000000"/>
+          <w:sz w:val="18"/>
+        </w:rPr>
+        <w:t>HIED 数据管理方保留根据数据管理需要更新本协议的权利。已获批使用者如继续使用数据，应遵守更新后的数据使用要求。</w:t>
+      </w:r>
+    </w:p>
+    <w:p>
+      <w:pPr>
+        <w:spacing w:before="60" w:after="40" w:line="240" w:lineRule="auto"/>
+      </w:pPr>
+      <w:r>
+        <w:rPr>
+          <w:rFonts w:ascii="Times New Roman" w:hAnsi="Times New Roman" w:eastAsia="Microsoft YaHei"/>
+          <w:b/>
+          <w:color w:val="000000"/>
+          <w:sz w:val="20"/>
+        </w:rPr>
+        <w:t>6.    免责声明</w:t>
+      </w:r>
+    </w:p>
+    <w:p>
+      <w:pPr>
+        <w:spacing w:before="0" w:after="60" w:line="245" w:lineRule="auto"/>
+        <w:jc w:val="both"/>
+      </w:pPr>
+      <w:r>
+        <w:rPr>
+          <w:rFonts w:ascii="Times New Roman" w:hAnsi="Times New Roman" w:eastAsia="Microsoft YaHei"/>
+          <w:b w:val="0"/>
+          <w:color w:val="000000"/>
+          <w:sz w:val="18"/>
+        </w:rPr>
+        <w:t>HIED 数据按现状提供，不附带任何明示或默示保证。因数据使用、分析结果或相关研究活动产生的风险和责任由使用者自行承担。</w:t>
+      </w:r>
+    </w:p>
+    <w:p>
+      <w:pPr>
+        <w:spacing w:before="60" w:after="40" w:line="240" w:lineRule="auto"/>
+      </w:pPr>
+      <w:r>
+        <w:rPr>
+          <w:rFonts w:ascii="Times New Roman" w:hAnsi="Times New Roman" w:eastAsia="Microsoft YaHei"/>
+          <w:b/>
+          <w:color w:val="000000"/>
+          <w:sz w:val="20"/>
+        </w:rPr>
+        <w:t>7.    引用</w:t>
+      </w:r>
+    </w:p>
+    <w:p>
+      <w:pPr>
+        <w:spacing w:before="0" w:after="60" w:line="245" w:lineRule="auto"/>
+        <w:jc w:val="both"/>
+      </w:pPr>
+      <w:r>
+        <w:rPr>
+          <w:rFonts w:ascii="Times New Roman" w:hAnsi="Times New Roman" w:eastAsia="Microsoft YaHei"/>
+          <w:b w:val="0"/>
+          <w:color w:val="000000"/>
+          <w:sz w:val="18"/>
+        </w:rPr>
+        <w:t>如在论文、报告、代码或展示材料中使用 HIED，请引用：Zhongli Bai 等，SECT: A Method of Shifted EEG Channel Transformer for Emotion Recognition, IEEE Journal of Biomedical and Health Informatics, 27(10):4758-4767, 2023, DOI: 10.1109/JBHI.2023.3301993。</w:t>
+      </w:r>
+    </w:p>
+    <w:p>
+      <w:pPr>
+        <w:spacing w:before="80" w:after="40" w:line="240" w:lineRule="auto"/>
+      </w:pPr>
+      <w:r>
+        <w:rPr>
+          <w:rFonts w:ascii="Times New Roman" w:hAnsi="Times New Roman" w:eastAsia="Microsoft YaHei"/>
+          <w:b/>
+          <w:color w:val="000000"/>
+          <w:sz w:val="20"/>
+        </w:rPr>
+        <w:t>8.    使用者信息</w:t>
+      </w:r>
+    </w:p>
+    <w:p>
+      <w:pPr>
+        <w:spacing w:before="0" w:after="80" w:line="245" w:lineRule="auto"/>
+        <w:jc w:val="both"/>
+      </w:pPr>
+      <w:r>
+        <w:rPr>
+          <w:rFonts w:ascii="Times New Roman" w:hAnsi="Times New Roman" w:eastAsia="Microsoft YaHei"/>
+          <w:b w:val="0"/>
+          <w:color w:val="000000"/>
+          <w:sz w:val="18"/>
+        </w:rPr>
+        <w:t>请填写实际使用者信息；如申请人为学生，可填写负责人、导师或课题负责人的信息并由其确认。</w:t>
+      </w:r>
+    </w:p>
+    <w:p>
+      <w:pPr>
+        <w:spacing w:before="0" w:after="30" w:line="240" w:lineRule="auto"/>
+      </w:pPr>
+      <w:r>
+        <w:rPr>
+          <w:rFonts w:ascii="Times New Roman" w:hAnsi="Times New Roman" w:eastAsia="Microsoft YaHei"/>
+          <w:b w:val="0"/>
+          <w:color w:val="000000"/>
+          <w:sz w:val="19"/>
+        </w:rPr>
+        <w:t xml:space="preserve">姓名: </w:t>
       </w:r>
       <w:r>
         <w:rPr>
-          <w:rFonts w:ascii="Calibri" w:hAnsi="Calibri" w:eastAsia="Microsoft YaHei"/>
+          <w:rFonts w:ascii="Times New Roman" w:hAnsi="Times New Roman" w:eastAsia="Microsoft YaHei"/>
           <w:b w:val="0"/>
-          <w:color w:val="1F2933"/>
-          <w:sz w:val="18"/>
+          <w:color w:val="000000"/>
+          <w:sz w:val="19"/>
         </w:rPr>
-        <w:t>____________________________</w:t>
+        <w:t>______________________________________________</w:t>
+      </w:r>
+    </w:p>
+    <w:p>
+      <w:pPr>
+        <w:spacing w:before="0" w:after="30" w:line="240" w:lineRule="auto"/>
+      </w:pPr>
+      <w:r>
+        <w:rPr>
+          <w:rFonts w:ascii="Times New Roman" w:hAnsi="Times New Roman" w:eastAsia="Microsoft YaHei"/>
+          <w:b w:val="0"/>
+          <w:color w:val="000000"/>
+          <w:sz w:val="19"/>
+        </w:rPr>
+        <w:t xml:space="preserve">身份/职称: </w:t>
       </w:r>
       <w:r>
         <w:rPr>
-          <w:rFonts w:ascii="Calibri" w:hAnsi="Calibri" w:eastAsia="Microsoft YaHei"/>
-          <w:b/>
-          <w:color w:val="1F2933"/>
-          <w:sz w:val="18"/>
+          <w:rFonts w:ascii="Times New Roman" w:hAnsi="Times New Roman" w:eastAsia="Microsoft YaHei"/>
+          <w:b w:val="0"/>
+          <w:color w:val="000000"/>
+          <w:sz w:val="19"/>
         </w:rPr>
-        <w:t xml:space="preserve">    日期：</w:t>
+        <w:t>______________________________________________</w:t>
+      </w:r>
+    </w:p>
+    <w:p>
+      <w:pPr>
+        <w:spacing w:before="0" w:after="30" w:line="240" w:lineRule="auto"/>
+      </w:pPr>
+      <w:r>
+        <w:rPr>
+          <w:rFonts w:ascii="Times New Roman" w:hAnsi="Times New Roman" w:eastAsia="Microsoft YaHei"/>
+          <w:b w:val="0"/>
+          <w:color w:val="000000"/>
+          <w:sz w:val="19"/>
+        </w:rPr>
+        <w:t xml:space="preserve">专业/研究方向: </w:t>
       </w:r>
       <w:r>
         <w:rPr>
-          <w:rFonts w:ascii="Calibri" w:hAnsi="Calibri" w:eastAsia="Microsoft YaHei"/>
+          <w:rFonts w:ascii="Times New Roman" w:hAnsi="Times New Roman" w:eastAsia="Microsoft YaHei"/>
           <w:b w:val="0"/>
-          <w:color w:val="1F2933"/>
-          <w:sz w:val="18"/>
+          <w:color w:val="000000"/>
+          <w:sz w:val="19"/>
+        </w:rPr>
+        <w:t>______________________________________________</w:t>
+      </w:r>
+    </w:p>
+    <w:p>
+      <w:pPr>
+        <w:spacing w:before="0" w:after="30" w:line="240" w:lineRule="auto"/>
+      </w:pPr>
+      <w:r>
+        <w:rPr>
+          <w:rFonts w:ascii="Times New Roman" w:hAnsi="Times New Roman" w:eastAsia="Microsoft YaHei"/>
+          <w:b w:val="0"/>
+          <w:color w:val="000000"/>
+          <w:sz w:val="19"/>
+        </w:rPr>
+        <w:t xml:space="preserve">单位: </w:t>
+      </w:r>
+      <w:r>
+        <w:rPr>
+          <w:rFonts w:ascii="Times New Roman" w:hAnsi="Times New Roman" w:eastAsia="Microsoft YaHei"/>
+          <w:b w:val="0"/>
+          <w:color w:val="000000"/>
+          <w:sz w:val="19"/>
+        </w:rPr>
+        <w:t>______________________________________________</w:t>
+      </w:r>
+    </w:p>
+    <w:p>
+      <w:pPr>
+        <w:spacing w:before="0" w:after="30" w:line="240" w:lineRule="auto"/>
+      </w:pPr>
+      <w:r>
+        <w:rPr>
+          <w:rFonts w:ascii="Times New Roman" w:hAnsi="Times New Roman" w:eastAsia="Microsoft YaHei"/>
+          <w:b w:val="0"/>
+          <w:color w:val="000000"/>
+          <w:sz w:val="19"/>
+        </w:rPr>
+        <w:t xml:space="preserve">国籍/地区: </w:t>
+      </w:r>
+      <w:r>
+        <w:rPr>
+          <w:rFonts w:ascii="Times New Roman" w:hAnsi="Times New Roman" w:eastAsia="Microsoft YaHei"/>
+          <w:b w:val="0"/>
+          <w:color w:val="000000"/>
+          <w:sz w:val="19"/>
+        </w:rPr>
+        <w:t>______________________________________________</w:t>
+      </w:r>
+    </w:p>
+    <w:p>
+      <w:pPr>
+        <w:spacing w:before="0" w:after="30" w:line="240" w:lineRule="auto"/>
+      </w:pPr>
+      <w:r>
+        <w:rPr>
+          <w:rFonts w:ascii="Times New Roman" w:hAnsi="Times New Roman" w:eastAsia="Microsoft YaHei"/>
+          <w:b w:val="0"/>
+          <w:color w:val="000000"/>
+          <w:sz w:val="19"/>
+        </w:rPr>
+        <w:t xml:space="preserve">联系方式: </w:t>
+      </w:r>
+      <w:r>
+        <w:rPr>
+          <w:rFonts w:ascii="Times New Roman" w:hAnsi="Times New Roman" w:eastAsia="Microsoft YaHei"/>
+          <w:b w:val="0"/>
+          <w:color w:val="000000"/>
+          <w:sz w:val="19"/>
+        </w:rPr>
+        <w:t>______________________________________________</w:t>
+      </w:r>
+    </w:p>
+    <w:p>
+      <w:pPr>
+        <w:spacing w:before="0" w:after="30" w:line="240" w:lineRule="auto"/>
+      </w:pPr>
+      <w:r>
+        <w:rPr>
+          <w:rFonts w:ascii="Times New Roman" w:hAnsi="Times New Roman" w:eastAsia="Microsoft YaHei"/>
+          <w:b w:val="0"/>
+          <w:color w:val="000000"/>
+          <w:sz w:val="19"/>
+        </w:rPr>
+        <w:t xml:space="preserve">数据集: </w:t>
+      </w:r>
+      <w:r>
+        <w:rPr>
+          <w:rFonts w:ascii="Times New Roman" w:hAnsi="Times New Roman" w:eastAsia="Microsoft YaHei"/>
+          <w:b w:val="0"/>
+          <w:color w:val="000000"/>
+          <w:sz w:val="19"/>
+        </w:rPr>
+        <w:t>HIED</w:t>
+      </w:r>
+    </w:p>
+    <w:p>
+      <w:pPr>
+        <w:spacing w:before="140" w:after="0" w:line="240" w:lineRule="auto"/>
+      </w:pPr>
+      <w:r>
+        <w:rPr>
+          <w:rFonts w:ascii="Times New Roman" w:hAnsi="Times New Roman" w:eastAsia="Microsoft YaHei"/>
+          <w:b w:val="0"/>
+          <w:color w:val="000000"/>
+          <w:sz w:val="19"/>
+        </w:rPr>
+        <w:t xml:space="preserve">姓名: </w:t>
+      </w:r>
+      <w:r>
+        <w:rPr>
+          <w:rFonts w:ascii="Times New Roman" w:hAnsi="Times New Roman" w:eastAsia="Microsoft YaHei"/>
+          <w:b w:val="0"/>
+          <w:color w:val="000000"/>
+          <w:sz w:val="19"/>
+        </w:rPr>
+        <w:t>________________</w:t>
+      </w:r>
+      <w:r>
+        <w:rPr>
+          <w:rFonts w:ascii="Times New Roman" w:hAnsi="Times New Roman" w:eastAsia="Microsoft YaHei"/>
+          <w:b w:val="0"/>
+          <w:color w:val="000000"/>
+          <w:sz w:val="19"/>
+        </w:rPr>
+        <w:t xml:space="preserve">        </w:t>
+      </w:r>
+      <w:r>
+        <w:rPr>
+          <w:rFonts w:ascii="Times New Roman" w:hAnsi="Times New Roman" w:eastAsia="Microsoft YaHei"/>
+          <w:b w:val="0"/>
+          <w:color w:val="000000"/>
+          <w:sz w:val="19"/>
+        </w:rPr>
+        <w:t xml:space="preserve">日期: </w:t>
+      </w:r>
+      <w:r>
+        <w:rPr>
+          <w:rFonts w:ascii="Times New Roman" w:hAnsi="Times New Roman" w:eastAsia="Microsoft YaHei"/>
+          <w:b w:val="0"/>
+          <w:color w:val="000000"/>
+          <w:sz w:val="19"/>
+        </w:rPr>
+        <w:t>________________</w:t>
+      </w:r>
+      <w:r>
+        <w:rPr>
+          <w:rFonts w:ascii="Times New Roman" w:hAnsi="Times New Roman" w:eastAsia="Microsoft YaHei"/>
+          <w:b w:val="0"/>
+          <w:color w:val="000000"/>
+          <w:sz w:val="19"/>
+        </w:rPr>
+        <w:t xml:space="preserve">        </w:t>
+      </w:r>
+      <w:r>
+        <w:rPr>
+          <w:rFonts w:ascii="Times New Roman" w:hAnsi="Times New Roman" w:eastAsia="Microsoft YaHei"/>
+          <w:b w:val="0"/>
+          <w:color w:val="000000"/>
+          <w:sz w:val="19"/>
+        </w:rPr>
+        <w:t xml:space="preserve">签名: </w:t>
+      </w:r>
+      <w:r>
+        <w:rPr>
+          <w:rFonts w:ascii="Times New Roman" w:hAnsi="Times New Roman" w:eastAsia="Microsoft YaHei"/>
+          <w:b w:val="0"/>
+          <w:color w:val="000000"/>
+          <w:sz w:val="19"/>
         </w:rPr>
         <w:t>________________</w:t>
       </w:r>
     </w:p>
     <w:sectPr>
       <w:footerReference w:type="default" r:id="rId9"/>
-      <w:pgSz w:w="12240" w:h="15840"/>
-      <w:pgMar w:top="835" w:right="1080" w:bottom="835" w:left="1080" w:header="432" w:footer="432" w:gutter="0"/>
+      <w:pgSz w:w="11909" w:h="16834"/>
+      <w:pgMar w:top="893" w:right="1123" w:bottom="806" w:left="1123" w:header="360" w:footer="360" w:gutter="0"/>
       <w:cols w:space="720"/>
       <w:docGrid w:linePitch="360"/>
     </w:sectPr>
@@ -1587,11 +521,11 @@
     </w:pPr>
     <w:r>
       <w:rPr>
-        <w:rFonts w:ascii="Calibri" w:hAnsi="Calibri" w:eastAsia="Microsoft YaHei"/>
-        <w:color w:val="5D6970"/>
+        <w:rFonts w:ascii="Times New Roman" w:hAnsi="Times New Roman" w:eastAsia="Microsoft YaHei"/>
+        <w:color w:val="555555"/>
         <w:sz w:val="15"/>
       </w:rPr>
-      <w:t>HIED 数据使用申请表 | jasonsongrain@hotmail.com</w:t>
+      <w:t>HIED 数据集使用许可协议 | jasonsongrain@hotmail.com</w:t>
     </w:r>
   </w:p>
 </w:ftr>
@@ -1961,11 +895,11 @@
     <w:qFormat/>
     <w:rsid w:val="00FC693F"/>
     <w:pPr>
-      <w:spacing w:after="60" w:line="240" w:lineRule="auto"/>
+      <w:spacing w:after="80" w:line="240" w:lineRule="auto"/>
     </w:pPr>
     <w:rPr>
-      <w:rFonts w:ascii="Calibri" w:hAnsi="Calibri" w:eastAsia="Microsoft YaHei"/>
-      <w:color w:val="1F2933"/>
+      <w:rFonts w:ascii="Times New Roman" w:hAnsi="Times New Roman" w:eastAsia="Microsoft YaHei"/>
+      <w:color w:val="000000"/>
       <w:sz w:val="19"/>
     </w:rPr>
   </w:style>
@@ -2024,15 +958,15 @@
     <w:pPr>
       <w:keepNext/>
       <w:keepLines/>
-      <w:spacing w:before="140" w:after="60"/>
+      <w:spacing w:before="480" w:after="0"/>
       <w:outlineLvl w:val="0"/>
     </w:pPr>
     <w:rPr>
-      <w:rFonts w:asciiTheme="majorHAnsi" w:eastAsiaTheme="majorEastAsia" w:hAnsiTheme="majorHAnsi" w:cstheme="majorBidi" w:ascii="Calibri" w:hAnsi="Calibri" w:eastAsia="Microsoft YaHei"/>
+      <w:rFonts w:asciiTheme="majorHAnsi" w:eastAsiaTheme="majorEastAsia" w:hAnsiTheme="majorHAnsi" w:cstheme="majorBidi"/>
       <w:b/>
       <w:bCs/>
-      <w:color w:val="4B1117"/>
-      <w:sz w:val="25"/>
+      <w:color w:val="365F91" w:themeColor="accent1" w:themeShade="BF"/>
+      <w:sz w:val="28"/>
       <w:szCs w:val="28"/>
     </w:rPr>
   </w:style>
@@ -2048,15 +982,15 @@
     <w:pPr>
       <w:keepNext/>
       <w:keepLines/>
-      <w:spacing w:before="120" w:after="60"/>
+      <w:spacing w:before="200" w:after="0"/>
       <w:outlineLvl w:val="1"/>
     </w:pPr>
     <w:rPr>
-      <w:rFonts w:asciiTheme="majorHAnsi" w:eastAsiaTheme="majorEastAsia" w:hAnsiTheme="majorHAnsi" w:cstheme="majorBidi" w:ascii="Calibri" w:hAnsi="Calibri" w:eastAsia="Microsoft YaHei"/>
+      <w:rFonts w:asciiTheme="majorHAnsi" w:eastAsiaTheme="majorEastAsia" w:hAnsiTheme="majorHAnsi" w:cstheme="majorBidi"/>
       <w:b/>
       <w:bCs/>
-      <w:color w:val="7D111A"/>
-      <w:sz w:val="23"/>
+      <w:color w:val="4F81BD" w:themeColor="accent1"/>
+      <w:sz w:val="26"/>
       <w:szCs w:val="26"/>
     </w:rPr>
   </w:style>
@@ -2072,15 +1006,14 @@
     <w:pPr>
       <w:keepNext/>
       <w:keepLines/>
-      <w:spacing w:before="100" w:after="40"/>
+      <w:spacing w:before="200" w:after="0"/>
       <w:outlineLvl w:val="2"/>
     </w:pPr>
     <w:rPr>
-      <w:rFonts w:asciiTheme="majorHAnsi" w:eastAsiaTheme="majorEastAsia" w:hAnsiTheme="majorHAnsi" w:cstheme="majorBidi" w:ascii="Calibri" w:hAnsi="Calibri" w:eastAsia="Microsoft YaHei"/>
+      <w:rFonts w:asciiTheme="majorHAnsi" w:eastAsiaTheme="majorEastAsia" w:hAnsiTheme="majorHAnsi" w:cstheme="majorBidi"/>
       <w:b/>
       <w:bCs/>
-      <w:color w:val="7D111A"/>
-      <w:sz w:val="21"/>
+      <w:color w:val="4F81BD" w:themeColor="accent1"/>
     </w:rPr>
   </w:style>
   <w:style w:type="paragraph" w:styleId="Heading4">
@@ -2314,16 +1247,16 @@
       <w:pBdr>
         <w:bottom w:val="single" w:sz="8" w:space="4" w:color="4F81BD" w:themeColor="accent1"/>
       </w:pBdr>
-      <w:spacing w:after="0" w:line="240" w:lineRule="auto"/>
+      <w:spacing w:after="200" w:line="240" w:lineRule="auto"/>
       <w:contextualSpacing/>
     </w:pPr>
     <w:rPr>
-      <w:rFonts w:asciiTheme="majorHAnsi" w:eastAsiaTheme="majorEastAsia" w:hAnsiTheme="majorHAnsi" w:cstheme="majorBidi" w:ascii="Calibri" w:hAnsi="Calibri" w:eastAsia="Microsoft YaHei"/>
+      <w:rFonts w:asciiTheme="majorHAnsi" w:eastAsiaTheme="majorEastAsia" w:hAnsiTheme="majorHAnsi" w:cstheme="majorBidi" w:ascii="Times New Roman" w:hAnsi="Times New Roman" w:eastAsia="Microsoft YaHei"/>
       <w:b/>
-      <w:color w:val="4B1117"/>
+      <w:color w:val="000000"/>
       <w:spacing w:val="5"/>
       <w:kern w:val="28"/>
-      <w:sz w:val="36"/>
+      <w:sz w:val="31"/>
       <w:szCs w:val="52"/>
     </w:rPr>
   </w:style>
@@ -2354,15 +1287,14 @@
       <w:numPr>
         <w:ilvl w:val="1"/>
       </w:numPr>
-      <w:spacing w:after="100"/>
     </w:pPr>
     <w:rPr>
-      <w:rFonts w:asciiTheme="majorHAnsi" w:eastAsiaTheme="majorEastAsia" w:hAnsiTheme="majorHAnsi" w:cstheme="majorBidi" w:ascii="Calibri" w:hAnsi="Calibri" w:eastAsia="Microsoft YaHei"/>
+      <w:rFonts w:asciiTheme="majorHAnsi" w:eastAsiaTheme="majorEastAsia" w:hAnsiTheme="majorHAnsi" w:cstheme="majorBidi"/>
       <w:i/>
       <w:iCs/>
-      <w:color w:val="5D6970"/>
+      <w:color w:val="4F81BD" w:themeColor="accent1"/>
       <w:spacing w:val="15"/>
-      <w:sz w:val="19"/>
+      <w:sz w:val="24"/>
       <w:szCs w:val="24"/>
     </w:rPr>
   </w:style>

</xml_diff>